<commit_message>
Map design summary marriage and asset fields into generator output
</commit_message>
<xml_diff>
--- a/tools/aubreylaw-docgeneration/templates/design-summary-detailed.docx
+++ b/tools/aubreylaw-docgeneration/templates/design-summary-detailed.docx
@@ -1,6 +1,6 @@
 
 <file path=word/document.xml><?xml version="1.0" encoding="utf-8"?>
-<w:document xmlns:wpc="http://schemas.microsoft.com/office/word/2010/wordprocessingCanvas" xmlns:cx="http://schemas.microsoft.com/office/drawing/2014/chartex" xmlns:cx1="http://schemas.microsoft.com/office/drawing/2015/9/8/chartex" xmlns:cx2="http://schemas.microsoft.com/office/drawing/2015/10/21/chartex" xmlns:cx3="http://schemas.microsoft.com/office/drawing/2016/5/9/chartex" xmlns:cx4="http://schemas.microsoft.com/office/drawing/2016/5/10/chartex" xmlns:cx5="http://schemas.microsoft.com/office/drawing/2016/5/11/chartex" xmlns:cx6="http://schemas.microsoft.com/office/drawing/2016/5/12/chartex" xmlns:cx7="http://schemas.microsoft.com/office/drawing/2016/5/13/chartex" xmlns:cx8="http://schemas.microsoft.com/office/drawing/2016/5/14/chartex" xmlns:mc="http://schemas.openxmlformats.org/markup-compatibility/2006" xmlns:aink="http://schemas.microsoft.com/office/drawing/2016/ink" xmlns:am3d="http://schemas.microsoft.com/office/drawing/2017/model3d" xmlns:o="urn:schemas-microsoft-com:office:office" xmlns:oel="http://schemas.microsoft.com/office/2019/extlst" xmlns:r="http://schemas.openxmlformats.org/officeDocument/2006/relationships" xmlns:m="http://schemas.openxmlformats.org/officeDocument/2006/math" xmlns:v="urn:schemas-microsoft-com:vml" xmlns:wp14="http://schemas.microsoft.com/office/word/2010/wordprocessingDrawing" xmlns:wp="http://schemas.openxmlformats.org/drawingml/2006/wordprocessingDrawing" xmlns:w10="urn:schemas-microsoft-com:office:word" xmlns:w="http://schemas.openxmlformats.org/wordprocessingml/2006/main" xmlns:w14="http://schemas.microsoft.com/office/word/2010/wordml" xmlns:w15="http://schemas.microsoft.com/office/word/2012/wordml" xmlns:w16cex="http://schemas.microsoft.com/office/word/2018/wordml/cex" xmlns:w16cid="http://schemas.microsoft.com/office/word/2016/wordml/cid" xmlns:w16="http://schemas.microsoft.com/office/word/2018/wordml" xmlns:w16du="http://schemas.microsoft.com/office/word/2023/wordml/word16du" xmlns:w16sdtdh="http://schemas.microsoft.com/office/word/2020/wordml/sdtdatahash" xmlns:w16sdtfl="http://schemas.microsoft.com/office/word/2024/wordml/sdtformatlock" xmlns:w16se="http://schemas.microsoft.com/office/word/2015/wordml/symex" xmlns:wpg="http://schemas.microsoft.com/office/word/2010/wordprocessingGroup" xmlns:wpi="http://schemas.microsoft.com/office/word/2010/wordprocessingInk" xmlns:wne="http://schemas.microsoft.com/office/word/2006/wordml" xmlns:wps="http://schemas.microsoft.com/office/word/2010/wordprocessingShape" mc:Ignorable="w14 w15 w16se w16cid w16 w16cex w16sdtdh w16sdtfl w16du wp14">
+<w:document xmlns:wpc="http://schemas.microsoft.com/office/word/2010/wordprocessingCanvas" xmlns:cx="http://schemas.microsoft.com/office/drawing/2014/chartex" xmlns:cx1="http://schemas.microsoft.com/office/drawing/2015/9/8/chartex" xmlns:cx2="http://schemas.microsoft.com/office/drawing/2015/10/21/chartex" xmlns:cx3="http://schemas.microsoft.com/office/drawing/2016/5/9/chartex" xmlns:cx4="http://schemas.microsoft.com/office/drawing/2016/5/10/chartex" xmlns:cx5="http://schemas.microsoft.com/office/drawing/2016/5/11/chartex" xmlns:cx6="http://schemas.microsoft.com/office/drawing/2016/5/12/chartex" xmlns:cx7="http://schemas.microsoft.com/office/drawing/2016/5/13/chartex" xmlns:cx8="http://schemas.microsoft.com/office/drawing/2016/5/14/chartex" xmlns:mc="http://schemas.openxmlformats.org/markup-compatibility/2006" xmlns:m="http://schemas.openxmlformats.org/officeDocument/2006/math" xmlns:aink="http://schemas.microsoft.com/office/drawing/2016/ink" xmlns:am3d="http://schemas.microsoft.com/office/drawing/2017/model3d" xmlns:oel="http://schemas.microsoft.com/office/2019/extlst" xmlns:r="http://schemas.openxmlformats.org/officeDocument/2006/relationships" xmlns:wp14="http://schemas.microsoft.com/office/word/2010/wordprocessingDrawing" xmlns:wp="http://schemas.openxmlformats.org/drawingml/2006/wordprocessingDrawing" xmlns:wpg="http://schemas.microsoft.com/office/word/2010/wordprocessingGroup" xmlns:wpi="http://schemas.microsoft.com/office/word/2010/wordprocessingInk" xmlns:wps="http://schemas.microsoft.com/office/word/2010/wordprocessingShape" xmlns:o="urn:schemas-microsoft-com:office:office" xmlns:v="urn:schemas-microsoft-com:vml" xmlns:w10="urn:schemas-microsoft-com:office:word" xmlns:w="http://schemas.openxmlformats.org/wordprocessingml/2006/main" xmlns:w14="http://schemas.microsoft.com/office/word/2010/wordml" xmlns:w15="http://schemas.microsoft.com/office/word/2012/wordml" xmlns:w16cex="http://schemas.microsoft.com/office/word/2018/wordml/cex" xmlns:w16cid="http://schemas.microsoft.com/office/word/2016/wordml/cid" xmlns:w16="http://schemas.microsoft.com/office/word/2018/wordml" xmlns:w16sdtdh="http://schemas.microsoft.com/office/word/2020/wordml/sdtdatahash" xmlns:w16sdtfl="http://schemas.microsoft.com/office/word/2024/wordml/sdtformatlock" xmlns:w16se="http://schemas.microsoft.com/office/word/2015/wordml/symex" xmlns:w16du="http://schemas.microsoft.com/office/word/2023/wordml/word16du" xmlns:wne="http://schemas.microsoft.com/office/word/2006/wordml" mc:Ignorable="w14 w15 w16se w16cid w16 w16cex w16sdtdh w16sdtfl w16du wp14">
   <w:body>
     <w:p>
       <w:pPr>
@@ -10,10 +10,8 @@
         <w:rPr>
           <w:color w:val="999999"/>
         </w:rPr>
-        <w:t xml:space="preserve">{% if has_spouse %}</w:t>
-      </w:r>
-      <w:proofErr w:type="spellStart"/>
-      <w:proofErr w:type="spellEnd"/>
+        <w:t>{% if has_spouse %}</w:t>
+      </w:r>
     </w:p>
     <w:p>
       <w:pPr>
@@ -25,10 +23,8 @@
           <w:b/>
           <w:bCs/>
         </w:rPr>
-        <w:t xml:space="preserve">{{ client.full_name | name }}</w:t>
-      </w:r>
-      <w:proofErr w:type="spellStart"/>
-      <w:proofErr w:type="spellEnd"/>
+        <w:t>{{ client.full_name | name }}</w:t>
+      </w:r>
       <w:r>
         <w:rPr>
           <w:b/>
@@ -44,10 +40,8 @@
           <w:b/>
           <w:bCs/>
         </w:rPr>
-        <w:t xml:space="preserve">{{ spouse.full_name | name }}</w:t>
-      </w:r>
-      <w:proofErr w:type="spellStart"/>
-      <w:proofErr w:type="spellEnd"/>
+        <w:t>{{ spouse.full_name | name }}</w:t>
+      </w:r>
     </w:p>
     <w:p>
       <w:r>
@@ -67,10 +61,8 @@
           <w:b/>
           <w:bCs/>
         </w:rPr>
-        <w:t xml:space="preserve">{{ client.full_name | name }}</w:t>
-      </w:r>
-      <w:proofErr w:type="spellStart"/>
-      <w:proofErr w:type="spellEnd"/>
+        <w:t>{{ client.full_name | name }}</w:t>
+      </w:r>
     </w:p>
     <w:p>
       <w:r>
@@ -131,7 +123,7 @@
         <w:spacing w:before="120" w:after="120"/>
       </w:pPr>
       <w:r>
-        <w:t xml:space="preserve">This summary outlines the key decisions and details of your estate plan. Please review each section carefully and confirm that the information is correct. Items populated from your intake information are shown throughout -- verify they are accurate. Sections marked with a flag (⚑) require a decision or additional information from you.</w:t>
+        <w:t>This summary outlines the key decisions and details of your estate plan. Please review each section carefully and confirm that the information is correct. Items populated from your intake information are shown throughout -- verify they are accurate. Sections marked with a flag (⚑) require a decision or additional information from you.</w:t>
       </w:r>
     </w:p>
     <w:p>
@@ -174,10 +166,8 @@
         <w:rPr>
           <w:color w:val="999999"/>
         </w:rPr>
-        <w:t xml:space="preserve">{% if requires_guardian_clause %}</w:t>
-      </w:r>
-      <w:proofErr w:type="spellStart"/>
-      <w:proofErr w:type="spellEnd"/>
+        <w:t>{% if requires_guardian_clause %}</w:t>
+      </w:r>
     </w:p>
     <w:p>
       <w:r>
@@ -192,10 +182,8 @@
         <w:rPr>
           <w:color w:val="999999"/>
         </w:rPr>
-        <w:t xml:space="preserve">{% if has_spouse %}</w:t>
-      </w:r>
-      <w:proofErr w:type="spellStart"/>
-      <w:proofErr w:type="spellEnd"/>
+        <w:t>{% if has_spouse %}</w:t>
+      </w:r>
     </w:p>
     <w:p>
       <w:r>
@@ -227,12 +215,6 @@
         <w:gridCol w:w="4017"/>
       </w:tblGrid>
       <w:tr>
-        <w:tblPrEx>
-          <w:tblCellMar>
-            <w:top w:w="0" w:type="dxa"/>
-            <w:bottom w:w="0" w:type="dxa"/>
-          </w:tblCellMar>
-        </w:tblPrEx>
         <w:trPr>
           <w:cantSplit/>
         </w:trPr>
@@ -305,12 +287,6 @@
         </w:tc>
       </w:tr>
       <w:tr>
-        <w:tblPrEx>
-          <w:tblCellMar>
-            <w:top w:w="0" w:type="dxa"/>
-            <w:bottom w:w="0" w:type="dxa"/>
-          </w:tblCellMar>
-        </w:tblPrEx>
         <w:trPr>
           <w:cantSplit/>
         </w:trPr>
@@ -366,20 +342,12 @@
               <w:rPr>
                 <w:color w:val="999999"/>
               </w:rPr>
-              <w:t xml:space="preserve">{% if planning.include_trust %}Yes{% else %}No{% endif %}</w:t>
-            </w:r>
-            <w:proofErr w:type="spellStart"/>
-            <w:proofErr w:type="spellEnd"/>
+              <w:t>{% if planning.include_trust %}Yes{% else %}No{% endif %}</w:t>
+            </w:r>
           </w:p>
         </w:tc>
       </w:tr>
       <w:tr>
-        <w:tblPrEx>
-          <w:tblCellMar>
-            <w:top w:w="0" w:type="dxa"/>
-            <w:bottom w:w="0" w:type="dxa"/>
-          </w:tblCellMar>
-        </w:tblPrEx>
         <w:trPr>
           <w:cantSplit/>
         </w:trPr>
@@ -435,20 +403,12 @@
               <w:rPr>
                 <w:color w:val="999999"/>
               </w:rPr>
-              <w:t xml:space="preserve">{% if planning.include_pour_over_will %}Yes{% else %}No{% endif %}</w:t>
-            </w:r>
-            <w:proofErr w:type="spellStart"/>
-            <w:proofErr w:type="spellEnd"/>
+              <w:t>{% if planning.include_pour_over_will %}Yes{% else %}No{% endif %}</w:t>
+            </w:r>
           </w:p>
         </w:tc>
       </w:tr>
       <w:tr>
-        <w:tblPrEx>
-          <w:tblCellMar>
-            <w:top w:w="0" w:type="dxa"/>
-            <w:bottom w:w="0" w:type="dxa"/>
-          </w:tblCellMar>
-        </w:tblPrEx>
         <w:trPr>
           <w:cantSplit/>
         </w:trPr>
@@ -504,20 +464,12 @@
               <w:rPr>
                 <w:color w:val="999999"/>
               </w:rPr>
-              <w:t xml:space="preserve">{% if planning.include_simple_will %}Yes{% else %}No{% endif %}</w:t>
-            </w:r>
-            <w:proofErr w:type="spellStart"/>
-            <w:proofErr w:type="spellEnd"/>
+              <w:t>{% if planning.include_simple_will %}Yes{% else %}No{% endif %}</w:t>
+            </w:r>
           </w:p>
         </w:tc>
       </w:tr>
       <w:tr>
-        <w:tblPrEx>
-          <w:tblCellMar>
-            <w:top w:w="0" w:type="dxa"/>
-            <w:bottom w:w="0" w:type="dxa"/>
-          </w:tblCellMar>
-        </w:tblPrEx>
         <w:trPr>
           <w:cantSplit/>
         </w:trPr>
@@ -573,20 +525,12 @@
               <w:rPr>
                 <w:color w:val="999999"/>
               </w:rPr>
-              <w:t xml:space="preserve">{% if planning.include_testamentary_trust_will %}Yes{% else %}No{% endif %}</w:t>
-            </w:r>
-            <w:proofErr w:type="spellStart"/>
-            <w:proofErr w:type="spellEnd"/>
+              <w:t>{% if planning.include_testamentary_trust_will %}Yes{% else %}No{% endif %}</w:t>
+            </w:r>
           </w:p>
         </w:tc>
       </w:tr>
       <w:tr>
-        <w:tblPrEx>
-          <w:tblCellMar>
-            <w:top w:w="0" w:type="dxa"/>
-            <w:bottom w:w="0" w:type="dxa"/>
-          </w:tblCellMar>
-        </w:tblPrEx>
         <w:trPr>
           <w:cantSplit/>
         </w:trPr>
@@ -642,20 +586,12 @@
               <w:rPr>
                 <w:color w:val="999999"/>
               </w:rPr>
-              <w:t xml:space="preserve">{% if planning.include_dpoa %}Yes{% else %}No{% endif %}</w:t>
-            </w:r>
-            <w:proofErr w:type="spellStart"/>
-            <w:proofErr w:type="spellEnd"/>
+              <w:t>{% if planning.include_dpoa %}Yes{% else %}No{% endif %}</w:t>
+            </w:r>
           </w:p>
         </w:tc>
       </w:tr>
       <w:tr>
-        <w:tblPrEx>
-          <w:tblCellMar>
-            <w:top w:w="0" w:type="dxa"/>
-            <w:bottom w:w="0" w:type="dxa"/>
-          </w:tblCellMar>
-        </w:tblPrEx>
         <w:trPr>
           <w:cantSplit/>
         </w:trPr>
@@ -711,20 +647,12 @@
               <w:rPr>
                 <w:color w:val="999999"/>
               </w:rPr>
-              <w:t xml:space="preserve">{% if planning.include_hcp %}Yes{% else %}No{% endif %}</w:t>
-            </w:r>
-            <w:proofErr w:type="spellStart"/>
-            <w:proofErr w:type="spellEnd"/>
+              <w:t>{% if planning.include_hcp %}Yes{% else %}No{% endif %}</w:t>
+            </w:r>
           </w:p>
         </w:tc>
       </w:tr>
       <w:tr>
-        <w:tblPrEx>
-          <w:tblCellMar>
-            <w:top w:w="0" w:type="dxa"/>
-            <w:bottom w:w="0" w:type="dxa"/>
-          </w:tblCellMar>
-        </w:tblPrEx>
         <w:trPr>
           <w:cantSplit/>
         </w:trPr>
@@ -780,20 +708,12 @@
               <w:rPr>
                 <w:color w:val="999999"/>
               </w:rPr>
-              <w:t xml:space="preserve">{% if planning.include_ahd %}Yes{% else %}No{% endif %}</w:t>
-            </w:r>
-            <w:proofErr w:type="spellStart"/>
-            <w:proofErr w:type="spellEnd"/>
+              <w:t>{% if planning.include_ahd %}Yes{% else %}No{% endif %}</w:t>
+            </w:r>
           </w:p>
         </w:tc>
       </w:tr>
       <w:tr>
-        <w:tblPrEx>
-          <w:tblCellMar>
-            <w:top w:w="0" w:type="dxa"/>
-            <w:bottom w:w="0" w:type="dxa"/>
-          </w:tblCellMar>
-        </w:tblPrEx>
         <w:trPr>
           <w:cantSplit/>
         </w:trPr>
@@ -849,20 +769,12 @@
               <w:rPr>
                 <w:color w:val="999999"/>
               </w:rPr>
-              <w:t xml:space="preserve">{% if planning.include_hipaa %}Yes{% else %}No{% endif %}</w:t>
-            </w:r>
-            <w:proofErr w:type="spellStart"/>
-            <w:proofErr w:type="spellEnd"/>
+              <w:t>{% if planning.include_hipaa %}Yes{% else %}No{% endif %}</w:t>
+            </w:r>
           </w:p>
         </w:tc>
       </w:tr>
       <w:tr>
-        <w:tblPrEx>
-          <w:tblCellMar>
-            <w:top w:w="0" w:type="dxa"/>
-            <w:bottom w:w="0" w:type="dxa"/>
-          </w:tblCellMar>
-        </w:tblPrEx>
         <w:trPr>
           <w:cantSplit/>
         </w:trPr>
@@ -918,20 +830,12 @@
               <w:rPr>
                 <w:color w:val="999999"/>
               </w:rPr>
-              <w:t xml:space="preserve">{% if planning.include_ppm %}Yes{% else %}No{% endif %}</w:t>
-            </w:r>
-            <w:proofErr w:type="spellStart"/>
-            <w:proofErr w:type="spellEnd"/>
+              <w:t>{% if planning.include_ppm %}Yes{% else %}No{% endif %}</w:t>
+            </w:r>
           </w:p>
         </w:tc>
       </w:tr>
       <w:tr>
-        <w:tblPrEx>
-          <w:tblCellMar>
-            <w:top w:w="0" w:type="dxa"/>
-            <w:bottom w:w="0" w:type="dxa"/>
-          </w:tblCellMar>
-        </w:tblPrEx>
         <w:trPr>
           <w:cantSplit/>
         </w:trPr>
@@ -990,12 +894,6 @@
         </w:tc>
       </w:tr>
       <w:tr>
-        <w:tblPrEx>
-          <w:tblCellMar>
-            <w:top w:w="0" w:type="dxa"/>
-            <w:bottom w:w="0" w:type="dxa"/>
-          </w:tblCellMar>
-        </w:tblPrEx>
         <w:trPr>
           <w:cantSplit/>
         </w:trPr>
@@ -1028,10 +926,8 @@
                 <w:iCs/>
                 <w:color w:val="999999"/>
               </w:rPr>
-              <w:t xml:space="preserve">{% if planning.spouse_docs %}Spouse documents will also be prepared.{% else %}Spouse documents are not included.{% endif %}</w:t>
-            </w:r>
-            <w:proofErr w:type="spellStart"/>
-            <w:proofErr w:type="spellEnd"/>
+              <w:t>{% if planning.spouse_docs %}Spouse documents will also be prepared.{% else %}Spouse documents are not included.{% endif %}</w:t>
+            </w:r>
           </w:p>
         </w:tc>
       </w:tr>
@@ -1078,12 +974,6 @@
         <w:gridCol w:w="3280"/>
       </w:tblGrid>
       <w:tr>
-        <w:tblPrEx>
-          <w:tblCellMar>
-            <w:top w:w="0" w:type="dxa"/>
-            <w:bottom w:w="0" w:type="dxa"/>
-          </w:tblCellMar>
-        </w:tblPrEx>
         <w:trPr>
           <w:cantSplit/>
         </w:trPr>
@@ -1140,10 +1030,8 @@
                 <w:bCs/>
                 <w:color w:val="FFFFFF"/>
               </w:rPr>
-              <w:t xml:space="preserve">{{ client.full_name }}</w:t>
-            </w:r>
-            <w:proofErr w:type="spellStart"/>
-            <w:proofErr w:type="spellEnd"/>
+              <w:t>{{ client.full_name }}</w:t>
+            </w:r>
           </w:p>
         </w:tc>
         <w:tc>
@@ -1175,22 +1063,12 @@
                 <w:bCs/>
                 <w:color w:val="FFFFFF"/>
               </w:rPr>
-              <w:t xml:space="preserve">{% if has_spouse %}{{ spouse.full_name }}{% endif %}</w:t>
-            </w:r>
-            <w:proofErr w:type="spellStart"/>
-            <w:proofErr w:type="spellEnd"/>
-            <w:proofErr w:type="spellStart"/>
-            <w:proofErr w:type="spellEnd"/>
+              <w:t>{% if has_spouse %}{{ spouse.full_name }}{% endif %}</w:t>
+            </w:r>
           </w:p>
         </w:tc>
       </w:tr>
       <w:tr>
-        <w:tblPrEx>
-          <w:tblCellMar>
-            <w:top w:w="0" w:type="dxa"/>
-            <w:bottom w:w="0" w:type="dxa"/>
-          </w:tblCellMar>
-        </w:tblPrEx>
         <w:trPr>
           <w:cantSplit/>
         </w:trPr>
@@ -1248,10 +1126,8 @@
               <w:keepLines/>
             </w:pPr>
             <w:r>
-              <w:t xml:space="preserve">{{ client.full_name }}</w:t>
-            </w:r>
-            <w:proofErr w:type="spellStart"/>
-            <w:proofErr w:type="spellEnd"/>
+              <w:t>{{ client.full_name }}</w:t>
+            </w:r>
           </w:p>
         </w:tc>
         <w:tc>
@@ -1276,20 +1152,12 @@
               <w:keepLines/>
             </w:pPr>
             <w:r>
-              <w:t xml:space="preserve">{{ spouse.full_name }}</w:t>
-            </w:r>
-            <w:proofErr w:type="spellStart"/>
-            <w:proofErr w:type="spellEnd"/>
+              <w:t>{{ spouse.full_name }}</w:t>
+            </w:r>
           </w:p>
         </w:tc>
       </w:tr>
       <w:tr>
-        <w:tblPrEx>
-          <w:tblCellMar>
-            <w:top w:w="0" w:type="dxa"/>
-            <w:bottom w:w="0" w:type="dxa"/>
-          </w:tblCellMar>
-        </w:tblPrEx>
         <w:trPr>
           <w:cantSplit/>
         </w:trPr>
@@ -1347,43 +1215,51 @@
               <w:keepLines/>
             </w:pPr>
             <w:r>
-              <w:t xml:space="preserve">{{ client.aka }}</w:t>
+              <w:t>{{ client.aka }}</w:t>
+            </w:r>
+          </w:p>
+        </w:tc>
+        <w:tc>
+          <w:tcPr>
+            <w:tcW w:w="3280" w:type="dxa"/>
+            <w:tcBorders>
+              <w:top w:val="single" w:sz="1" w:space="0" w:color="CCCCCC"/>
+              <w:left w:val="single" w:sz="1" w:space="0" w:color="CCCCCC"/>
+              <w:bottom w:val="single" w:sz="1" w:space="0" w:color="CCCCCC"/>
+              <w:right w:val="single" w:sz="1" w:space="0" w:color="CCCCCC"/>
+            </w:tcBorders>
+            <w:tcMar>
+              <w:top w:w="60" w:type="dxa"/>
+              <w:left w:w="100" w:type="dxa"/>
+              <w:bottom w:w="60" w:type="dxa"/>
+              <w:right w:w="100" w:type="dxa"/>
+            </w:tcMar>
+          </w:tcPr>
+          <w:p>
+            <w:pPr>
+              <w:keepNext/>
+              <w:keepLines/>
+            </w:pPr>
+            <w:proofErr w:type="gramStart"/>
+            <w:r>
+              <w:t xml:space="preserve">{{ </w:t>
             </w:r>
             <w:proofErr w:type="spellStart"/>
+            <w:r>
+              <w:t>spouse</w:t>
+            </w:r>
+            <w:r>
+              <w:t>.aka</w:t>
+            </w:r>
             <w:proofErr w:type="spellEnd"/>
-          </w:p>
-        </w:tc>
-        <w:tc>
-          <w:tcPr>
-            <w:tcW w:w="3280" w:type="dxa"/>
-            <w:tcBorders>
-              <w:top w:val="single" w:sz="1" w:space="0" w:color="CCCCCC"/>
-              <w:left w:val="single" w:sz="1" w:space="0" w:color="CCCCCC"/>
-              <w:bottom w:val="single" w:sz="1" w:space="0" w:color="CCCCCC"/>
-              <w:right w:val="single" w:sz="1" w:space="0" w:color="CCCCCC"/>
-            </w:tcBorders>
-            <w:tcMar>
-              <w:top w:w="60" w:type="dxa"/>
-              <w:left w:w="100" w:type="dxa"/>
-              <w:bottom w:w="60" w:type="dxa"/>
-              <w:right w:w="100" w:type="dxa"/>
-            </w:tcMar>
-          </w:tcPr>
-          <w:p>
-            <w:pPr>
-              <w:keepNext/>
-              <w:keepLines/>
-            </w:pPr>
+            <w:proofErr w:type="gramEnd"/>
+            <w:r>
+              <w:t xml:space="preserve"> }}</w:t>
+            </w:r>
           </w:p>
         </w:tc>
       </w:tr>
       <w:tr>
-        <w:tblPrEx>
-          <w:tblCellMar>
-            <w:top w:w="0" w:type="dxa"/>
-            <w:bottom w:w="0" w:type="dxa"/>
-          </w:tblCellMar>
-        </w:tblPrEx>
         <w:trPr>
           <w:cantSplit/>
         </w:trPr>
@@ -1441,43 +1317,51 @@
               <w:keepLines/>
             </w:pPr>
             <w:r>
-              <w:t xml:space="preserve">{{ client.date_of_birth }}</w:t>
+              <w:t>{{ client.date_of_birth }}</w:t>
+            </w:r>
+          </w:p>
+        </w:tc>
+        <w:tc>
+          <w:tcPr>
+            <w:tcW w:w="3280" w:type="dxa"/>
+            <w:tcBorders>
+              <w:top w:val="single" w:sz="1" w:space="0" w:color="CCCCCC"/>
+              <w:left w:val="single" w:sz="1" w:space="0" w:color="CCCCCC"/>
+              <w:bottom w:val="single" w:sz="1" w:space="0" w:color="CCCCCC"/>
+              <w:right w:val="single" w:sz="1" w:space="0" w:color="CCCCCC"/>
+            </w:tcBorders>
+            <w:tcMar>
+              <w:top w:w="60" w:type="dxa"/>
+              <w:left w:w="100" w:type="dxa"/>
+              <w:bottom w:w="60" w:type="dxa"/>
+              <w:right w:w="100" w:type="dxa"/>
+            </w:tcMar>
+          </w:tcPr>
+          <w:p>
+            <w:pPr>
+              <w:keepNext/>
+              <w:keepLines/>
+            </w:pPr>
+            <w:proofErr w:type="gramStart"/>
+            <w:r>
+              <w:t xml:space="preserve">{{ </w:t>
             </w:r>
             <w:proofErr w:type="spellStart"/>
+            <w:r>
+              <w:t>spouse</w:t>
+            </w:r>
+            <w:proofErr w:type="gramEnd"/>
+            <w:r>
+              <w:t>.date_of_birth</w:t>
+            </w:r>
             <w:proofErr w:type="spellEnd"/>
-          </w:p>
-        </w:tc>
-        <w:tc>
-          <w:tcPr>
-            <w:tcW w:w="3280" w:type="dxa"/>
-            <w:tcBorders>
-              <w:top w:val="single" w:sz="1" w:space="0" w:color="CCCCCC"/>
-              <w:left w:val="single" w:sz="1" w:space="0" w:color="CCCCCC"/>
-              <w:bottom w:val="single" w:sz="1" w:space="0" w:color="CCCCCC"/>
-              <w:right w:val="single" w:sz="1" w:space="0" w:color="CCCCCC"/>
-            </w:tcBorders>
-            <w:tcMar>
-              <w:top w:w="60" w:type="dxa"/>
-              <w:left w:w="100" w:type="dxa"/>
-              <w:bottom w:w="60" w:type="dxa"/>
-              <w:right w:w="100" w:type="dxa"/>
-            </w:tcMar>
-          </w:tcPr>
-          <w:p>
-            <w:pPr>
-              <w:keepNext/>
-              <w:keepLines/>
-            </w:pPr>
+            <w:r>
+              <w:t xml:space="preserve"> }}</w:t>
+            </w:r>
           </w:p>
         </w:tc>
       </w:tr>
       <w:tr>
-        <w:tblPrEx>
-          <w:tblCellMar>
-            <w:top w:w="0" w:type="dxa"/>
-            <w:bottom w:w="0" w:type="dxa"/>
-          </w:tblCellMar>
-        </w:tblPrEx>
         <w:trPr>
           <w:cantSplit/>
         </w:trPr>
@@ -1515,63 +1399,52 @@
         </w:tc>
         <w:tc>
           <w:tcPr>
-            <w:tcW w:w="3280" w:type="dxa"/>
-            <w:tcBorders>
-              <w:top w:val="single" w:sz="1" w:space="0" w:color="CCCCCC"/>
-              <w:left w:val="single" w:sz="1" w:space="0" w:color="CCCCCC"/>
-              <w:bottom w:val="single" w:sz="1" w:space="0" w:color="CCCCCC"/>
-              <w:right w:val="single" w:sz="1" w:space="0" w:color="CCCCCC"/>
-            </w:tcBorders>
-            <w:tcMar>
-              <w:top w:w="60" w:type="dxa"/>
-              <w:left w:w="100" w:type="dxa"/>
-              <w:bottom w:w="60" w:type="dxa"/>
-              <w:right w:w="100" w:type="dxa"/>
-            </w:tcMar>
-          </w:tcPr>
-          <w:p>
-            <w:pPr>
-              <w:keepNext/>
-              <w:keepLines/>
-            </w:pPr>
-            <w:r>
-              <w:t xml:space="preserve">{{ client.street_address }}</w:t>
+            <w:tcW w:w="6560" w:type="dxa"/>
+            <w:gridSpan w:val="2"/>
+            <w:tcBorders>
+              <w:top w:val="single" w:sz="1" w:space="0" w:color="CCCCCC"/>
+              <w:left w:val="single" w:sz="1" w:space="0" w:color="CCCCCC"/>
+              <w:bottom w:val="single" w:sz="1" w:space="0" w:color="CCCCCC"/>
+              <w:right w:val="single" w:sz="1" w:space="0" w:color="CCCCCC"/>
+            </w:tcBorders>
+            <w:tcMar>
+              <w:top w:w="60" w:type="dxa"/>
+              <w:left w:w="100" w:type="dxa"/>
+              <w:bottom w:w="60" w:type="dxa"/>
+              <w:right w:w="100" w:type="dxa"/>
+            </w:tcMar>
+          </w:tcPr>
+          <w:p>
+            <w:pPr>
+              <w:keepNext/>
+              <w:keepLines/>
+            </w:pPr>
+            <w:r>
+              <w:t xml:space="preserve">{{ client.street_address }}, {{ </w:t>
             </w:r>
             <w:proofErr w:type="spellStart"/>
+            <w:r>
+              <w:t>client.city</w:t>
+            </w:r>
             <w:proofErr w:type="spellEnd"/>
-          </w:p>
-        </w:tc>
-        <w:tc>
-          <w:tcPr>
-            <w:tcW w:w="3280" w:type="dxa"/>
-            <w:tcBorders>
-              <w:top w:val="single" w:sz="1" w:space="0" w:color="CCCCCC"/>
-              <w:left w:val="single" w:sz="1" w:space="0" w:color="CCCCCC"/>
-              <w:bottom w:val="single" w:sz="1" w:space="0" w:color="CCCCCC"/>
-              <w:right w:val="single" w:sz="1" w:space="0" w:color="CCCCCC"/>
-            </w:tcBorders>
-            <w:tcMar>
-              <w:top w:w="60" w:type="dxa"/>
-              <w:left w:w="100" w:type="dxa"/>
-              <w:bottom w:w="60" w:type="dxa"/>
-              <w:right w:w="100" w:type="dxa"/>
-            </w:tcMar>
-          </w:tcPr>
-          <w:p>
-            <w:pPr>
-              <w:keepNext/>
-              <w:keepLines/>
-            </w:pPr>
+            <w:r>
+              <w:t xml:space="preserve"> }}, </w:t>
+            </w:r>
+            <w:r>
+              <w:t xml:space="preserve">{{ </w:t>
+            </w:r>
+            <w:proofErr w:type="spellStart"/>
+            <w:r>
+              <w:t>client.state</w:t>
+            </w:r>
+            <w:proofErr w:type="spellEnd"/>
+            <w:r>
+              <w:t xml:space="preserve"> }} {{ client.zip }}</w:t>
+            </w:r>
           </w:p>
         </w:tc>
       </w:tr>
       <w:tr>
-        <w:tblPrEx>
-          <w:tblCellMar>
-            <w:top w:w="0" w:type="dxa"/>
-            <w:bottom w:w="0" w:type="dxa"/>
-          </w:tblCellMar>
-        </w:tblPrEx>
         <w:trPr>
           <w:cantSplit/>
         </w:trPr>
@@ -1629,10 +1502,8 @@
               <w:keepLines/>
             </w:pPr>
             <w:r>
-              <w:t xml:space="preserve">{{ client.county }}</w:t>
-            </w:r>
-            <w:proofErr w:type="spellStart"/>
-            <w:proofErr w:type="spellEnd"/>
+              <w:t>{{ client.county }}</w:t>
+            </w:r>
           </w:p>
         </w:tc>
         <w:tc>
@@ -1684,17 +1555,15 @@
         <w:rPr>
           <w:color w:val="999999"/>
         </w:rPr>
-        <w:t xml:space="preserve">{% if has_children %}</w:t>
-      </w:r>
-      <w:proofErr w:type="spellStart"/>
-      <w:proofErr w:type="spellEnd"/>
+        <w:lastRenderedPageBreak/>
+        <w:t>{% if has_children %}</w:t>
+      </w:r>
     </w:p>
     <w:p>
       <w:r>
         <w:rPr>
           <w:color w:val="999999"/>
         </w:rPr>
-        <w:lastRenderedPageBreak/>
         <w:t>{% for child in children %}</w:t>
       </w:r>
     </w:p>
@@ -1720,12 +1589,6 @@
         <w:gridCol w:w="6560"/>
       </w:tblGrid>
       <w:tr>
-        <w:tblPrEx>
-          <w:tblCellMar>
-            <w:top w:w="0" w:type="dxa"/>
-            <w:bottom w:w="0" w:type="dxa"/>
-          </w:tblCellMar>
-        </w:tblPrEx>
         <w:trPr>
           <w:cantSplit/>
         </w:trPr>
@@ -1783,20 +1646,12 @@
               <w:keepLines/>
             </w:pPr>
             <w:r>
-              <w:t xml:space="preserve">{{ child.full_name }}</w:t>
-            </w:r>
-            <w:proofErr w:type="spellStart"/>
-            <w:proofErr w:type="spellEnd"/>
+              <w:t>{{ child.full_name }}</w:t>
+            </w:r>
           </w:p>
         </w:tc>
       </w:tr>
       <w:tr>
-        <w:tblPrEx>
-          <w:tblCellMar>
-            <w:top w:w="0" w:type="dxa"/>
-            <w:bottom w:w="0" w:type="dxa"/>
-          </w:tblCellMar>
-        </w:tblPrEx>
         <w:trPr>
           <w:cantSplit/>
         </w:trPr>
@@ -1854,10 +1709,8 @@
               <w:keepLines/>
             </w:pPr>
             <w:r>
-              <w:t xml:space="preserve">{{ child.date_of_birth }}</w:t>
-            </w:r>
-            <w:proofErr w:type="spellStart"/>
-            <w:proofErr w:type="spellEnd"/>
+              <w:t>{{ child.date_of_birth }}</w:t>
+            </w:r>
           </w:p>
         </w:tc>
       </w:tr>
@@ -1867,10 +1720,8 @@
         <w:rPr>
           <w:color w:val="999999"/>
         </w:rPr>
-        <w:t xml:space="preserve">{% endfor %}</w:t>
-      </w:r>
-      <w:proofErr w:type="spellStart"/>
-      <w:proofErr w:type="spellEnd"/>
+        <w:t>{% endfor %}</w:t>
+      </w:r>
     </w:p>
     <w:p>
       <w:r>
@@ -1908,10 +1759,8 @@
         <w:rPr>
           <w:color w:val="999999"/>
         </w:rPr>
-        <w:t xml:space="preserve">{% if planning.include_trust %}</w:t>
-      </w:r>
-      <w:proofErr w:type="spellStart"/>
-      <w:proofErr w:type="spellEnd"/>
+        <w:t>{% if planning.include_trust %}</w:t>
+      </w:r>
     </w:p>
     <w:p>
       <w:r>
@@ -1976,12 +1825,6 @@
         <w:gridCol w:w="6560"/>
       </w:tblGrid>
       <w:tr>
-        <w:tblPrEx>
-          <w:tblCellMar>
-            <w:top w:w="0" w:type="dxa"/>
-            <w:bottom w:w="0" w:type="dxa"/>
-          </w:tblCellMar>
-        </w:tblPrEx>
         <w:trPr>
           <w:cantSplit/>
         </w:trPr>
@@ -2014,10 +1857,26 @@
                 <w:bCs/>
                 <w:color w:val="FFFFFF"/>
               </w:rPr>
-              <w:t xml:space="preserve">{{ client.full_name }}'s Trust</w:t>
+              <w:t xml:space="preserve">{{ </w:t>
             </w:r>
             <w:proofErr w:type="spellStart"/>
+            <w:r>
+              <w:rPr>
+                <w:b/>
+                <w:bCs/>
+                <w:color w:val="FFFFFF"/>
+              </w:rPr>
+              <w:t>client.full_name</w:t>
+            </w:r>
             <w:proofErr w:type="spellEnd"/>
+            <w:r>
+              <w:rPr>
+                <w:b/>
+                <w:bCs/>
+                <w:color w:val="FFFFFF"/>
+              </w:rPr>
+              <w:t xml:space="preserve"> }}'s Trust</w:t>
+            </w:r>
           </w:p>
         </w:tc>
         <w:tc>
@@ -2047,12 +1906,6 @@
         </w:tc>
       </w:tr>
       <w:tr>
-        <w:tblPrEx>
-          <w:tblCellMar>
-            <w:top w:w="0" w:type="dxa"/>
-            <w:bottom w:w="0" w:type="dxa"/>
-          </w:tblCellMar>
-        </w:tblPrEx>
         <w:trPr>
           <w:cantSplit/>
         </w:trPr>
@@ -2116,12 +1969,6 @@
         </w:tc>
       </w:tr>
       <w:tr>
-        <w:tblPrEx>
-          <w:tblCellMar>
-            <w:top w:w="0" w:type="dxa"/>
-            <w:bottom w:w="0" w:type="dxa"/>
-          </w:tblCellMar>
-        </w:tblPrEx>
         <w:trPr>
           <w:cantSplit/>
         </w:trPr>
@@ -2179,20 +2026,12 @@
               <w:keepLines/>
             </w:pPr>
             <w:r>
-              <w:t xml:space="preserve">{{ trust.display_date }}</w:t>
-            </w:r>
-            <w:proofErr w:type="spellStart"/>
-            <w:proofErr w:type="spellEnd"/>
+              <w:t>{{ trust.display_date }}</w:t>
+            </w:r>
           </w:p>
         </w:tc>
       </w:tr>
       <w:tr>
-        <w:tblPrEx>
-          <w:tblCellMar>
-            <w:top w:w="0" w:type="dxa"/>
-            <w:bottom w:w="0" w:type="dxa"/>
-          </w:tblCellMar>
-        </w:tblPrEx>
         <w:trPr>
           <w:cantSplit/>
         </w:trPr>
@@ -2250,20 +2089,12 @@
               <w:keepLines/>
             </w:pPr>
             <w:r>
-              <w:t xml:space="preserve">{{ client.full_name }}</w:t>
-            </w:r>
-            <w:proofErr w:type="spellStart"/>
-            <w:proofErr w:type="spellEnd"/>
+              <w:t>{{ client.full_name }}</w:t>
+            </w:r>
           </w:p>
         </w:tc>
       </w:tr>
       <w:tr>
-        <w:tblPrEx>
-          <w:tblCellMar>
-            <w:top w:w="0" w:type="dxa"/>
-            <w:bottom w:w="0" w:type="dxa"/>
-          </w:tblCellMar>
-        </w:tblPrEx>
         <w:trPr>
           <w:cantSplit/>
         </w:trPr>
@@ -2321,16 +2152,8 @@
               <w:keepLines/>
             </w:pPr>
             <w:r>
-              <w:t xml:space="preserve">{{ fiduciaries.trustee.primary.full_name }}{% if fiduciaries.trustee.co_primary is defined and fiduciaries.trustee.co_primary.full_name %} and {{ fiduciaries.trustee.co_primary.full_name }}{% endif %}</w:t>
-            </w:r>
-            <w:proofErr w:type="spellStart"/>
-            <w:proofErr w:type="spellEnd"/>
-            <w:proofErr w:type="spellStart"/>
-            <w:proofErr w:type="spellEnd"/>
-            <w:proofErr w:type="spellStart"/>
-            <w:proofErr w:type="spellEnd"/>
-            <w:proofErr w:type="spellStart"/>
-            <w:proofErr w:type="spellEnd"/>
+              <w:t>{{ fiduciaries.trustee.primary.full_name }}{% if fiduciaries.trustee.co_primary is defined and fiduciaries.trustee.co_primary.full_name %} and {{ fiduciaries.trustee.co_primary.full_name }}{% endif %}</w:t>
+            </w:r>
           </w:p>
         </w:tc>
       </w:tr>
@@ -2340,10 +2163,8 @@
         <w:rPr>
           <w:color w:val="999999"/>
         </w:rPr>
-        <w:t xml:space="preserve">{% if has_spouse %}</w:t>
-      </w:r>
-      <w:proofErr w:type="spellStart"/>
-      <w:proofErr w:type="spellEnd"/>
+        <w:t>{% if has_spouse %}</w:t>
+      </w:r>
     </w:p>
     <w:tbl>
       <w:tblPr>
@@ -2367,12 +2188,6 @@
         <w:gridCol w:w="6560"/>
       </w:tblGrid>
       <w:tr>
-        <w:tblPrEx>
-          <w:tblCellMar>
-            <w:top w:w="0" w:type="dxa"/>
-            <w:bottom w:w="0" w:type="dxa"/>
-          </w:tblCellMar>
-        </w:tblPrEx>
         <w:trPr>
           <w:cantSplit/>
         </w:trPr>
@@ -2405,10 +2220,26 @@
                 <w:bCs/>
                 <w:color w:val="FFFFFF"/>
               </w:rPr>
-              <w:t xml:space="preserve">{{ spouse.full_name }}'s Trust</w:t>
+              <w:t xml:space="preserve">{{ </w:t>
             </w:r>
             <w:proofErr w:type="spellStart"/>
+            <w:r>
+              <w:rPr>
+                <w:b/>
+                <w:bCs/>
+                <w:color w:val="FFFFFF"/>
+              </w:rPr>
+              <w:t>spouse.full_name</w:t>
+            </w:r>
             <w:proofErr w:type="spellEnd"/>
+            <w:r>
+              <w:rPr>
+                <w:b/>
+                <w:bCs/>
+                <w:color w:val="FFFFFF"/>
+              </w:rPr>
+              <w:t xml:space="preserve"> }}'s Trust</w:t>
+            </w:r>
           </w:p>
         </w:tc>
         <w:tc>
@@ -2438,12 +2269,6 @@
         </w:tc>
       </w:tr>
       <w:tr>
-        <w:tblPrEx>
-          <w:tblCellMar>
-            <w:top w:w="0" w:type="dxa"/>
-            <w:bottom w:w="0" w:type="dxa"/>
-          </w:tblCellMar>
-        </w:tblPrEx>
         <w:trPr>
           <w:cantSplit/>
         </w:trPr>
@@ -2507,12 +2332,6 @@
         </w:tc>
       </w:tr>
       <w:tr>
-        <w:tblPrEx>
-          <w:tblCellMar>
-            <w:top w:w="0" w:type="dxa"/>
-            <w:bottom w:w="0" w:type="dxa"/>
-          </w:tblCellMar>
-        </w:tblPrEx>
         <w:trPr>
           <w:cantSplit/>
         </w:trPr>
@@ -2570,20 +2389,12 @@
               <w:keepLines/>
             </w:pPr>
             <w:r>
-              <w:t xml:space="preserve">{{ trust.display_date }}</w:t>
-            </w:r>
-            <w:proofErr w:type="spellStart"/>
-            <w:proofErr w:type="spellEnd"/>
+              <w:t>{{ trust.display_date }}</w:t>
+            </w:r>
           </w:p>
         </w:tc>
       </w:tr>
       <w:tr>
-        <w:tblPrEx>
-          <w:tblCellMar>
-            <w:top w:w="0" w:type="dxa"/>
-            <w:bottom w:w="0" w:type="dxa"/>
-          </w:tblCellMar>
-        </w:tblPrEx>
         <w:trPr>
           <w:cantSplit/>
         </w:trPr>
@@ -2641,20 +2452,12 @@
               <w:keepLines/>
             </w:pPr>
             <w:r>
-              <w:t xml:space="preserve">{{ spouse.full_name }}</w:t>
-            </w:r>
-            <w:proofErr w:type="spellStart"/>
-            <w:proofErr w:type="spellEnd"/>
+              <w:t>{{ spouse.full_name }}</w:t>
+            </w:r>
           </w:p>
         </w:tc>
       </w:tr>
       <w:tr>
-        <w:tblPrEx>
-          <w:tblCellMar>
-            <w:top w:w="0" w:type="dxa"/>
-            <w:bottom w:w="0" w:type="dxa"/>
-          </w:tblCellMar>
-        </w:tblPrEx>
         <w:trPr>
           <w:cantSplit/>
         </w:trPr>
@@ -2712,16 +2515,8 @@
               <w:keepLines/>
             </w:pPr>
             <w:r>
-              <w:t xml:space="preserve">{{ spouse.full_name }}{% if fiduciaries.trustee.co_primary is defined and fiduciaries.trustee.co_primary.full_name %} and {{ client.full_name }}{% endif %}</w:t>
-            </w:r>
-            <w:proofErr w:type="spellStart"/>
-            <w:proofErr w:type="spellEnd"/>
-            <w:proofErr w:type="spellStart"/>
-            <w:proofErr w:type="spellEnd"/>
-            <w:proofErr w:type="spellStart"/>
-            <w:proofErr w:type="spellEnd"/>
-            <w:proofErr w:type="spellStart"/>
-            <w:proofErr w:type="spellEnd"/>
+              <w:t>{{ spouse.full_name }}{% if fiduciaries.trustee.co_primary is defined and fiduciaries.trustee.co_primary.full_name %} and {{ client.full_name }}{% endif %}</w:t>
+            </w:r>
           </w:p>
         </w:tc>
       </w:tr>
@@ -2778,12 +2573,6 @@
         <w:gridCol w:w="8160"/>
       </w:tblGrid>
       <w:tr>
-        <w:tblPrEx>
-          <w:tblCellMar>
-            <w:top w:w="0" w:type="dxa"/>
-            <w:bottom w:w="0" w:type="dxa"/>
-          </w:tblCellMar>
-        </w:tblPrEx>
         <w:trPr>
           <w:cantSplit/>
         </w:trPr>
@@ -2821,12 +2610,6 @@
         </w:tc>
       </w:tr>
       <w:tr>
-        <w:tblPrEx>
-          <w:tblCellMar>
-            <w:top w:w="0" w:type="dxa"/>
-            <w:bottom w:w="0" w:type="dxa"/>
-          </w:tblCellMar>
-        </w:tblPrEx>
         <w:trPr>
           <w:cantSplit/>
         </w:trPr>
@@ -2856,7 +2639,7 @@
                 <w:color w:val="1B3A6B"/>
               </w:rPr>
               <w:lastRenderedPageBreak/>
-              <w:t>1.</w:t>
+              <w:t>{%tr if fiduciaries.trustee.successor.full_name or fiduciaries.trustee.co_successor.full_name %}</w:t>
             </w:r>
           </w:p>
         </w:tc>
@@ -2882,26 +2665,12 @@
               <w:keepLines/>
             </w:pPr>
             <w:r>
-              <w:t xml:space="preserve">{{ fiduciaries.trustee.successor.full_name }}{% if fiduciaries.trustee.co_successor is defined and fiduciaries.trustee.co_successor.full_name %} and {{ fiduciaries.trustee.co_successor.full_name }}{% endif %}</w:t>
-            </w:r>
-            <w:proofErr w:type="spellStart"/>
-            <w:proofErr w:type="spellEnd"/>
-            <w:proofErr w:type="spellStart"/>
-            <w:proofErr w:type="spellEnd"/>
-            <w:proofErr w:type="spellStart"/>
-            <w:proofErr w:type="spellEnd"/>
-            <w:proofErr w:type="spellStart"/>
-            <w:proofErr w:type="spellEnd"/>
+              <w:t/>
+            </w:r>
           </w:p>
         </w:tc>
       </w:tr>
       <w:tr>
-        <w:tblPrEx>
-          <w:tblCellMar>
-            <w:top w:w="0" w:type="dxa"/>
-            <w:bottom w:w="0" w:type="dxa"/>
-          </w:tblCellMar>
-        </w:tblPrEx>
         <w:trPr>
           <w:cantSplit/>
         </w:trPr>
@@ -2930,6 +2699,188 @@
               <w:rPr>
                 <w:color w:val="1B3A6B"/>
               </w:rPr>
+              <w:lastRenderedPageBreak/>
+              <w:t>1.</w:t>
+            </w:r>
+          </w:p>
+        </w:tc>
+        <w:tc>
+          <w:tcPr>
+            <w:tcW w:w="8160" w:type="dxa"/>
+            <w:tcBorders>
+              <w:top w:val="single" w:sz="1" w:space="0" w:color="CCCCCC"/>
+              <w:left w:val="single" w:sz="1" w:space="0" w:color="CCCCCC"/>
+              <w:bottom w:val="single" w:sz="1" w:space="0" w:color="CCCCCC"/>
+              <w:right w:val="single" w:sz="1" w:space="0" w:color="CCCCCC"/>
+            </w:tcBorders>
+            <w:tcMar>
+              <w:top w:w="60" w:type="dxa"/>
+              <w:left w:w="100" w:type="dxa"/>
+              <w:bottom w:w="60" w:type="dxa"/>
+              <w:right w:w="100" w:type="dxa"/>
+            </w:tcMar>
+          </w:tcPr>
+          <w:p>
+            <w:pPr>
+              <w:keepNext/>
+              <w:keepLines/>
+            </w:pPr>
+            <w:r>
+              <w:t>{{ fiduciaries.trustee.successor.full_name }}{% if fiduciaries.trustee.co_successor is defined and fiduciaries.trustee.co_successor.full_name %} and {{ fiduciaries.trustee.co_successor.full_name }}{% endif %}</w:t>
+            </w:r>
+          </w:p>
+        </w:tc>
+      </w:tr>
+      <w:tr>
+        <w:trPr>
+          <w:cantSplit/>
+        </w:trPr>
+        <w:tc>
+          <w:tcPr>
+            <w:tcW w:w="1200" w:type="dxa"/>
+            <w:tcBorders>
+              <w:top w:val="single" w:sz="1" w:space="0" w:color="CCCCCC"/>
+              <w:left w:val="single" w:sz="1" w:space="0" w:color="CCCCCC"/>
+              <w:bottom w:val="single" w:sz="1" w:space="0" w:color="CCCCCC"/>
+              <w:right w:val="single" w:sz="1" w:space="0" w:color="CCCCCC"/>
+            </w:tcBorders>
+            <w:tcMar>
+              <w:top w:w="60" w:type="dxa"/>
+              <w:left w:w="100" w:type="dxa"/>
+              <w:bottom w:w="60" w:type="dxa"/>
+              <w:right w:w="100" w:type="dxa"/>
+            </w:tcMar>
+          </w:tcPr>
+          <w:p>
+            <w:pPr>
+              <w:keepNext/>
+              <w:keepLines/>
+            </w:pPr>
+            <w:r>
+              <w:rPr>
+                <w:color w:val="1B3A6B"/>
+              </w:rPr>
+              <w:lastRenderedPageBreak/>
+              <w:t>{%tr endif %}</w:t>
+            </w:r>
+          </w:p>
+        </w:tc>
+        <w:tc>
+          <w:tcPr>
+            <w:tcW w:w="8160" w:type="dxa"/>
+            <w:tcBorders>
+              <w:top w:val="single" w:sz="1" w:space="0" w:color="CCCCCC"/>
+              <w:left w:val="single" w:sz="1" w:space="0" w:color="CCCCCC"/>
+              <w:bottom w:val="single" w:sz="1" w:space="0" w:color="CCCCCC"/>
+              <w:right w:val="single" w:sz="1" w:space="0" w:color="CCCCCC"/>
+            </w:tcBorders>
+            <w:tcMar>
+              <w:top w:w="60" w:type="dxa"/>
+              <w:left w:w="100" w:type="dxa"/>
+              <w:bottom w:w="60" w:type="dxa"/>
+              <w:right w:w="100" w:type="dxa"/>
+            </w:tcMar>
+          </w:tcPr>
+          <w:p>
+            <w:pPr>
+              <w:keepNext/>
+              <w:keepLines/>
+            </w:pPr>
+            <w:r>
+              <w:t/>
+            </w:r>
+          </w:p>
+        </w:tc>
+      </w:tr>
+      <w:tr>
+        <w:trPr>
+          <w:cantSplit/>
+        </w:trPr>
+        <w:tc>
+          <w:tcPr>
+            <w:tcW w:w="1200" w:type="dxa"/>
+            <w:tcBorders>
+              <w:top w:val="single" w:sz="1" w:space="0" w:color="CCCCCC"/>
+              <w:left w:val="single" w:sz="1" w:space="0" w:color="CCCCCC"/>
+              <w:bottom w:val="single" w:sz="1" w:space="0" w:color="CCCCCC"/>
+              <w:right w:val="single" w:sz="1" w:space="0" w:color="CCCCCC"/>
+            </w:tcBorders>
+            <w:tcMar>
+              <w:top w:w="60" w:type="dxa"/>
+              <w:left w:w="100" w:type="dxa"/>
+              <w:bottom w:w="60" w:type="dxa"/>
+              <w:right w:w="100" w:type="dxa"/>
+            </w:tcMar>
+          </w:tcPr>
+          <w:p>
+            <w:pPr>
+              <w:keepNext/>
+              <w:keepLines/>
+            </w:pPr>
+            <w:r>
+              <w:rPr>
+                <w:color w:val="1B3A6B"/>
+              </w:rPr>
+              <w:t>{%tr if fiduciaries.trustee.second_successor.full_name or fiduciaries.trustee.co_second_successor.full_name %}</w:t>
+            </w:r>
+          </w:p>
+        </w:tc>
+        <w:tc>
+          <w:tcPr>
+            <w:tcW w:w="8160" w:type="dxa"/>
+            <w:tcBorders>
+              <w:top w:val="single" w:sz="1" w:space="0" w:color="CCCCCC"/>
+              <w:left w:val="single" w:sz="1" w:space="0" w:color="CCCCCC"/>
+              <w:bottom w:val="single" w:sz="1" w:space="0" w:color="CCCCCC"/>
+              <w:right w:val="single" w:sz="1" w:space="0" w:color="CCCCCC"/>
+            </w:tcBorders>
+            <w:tcMar>
+              <w:top w:w="60" w:type="dxa"/>
+              <w:left w:w="100" w:type="dxa"/>
+              <w:bottom w:w="60" w:type="dxa"/>
+              <w:right w:w="100" w:type="dxa"/>
+            </w:tcMar>
+          </w:tcPr>
+          <w:p>
+            <w:pPr>
+              <w:keepNext/>
+              <w:keepLines/>
+            </w:pPr>
+            <w:r>
+              <w:t/>
+            </w:r>
+          </w:p>
+        </w:tc>
+      </w:tr>
+      <w:tr>
+        <w:trPr>
+          <w:cantSplit/>
+        </w:trPr>
+        <w:tc>
+          <w:tcPr>
+            <w:tcW w:w="1200" w:type="dxa"/>
+            <w:tcBorders>
+              <w:top w:val="single" w:sz="1" w:space="0" w:color="CCCCCC"/>
+              <w:left w:val="single" w:sz="1" w:space="0" w:color="CCCCCC"/>
+              <w:bottom w:val="single" w:sz="1" w:space="0" w:color="CCCCCC"/>
+              <w:right w:val="single" w:sz="1" w:space="0" w:color="CCCCCC"/>
+            </w:tcBorders>
+            <w:tcMar>
+              <w:top w:w="60" w:type="dxa"/>
+              <w:left w:w="100" w:type="dxa"/>
+              <w:bottom w:w="60" w:type="dxa"/>
+              <w:right w:w="100" w:type="dxa"/>
+            </w:tcMar>
+          </w:tcPr>
+          <w:p>
+            <w:pPr>
+              <w:keepNext/>
+              <w:keepLines/>
+            </w:pPr>
+            <w:r>
+              <w:rPr>
+                <w:color w:val="1B3A6B"/>
+              </w:rPr>
               <w:t>2.</w:t>
             </w:r>
           </w:p>
@@ -2956,16 +2907,68 @@
               <w:keepLines/>
             </w:pPr>
             <w:r>
-              <w:t xml:space="preserve">{{ fiduciaries.trustee.second_successor.full_name }}{% if fiduciaries.trustee.co_second_successor is defined and fiduciaries.trustee.co_second_successor.full_name %} and {{ fiduciaries.trustee.co_second_successor.full_name }}{% endif %}</w:t>
-            </w:r>
-            <w:proofErr w:type="spellStart"/>
-            <w:proofErr w:type="spellEnd"/>
-            <w:proofErr w:type="spellStart"/>
-            <w:proofErr w:type="spellEnd"/>
-            <w:proofErr w:type="spellStart"/>
-            <w:proofErr w:type="spellEnd"/>
-            <w:proofErr w:type="spellStart"/>
-            <w:proofErr w:type="spellEnd"/>
+              <w:t>{{ fiduciaries.trustee.second_successor.full_name }}{% if fiduciaries.trustee.co_second_successor is defined and fiduciaries.trustee.co_second_successor.full_name %} and {{ fiduciaries.trustee.co_second_successor.full_name }}{% endif %}</w:t>
+            </w:r>
+          </w:p>
+        </w:tc>
+      </w:tr>
+      <w:tr>
+        <w:trPr>
+          <w:cantSplit/>
+        </w:trPr>
+        <w:tc>
+          <w:tcPr>
+            <w:tcW w:w="1200" w:type="dxa"/>
+            <w:tcBorders>
+              <w:top w:val="single" w:sz="1" w:space="0" w:color="CCCCCC"/>
+              <w:left w:val="single" w:sz="1" w:space="0" w:color="CCCCCC"/>
+              <w:bottom w:val="single" w:sz="1" w:space="0" w:color="CCCCCC"/>
+              <w:right w:val="single" w:sz="1" w:space="0" w:color="CCCCCC"/>
+            </w:tcBorders>
+            <w:tcMar>
+              <w:top w:w="60" w:type="dxa"/>
+              <w:left w:w="100" w:type="dxa"/>
+              <w:bottom w:w="60" w:type="dxa"/>
+              <w:right w:w="100" w:type="dxa"/>
+            </w:tcMar>
+          </w:tcPr>
+          <w:p>
+            <w:pPr>
+              <w:keepNext/>
+              <w:keepLines/>
+            </w:pPr>
+            <w:r>
+              <w:rPr>
+                <w:color w:val="1B3A6B"/>
+              </w:rPr>
+              <w:t>{%tr endif %}</w:t>
+            </w:r>
+          </w:p>
+        </w:tc>
+        <w:tc>
+          <w:tcPr>
+            <w:tcW w:w="8160" w:type="dxa"/>
+            <w:tcBorders>
+              <w:top w:val="single" w:sz="1" w:space="0" w:color="CCCCCC"/>
+              <w:left w:val="single" w:sz="1" w:space="0" w:color="CCCCCC"/>
+              <w:bottom w:val="single" w:sz="1" w:space="0" w:color="CCCCCC"/>
+              <w:right w:val="single" w:sz="1" w:space="0" w:color="CCCCCC"/>
+            </w:tcBorders>
+            <w:tcMar>
+              <w:top w:w="60" w:type="dxa"/>
+              <w:left w:w="100" w:type="dxa"/>
+              <w:bottom w:w="60" w:type="dxa"/>
+              <w:right w:w="100" w:type="dxa"/>
+            </w:tcMar>
+          </w:tcPr>
+          <w:p>
+            <w:pPr>
+              <w:keepNext/>
+              <w:keepLines/>
+            </w:pPr>
+            <w:r>
+              <w:t/>
+            </w:r>
           </w:p>
         </w:tc>
       </w:tr>
@@ -2975,12 +2978,8 @@
         <w:rPr>
           <w:color w:val="999999"/>
         </w:rPr>
-        <w:t xml:space="preserve">{% if fiduciaries.trustee.co_primary is defined and fiduciaries.trustee.co_primary.full_name %}</w:t>
-      </w:r>
-      <w:proofErr w:type="spellStart"/>
-      <w:proofErr w:type="spellEnd"/>
-      <w:proofErr w:type="spellStart"/>
-      <w:proofErr w:type="spellEnd"/>
+        <w:t>{% if fiduciaries.trustee.co_primary is defined and fiduciaries.trustee.co_primary.full_name %}</w:t>
+      </w:r>
     </w:p>
     <w:p>
       <w:pPr>
@@ -2994,15 +2993,7 @@
         <w:t xml:space="preserve">Co-Trustee Action: </w:t>
       </w:r>
       <w:r>
-        <w:t xml:space="preserve">Co-trustees shall act </w:t>
-      </w:r>
-      <w:r>
-        <w:t xml:space="preserve">{{ fiduciaries.trustee.co_trustees_action }}</w:t>
-      </w:r>
-      <w:proofErr w:type="spellStart"/>
-      <w:proofErr w:type="spellEnd"/>
-      <w:r>
-        <w:t>.</w:t>
+        <w:t>Co-trustees shall act {{ fiduciaries.trustee.co_trustees_action }}.</w:t>
       </w:r>
     </w:p>
     <w:p>
@@ -3099,20 +3090,16 @@
         <w:spacing w:before="120" w:after="120"/>
       </w:pPr>
       <w:r>
-        <w:t xml:space="preserve">A spendthrift provision protects each beneficiary's share while it remains in the trust. A beneficiary cannot pledge, sell, or give away their interest before it is distributed, and creditors generally cannot reach trust assets to satisfy a beneficiary's debts. This helps keep what you leave behind available for its intended purpose.</w:t>
-      </w:r>
-      <w:proofErr w:type="spellStart"/>
-      <w:proofErr w:type="spellEnd"/>
+        <w:t>A spendthrift provision protects each beneficiary's share while it remains in the trust. A beneficiary cannot pledge, sell, or give away their interest before it is distributed, and creditors generally cannot reach trust assets to satisfy a beneficiary's debts. This helps keep what you leave behind available for its intended purpose.</w:t>
+      </w:r>
     </w:p>
     <w:p>
       <w:r>
         <w:rPr>
           <w:color w:val="999999"/>
         </w:rPr>
-        <w:t xml:space="preserve">{% if has_tangible_personal_property %}</w:t>
-      </w:r>
-      <w:proofErr w:type="spellStart"/>
-      <w:proofErr w:type="spellEnd"/>
+        <w:t>{% if has_tangible_personal_property %}</w:t>
+      </w:r>
     </w:p>
     <w:p>
       <w:pPr>
@@ -3178,12 +3165,6 @@
         <w:gridCol w:w="6887"/>
       </w:tblGrid>
       <w:tr>
-        <w:tblPrEx>
-          <w:tblCellMar>
-            <w:top w:w="0" w:type="dxa"/>
-            <w:bottom w:w="0" w:type="dxa"/>
-          </w:tblCellMar>
-        </w:tblPrEx>
         <w:trPr>
           <w:cantSplit/>
         </w:trPr>
@@ -3241,10 +3222,8 @@
               <w:keepLines/>
             </w:pPr>
             <w:r>
-              <w:t xml:space="preserve">{{ trust.tangible_personal_property.distribution_method }}</w:t>
-            </w:r>
-            <w:proofErr w:type="spellStart"/>
-            <w:proofErr w:type="spellEnd"/>
+              <w:t>{{ trust.tangible_personal_property.distribution_method }}</w:t>
+            </w:r>
           </w:p>
         </w:tc>
       </w:tr>
@@ -3292,20 +3271,16 @@
         <w:rPr>
           <w:color w:val="999999"/>
         </w:rPr>
-        <w:t xml:space="preserve">{% if has_specific_gifts %}</w:t>
-      </w:r>
-      <w:proofErr w:type="spellStart"/>
-      <w:proofErr w:type="spellEnd"/>
+        <w:t>{% if has_specific_gifts %}</w:t>
+      </w:r>
     </w:p>
     <w:p>
       <w:r>
         <w:rPr>
           <w:color w:val="999999"/>
         </w:rPr>
-        <w:t xml:space="preserve">{% for gift in specific_gifts %}</w:t>
-      </w:r>
-      <w:proofErr w:type="spellStart"/>
-      <w:proofErr w:type="spellEnd"/>
+        <w:t>{% for gift in specific_gifts %}</w:t>
+      </w:r>
     </w:p>
     <w:tbl>
       <w:tblPr>
@@ -3329,12 +3304,6 @@
         <w:gridCol w:w="6560"/>
       </w:tblGrid>
       <w:tr>
-        <w:tblPrEx>
-          <w:tblCellMar>
-            <w:top w:w="0" w:type="dxa"/>
-            <w:bottom w:w="0" w:type="dxa"/>
-          </w:tblCellMar>
-        </w:tblPrEx>
         <w:trPr>
           <w:cantSplit/>
         </w:trPr>
@@ -3374,12 +3343,6 @@
         </w:tc>
       </w:tr>
       <w:tr>
-        <w:tblPrEx>
-          <w:tblCellMar>
-            <w:top w:w="0" w:type="dxa"/>
-            <w:bottom w:w="0" w:type="dxa"/>
-          </w:tblCellMar>
-        </w:tblPrEx>
         <w:trPr>
           <w:cantSplit/>
         </w:trPr>
@@ -3437,20 +3400,12 @@
               <w:keepLines/>
             </w:pPr>
             <w:r>
-              <w:t xml:space="preserve">{{ gift.beneficiary_name }}</w:t>
-            </w:r>
-            <w:proofErr w:type="spellStart"/>
-            <w:proofErr w:type="spellEnd"/>
+              <w:t>{{ gift.beneficiary_name }}</w:t>
+            </w:r>
           </w:p>
         </w:tc>
       </w:tr>
       <w:tr>
-        <w:tblPrEx>
-          <w:tblCellMar>
-            <w:top w:w="0" w:type="dxa"/>
-            <w:bottom w:w="0" w:type="dxa"/>
-          </w:tblCellMar>
-        </w:tblPrEx>
         <w:trPr>
           <w:cantSplit/>
         </w:trPr>
@@ -3508,20 +3463,12 @@
               <w:keepLines/>
             </w:pPr>
             <w:r>
-              <w:t xml:space="preserve">{{ gift.trigger }}</w:t>
-            </w:r>
-            <w:proofErr w:type="spellStart"/>
-            <w:proofErr w:type="spellEnd"/>
+              <w:t>{{ gift.trigger }}</w:t>
+            </w:r>
           </w:p>
         </w:tc>
       </w:tr>
       <w:tr>
-        <w:tblPrEx>
-          <w:tblCellMar>
-            <w:top w:w="0" w:type="dxa"/>
-            <w:bottom w:w="0" w:type="dxa"/>
-          </w:tblCellMar>
-        </w:tblPrEx>
         <w:trPr>
           <w:cantSplit/>
         </w:trPr>
@@ -3579,20 +3526,12 @@
               <w:keepLines/>
             </w:pPr>
             <w:r>
-              <w:t xml:space="preserve">{{ gift.description }}</w:t>
-            </w:r>
-            <w:proofErr w:type="spellStart"/>
-            <w:proofErr w:type="spellEnd"/>
+              <w:t>{{ gift.description }}</w:t>
+            </w:r>
           </w:p>
         </w:tc>
       </w:tr>
       <w:tr>
-        <w:tblPrEx>
-          <w:tblCellMar>
-            <w:top w:w="0" w:type="dxa"/>
-            <w:bottom w:w="0" w:type="dxa"/>
-          </w:tblCellMar>
-        </w:tblPrEx>
         <w:trPr>
           <w:cantSplit/>
         </w:trPr>
@@ -3650,10 +3589,8 @@
               <w:keepLines/>
             </w:pPr>
             <w:r>
-              <w:t xml:space="preserve">{{ gift.notes }}</w:t>
-            </w:r>
-            <w:proofErr w:type="spellStart"/>
-            <w:proofErr w:type="spellEnd"/>
+              <w:t>{{ gift.notes }}</w:t>
+            </w:r>
           </w:p>
         </w:tc>
       </w:tr>
@@ -3663,10 +3600,8 @@
         <w:rPr>
           <w:color w:val="999999"/>
         </w:rPr>
-        <w:t xml:space="preserve">{% endfor %}</w:t>
-      </w:r>
-      <w:proofErr w:type="spellStart"/>
-      <w:proofErr w:type="spellEnd"/>
+        <w:t>{% endfor %}</w:t>
+      </w:r>
     </w:p>
     <w:p>
       <w:r>
@@ -3690,15 +3625,7 @@
           <w:bCs/>
           <w:color w:val="1B3A6B"/>
         </w:rPr>
-        <w:t>⚑</w:t>
-      </w:r>
-      <w:r>
-        <w:rPr>
-          <w:b/>
-          <w:bCs/>
-          <w:color w:val="1B3A6B"/>
-        </w:rPr>
-        <w:t xml:space="preserve"> Decision Needed: </w:t>
+        <w:t xml:space="preserve">⚑ Decision Needed: </w:t>
       </w:r>
       <w:r>
         <w:t>No specific gifts are currently planned. If you would like to make specific gifts of cash, real estate, or other property, please let us know.</w:t>
@@ -3717,10 +3644,8 @@
         <w:rPr>
           <w:color w:val="999999"/>
         </w:rPr>
-        <w:t xml:space="preserve">{% if has_charitable_gifts %}</w:t>
-      </w:r>
-      <w:proofErr w:type="spellStart"/>
-      <w:proofErr w:type="spellEnd"/>
+        <w:t>{% if has_charitable_gifts %}</w:t>
+      </w:r>
     </w:p>
     <w:p>
       <w:pPr>
@@ -3765,10 +3690,8 @@
         <w:rPr>
           <w:color w:val="999999"/>
         </w:rPr>
-        <w:t xml:space="preserve">{% if has_pet_care %}</w:t>
-      </w:r>
-      <w:proofErr w:type="spellStart"/>
-      <w:proofErr w:type="spellEnd"/>
+        <w:t>{% if has_pet_care %}</w:t>
+      </w:r>
     </w:p>
     <w:p>
       <w:pPr>
@@ -3805,10 +3728,8 @@
         <w:rPr>
           <w:color w:val="999999"/>
         </w:rPr>
-        <w:t xml:space="preserve">{% if has_minor_children %}</w:t>
-      </w:r>
-      <w:proofErr w:type="spellStart"/>
-      <w:proofErr w:type="spellEnd"/>
+        <w:t>{% if has_minor_children %}</w:t>
+      </w:r>
     </w:p>
     <w:p>
       <w:pPr>
@@ -3867,10 +3788,8 @@
         <w:rPr>
           <w:color w:val="999999"/>
         </w:rPr>
-        <w:t xml:space="preserve">{% if trust.descendants_distribution.method == 'outright' %}</w:t>
-      </w:r>
-      <w:proofErr w:type="spellStart"/>
-      <w:proofErr w:type="spellEnd"/>
+        <w:t>{% if trust.descendants_distribution.method == 'outright' %}</w:t>
+      </w:r>
     </w:p>
     <w:p>
       <w:pPr>
@@ -3900,10 +3819,8 @@
         <w:rPr>
           <w:color w:val="999999"/>
         </w:rPr>
-        <w:t xml:space="preserve">{% if trust.descendants_distribution.method == 'staged' %}</w:t>
-      </w:r>
-      <w:proofErr w:type="spellStart"/>
-      <w:proofErr w:type="spellEnd"/>
+        <w:t>{% if trust.descendants_distribution.method == 'staged' %}</w:t>
+      </w:r>
     </w:p>
     <w:p>
       <w:pPr>
@@ -3943,12 +3860,6 @@
         <w:gridCol w:w="6560"/>
       </w:tblGrid>
       <w:tr>
-        <w:tblPrEx>
-          <w:tblCellMar>
-            <w:top w:w="0" w:type="dxa"/>
-            <w:bottom w:w="0" w:type="dxa"/>
-          </w:tblCellMar>
-        </w:tblPrEx>
         <w:trPr>
           <w:cantSplit/>
         </w:trPr>
@@ -3987,12 +3898,6 @@
         </w:tc>
       </w:tr>
       <w:tr>
-        <w:tblPrEx>
-          <w:tblCellMar>
-            <w:top w:w="0" w:type="dxa"/>
-            <w:bottom w:w="0" w:type="dxa"/>
-          </w:tblCellMar>
-        </w:tblPrEx>
         <w:trPr>
           <w:cantSplit/>
         </w:trPr>
@@ -4056,12 +3961,6 @@
         </w:tc>
       </w:tr>
       <w:tr>
-        <w:tblPrEx>
-          <w:tblCellMar>
-            <w:top w:w="0" w:type="dxa"/>
-            <w:bottom w:w="0" w:type="dxa"/>
-          </w:tblCellMar>
-        </w:tblPrEx>
         <w:trPr>
           <w:cantSplit/>
         </w:trPr>
@@ -4125,12 +4024,6 @@
         </w:tc>
       </w:tr>
       <w:tr>
-        <w:tblPrEx>
-          <w:tblCellMar>
-            <w:top w:w="0" w:type="dxa"/>
-            <w:bottom w:w="0" w:type="dxa"/>
-          </w:tblCellMar>
-        </w:tblPrEx>
         <w:trPr>
           <w:cantSplit/>
         </w:trPr>
@@ -4224,12 +4117,6 @@
         <w:gridCol w:w="6806"/>
       </w:tblGrid>
       <w:tr>
-        <w:tblPrEx>
-          <w:tblCellMar>
-            <w:top w:w="0" w:type="dxa"/>
-            <w:bottom w:w="0" w:type="dxa"/>
-          </w:tblCellMar>
-        </w:tblPrEx>
         <w:trPr>
           <w:cantSplit/>
         </w:trPr>
@@ -4287,10 +4174,8 @@
               <w:keepLines/>
             </w:pPr>
             <w:r>
-              <w:t xml:space="preserve">{{ trust.contingent_beneficiary.full_name }}</w:t>
-            </w:r>
-            <w:proofErr w:type="spellStart"/>
-            <w:proofErr w:type="spellEnd"/>
+              <w:t>{{ trust.contingent_beneficiary.full_name }}</w:t>
+            </w:r>
           </w:p>
         </w:tc>
       </w:tr>
@@ -4346,12 +4231,6 @@
         <w:gridCol w:w="9360"/>
       </w:tblGrid>
       <w:tr>
-        <w:tblPrEx>
-          <w:tblCellMar>
-            <w:top w:w="0" w:type="dxa"/>
-            <w:bottom w:w="0" w:type="dxa"/>
-          </w:tblCellMar>
-        </w:tblPrEx>
         <w:trPr>
           <w:cantSplit/>
         </w:trPr>
@@ -4389,12 +4268,6 @@
         </w:tc>
       </w:tr>
       <w:tr>
-        <w:tblPrEx>
-          <w:tblCellMar>
-            <w:top w:w="0" w:type="dxa"/>
-            <w:bottom w:w="0" w:type="dxa"/>
-          </w:tblCellMar>
-        </w:tblPrEx>
         <w:trPr>
           <w:cantSplit/>
         </w:trPr>
@@ -4463,10 +4336,8 @@
               <w:rPr>
                 <w:color w:val="999999"/>
               </w:rPr>
-              <w:t xml:space="preserve">{% if trust.remote_beneficiaries.individuals %}</w:t>
-            </w:r>
-            <w:proofErr w:type="spellStart"/>
-            <w:proofErr w:type="spellEnd"/>
+              <w:t>{% if trust.remote_beneficiaries.individuals %}</w:t>
+            </w:r>
           </w:p>
           <w:p>
             <w:pPr>
@@ -4481,10 +4352,8 @@
               <w:t xml:space="preserve">Individuals: </w:t>
             </w:r>
             <w:r>
-              <w:t xml:space="preserve">{{ trust.remote_beneficiaries.individuals }}</w:t>
-            </w:r>
-            <w:proofErr w:type="spellStart"/>
-            <w:proofErr w:type="spellEnd"/>
+              <w:t>{{ trust.remote_beneficiaries.individuals }}</w:t>
+            </w:r>
           </w:p>
           <w:p>
             <w:pPr>
@@ -4506,10 +4375,8 @@
         <w:rPr>
           <w:color w:val="999999"/>
         </w:rPr>
-        <w:t xml:space="preserve">{% if trust.disinherited %}</w:t>
-      </w:r>
-      <w:proofErr w:type="spellStart"/>
-      <w:proofErr w:type="spellEnd"/>
+        <w:t>{% if trust.disinherited %}</w:t>
+      </w:r>
     </w:p>
     <w:p>
       <w:pPr>
@@ -4530,13 +4397,8 @@
         <w:spacing w:before="120" w:after="120"/>
       </w:pPr>
       <w:r>
-        <w:t xml:space="preserve">The following individuals are expressly excluded from inheriting under this trust: </w:t>
-      </w:r>
-      <w:r>
-        <w:t xml:space="preserve">{{ trust.disinherited }}</w:t>
-      </w:r>
-      <w:proofErr w:type="spellStart"/>
-      <w:proofErr w:type="spellEnd"/>
+        <w:t>The following individuals are expressly excluded from inheriting under this trust: {{ trust.disinherited }}</w:t>
+      </w:r>
     </w:p>
     <w:p>
       <w:r>
@@ -4551,10 +4413,8 @@
         <w:rPr>
           <w:color w:val="999999"/>
         </w:rPr>
-        <w:t xml:space="preserve">{% if has_simultaneous_death %}</w:t>
-      </w:r>
-      <w:proofErr w:type="spellStart"/>
-      <w:proofErr w:type="spellEnd"/>
+        <w:t>{% if has_simultaneous_death %}</w:t>
+      </w:r>
     </w:p>
     <w:p>
       <w:pPr>
@@ -4591,10 +4451,8 @@
         <w:rPr>
           <w:color w:val="999999"/>
         </w:rPr>
-        <w:t xml:space="preserve">{% if has_blended_family %}</w:t>
-      </w:r>
-      <w:proofErr w:type="spellStart"/>
-      <w:proofErr w:type="spellEnd"/>
+        <w:t>{% if has_blended_family %}</w:t>
+      </w:r>
     </w:p>
     <w:p>
       <w:pPr>
@@ -4624,28 +4482,16 @@
         <w:rPr>
           <w:color w:val="999999"/>
         </w:rPr>
-        <w:t xml:space="preserve">{% if trust.blended_family.client_children %}</w:t>
-      </w:r>
-      <w:proofErr w:type="spellStart"/>
-      <w:proofErr w:type="spellEnd"/>
+        <w:t>{% if trust.blended_family.client_children %}</w:t>
+      </w:r>
     </w:p>
     <w:p>
       <w:pPr>
         <w:spacing w:before="120" w:after="120"/>
       </w:pPr>
       <w:r>
-        <w:t xml:space="preserve">{{ client.full_name }}</w:t>
-      </w:r>
-      <w:proofErr w:type="spellStart"/>
-      <w:proofErr w:type="spellEnd"/>
-      <w:r>
-        <w:t xml:space="preserve">'s children from a prior relationship: </w:t>
-      </w:r>
-      <w:r>
-        <w:t xml:space="preserve">{{ trust.blended_family.client_children }}</w:t>
-      </w:r>
-      <w:proofErr w:type="spellStart"/>
-      <w:proofErr w:type="spellEnd"/>
+        <w:t>{{ client.full_name }}'s children from a prior relationship: {{ trust.blended_family.client_children }}</w:t>
+      </w:r>
     </w:p>
     <w:p>
       <w:r>
@@ -4660,28 +4506,16 @@
         <w:rPr>
           <w:color w:val="999999"/>
         </w:rPr>
-        <w:t xml:space="preserve">{% if trust.blended_family.spouse_children %}</w:t>
-      </w:r>
-      <w:proofErr w:type="spellStart"/>
-      <w:proofErr w:type="spellEnd"/>
+        <w:t>{% if trust.blended_family.spouse_children %}</w:t>
+      </w:r>
     </w:p>
     <w:p>
       <w:pPr>
         <w:spacing w:before="120" w:after="120"/>
       </w:pPr>
       <w:r>
-        <w:t xml:space="preserve">{{ spouse.full_name }}</w:t>
-      </w:r>
-      <w:proofErr w:type="spellStart"/>
-      <w:proofErr w:type="spellEnd"/>
-      <w:r>
-        <w:t xml:space="preserve">'s children from a prior relationship: </w:t>
-      </w:r>
-      <w:r>
-        <w:t xml:space="preserve">{{ trust.blended_family.spouse_children }}</w:t>
-      </w:r>
-      <w:proofErr w:type="spellStart"/>
-      <w:proofErr w:type="spellEnd"/>
+        <w:t>{{ spouse.full_name }}'s children from a prior relationship: {{ trust.blended_family.spouse_children }}</w:t>
+      </w:r>
     </w:p>
     <w:p>
       <w:r>
@@ -4712,14 +4546,8 @@
         <w:rPr>
           <w:color w:val="999999"/>
         </w:rPr>
-        <w:t xml:space="preserve">{% if planning.include_pour_over_will or planning.include_simple_will or planning.include_testamentary_trust_will %}</w:t>
-      </w:r>
-      <w:proofErr w:type="spellStart"/>
-      <w:proofErr w:type="spellEnd"/>
-      <w:proofErr w:type="spellStart"/>
-      <w:proofErr w:type="spellEnd"/>
-      <w:proofErr w:type="spellStart"/>
-      <w:proofErr w:type="spellEnd"/>
+        <w:t>{% if planning.include_pour_over_will or planning.include_simple_will or planning.include_testamentary_trust_will %}</w:t>
+      </w:r>
     </w:p>
     <w:p>
       <w:r>
@@ -4751,10 +4579,8 @@
         <w:rPr>
           <w:color w:val="999999"/>
         </w:rPr>
-        <w:t xml:space="preserve">{% if planning.include_pour_over_will %}</w:t>
-      </w:r>
-      <w:proofErr w:type="spellStart"/>
-      <w:proofErr w:type="spellEnd"/>
+        <w:t>{% if planning.include_pour_over_will %}</w:t>
+      </w:r>
     </w:p>
     <w:p>
       <w:pPr>
@@ -4769,15 +4595,7 @@
         <w:spacing w:before="120" w:after="120"/>
       </w:pPr>
       <w:r>
-        <w:t xml:space="preserve">Personal items not directed by your Personal Property Memorandum will pass to </w:t>
-      </w:r>
-      <w:r>
-        <w:t xml:space="preserve">{{ trust.tangible_personal_property.distribution_method }}</w:t>
-      </w:r>
-      <w:proofErr w:type="spellStart"/>
-      <w:proofErr w:type="spellEnd"/>
-      <w:r>
-        <w:t>. All remaining individual property passes to your revocable trust.</w:t>
+        <w:t>Personal items not directed by your Personal Property Memorandum will pass to {{ trust.tangible_personal_property.distribution_method }}. All remaining individual property passes to your revocable trust.</w:t>
       </w:r>
     </w:p>
     <w:p>
@@ -4793,10 +4611,8 @@
         <w:rPr>
           <w:color w:val="999999"/>
         </w:rPr>
-        <w:t xml:space="preserve">{% if planning.include_simple_will %}</w:t>
-      </w:r>
-      <w:proofErr w:type="spellStart"/>
-      <w:proofErr w:type="spellEnd"/>
+        <w:t>{% if planning.include_simple_will %}</w:t>
+      </w:r>
     </w:p>
     <w:p>
       <w:pPr>
@@ -4835,10 +4651,8 @@
         <w:rPr>
           <w:color w:val="999999"/>
         </w:rPr>
-        <w:t xml:space="preserve">{% if planning.include_testamentary_trust_will %}</w:t>
-      </w:r>
-      <w:proofErr w:type="spellStart"/>
-      <w:proofErr w:type="spellEnd"/>
+        <w:t>{% if planning.include_testamentary_trust_will %}</w:t>
+      </w:r>
     </w:p>
     <w:p>
       <w:pPr>
@@ -4906,10 +4720,8 @@
         <w:rPr>
           <w:color w:val="999999"/>
         </w:rPr>
-        <w:t xml:space="preserve">{% if has_spouse %}</w:t>
-      </w:r>
-      <w:proofErr w:type="spellStart"/>
-      <w:proofErr w:type="spellEnd"/>
+        <w:t>{% if has_spouse %}</w:t>
+      </w:r>
     </w:p>
     <w:p>
       <w:pPr>
@@ -4966,12 +4778,6 @@
         <w:gridCol w:w="4688"/>
       </w:tblGrid>
       <w:tr>
-        <w:tblPrEx>
-          <w:tblCellMar>
-            <w:top w:w="0" w:type="dxa"/>
-            <w:bottom w:w="0" w:type="dxa"/>
-          </w:tblCellMar>
-        </w:tblPrEx>
         <w:trPr>
           <w:cantSplit/>
         </w:trPr>
@@ -5028,10 +4834,8 @@
                 <w:bCs/>
                 <w:color w:val="FFFFFF"/>
               </w:rPr>
-              <w:t xml:space="preserve">{{ client.full_name }}</w:t>
-            </w:r>
-            <w:proofErr w:type="spellStart"/>
-            <w:proofErr w:type="spellEnd"/>
+              <w:t>{{ client.full_name }}</w:t>
+            </w:r>
           </w:p>
         </w:tc>
         <w:tc>
@@ -5063,22 +4867,12 @@
                 <w:bCs/>
                 <w:color w:val="FFFFFF"/>
               </w:rPr>
-              <w:t xml:space="preserve">{% if has_spouse %}{{ spouse.full_name }}{% endif %}</w:t>
-            </w:r>
-            <w:proofErr w:type="spellStart"/>
-            <w:proofErr w:type="spellEnd"/>
-            <w:proofErr w:type="spellStart"/>
-            <w:proofErr w:type="spellEnd"/>
+              <w:t>{% if has_spouse %}{{ spouse.full_name }}{% endif %}</w:t>
+            </w:r>
           </w:p>
         </w:tc>
       </w:tr>
       <w:tr>
-        <w:tblPrEx>
-          <w:tblCellMar>
-            <w:top w:w="0" w:type="dxa"/>
-            <w:bottom w:w="0" w:type="dxa"/>
-          </w:tblCellMar>
-        </w:tblPrEx>
         <w:trPr>
           <w:cantSplit/>
         </w:trPr>
@@ -5107,7 +4901,7 @@
               <w:rPr>
                 <w:color w:val="1B3A6B"/>
               </w:rPr>
-              <w:t>1.</w:t>
+              <w:t>{%tr if fiduciaries.executor.successor.full_name or fiduciaries.spouse_executor.successor.full_name %}</w:t>
             </w:r>
           </w:p>
         </w:tc>
@@ -5133,10 +4927,8 @@
               <w:keepLines/>
             </w:pPr>
             <w:r>
-              <w:t xml:space="preserve">{{ fiduciaries.executor.successor.full_name }}</w:t>
-            </w:r>
-            <w:proofErr w:type="spellStart"/>
-            <w:proofErr w:type="spellEnd"/>
+              <w:t/>
+            </w:r>
           </w:p>
         </w:tc>
         <w:tc>
@@ -5161,22 +4953,12 @@
               <w:keepLines/>
             </w:pPr>
             <w:r>
-              <w:t xml:space="preserve">{% if has_spouse %}{{ fiduciaries.executor.successor.full_name }}{% endif %}</w:t>
-            </w:r>
-            <w:proofErr w:type="spellStart"/>
-            <w:proofErr w:type="spellEnd"/>
-            <w:proofErr w:type="spellStart"/>
-            <w:proofErr w:type="spellEnd"/>
+              <w:t/>
+            </w:r>
           </w:p>
         </w:tc>
       </w:tr>
       <w:tr>
-        <w:tblPrEx>
-          <w:tblCellMar>
-            <w:top w:w="0" w:type="dxa"/>
-            <w:bottom w:w="0" w:type="dxa"/>
-          </w:tblCellMar>
-        </w:tblPrEx>
         <w:trPr>
           <w:cantSplit/>
         </w:trPr>
@@ -5205,6 +4987,262 @@
               <w:rPr>
                 <w:color w:val="1B3A6B"/>
               </w:rPr>
+              <w:t>1.</w:t>
+            </w:r>
+          </w:p>
+        </w:tc>
+        <w:tc>
+          <w:tcPr>
+            <w:tcW w:w="4080" w:type="dxa"/>
+            <w:tcBorders>
+              <w:top w:val="single" w:sz="1" w:space="0" w:color="CCCCCC"/>
+              <w:left w:val="single" w:sz="1" w:space="0" w:color="CCCCCC"/>
+              <w:bottom w:val="single" w:sz="1" w:space="0" w:color="CCCCCC"/>
+              <w:right w:val="single" w:sz="1" w:space="0" w:color="CCCCCC"/>
+            </w:tcBorders>
+            <w:tcMar>
+              <w:top w:w="60" w:type="dxa"/>
+              <w:left w:w="100" w:type="dxa"/>
+              <w:bottom w:w="60" w:type="dxa"/>
+              <w:right w:w="100" w:type="dxa"/>
+            </w:tcMar>
+          </w:tcPr>
+          <w:p>
+            <w:pPr>
+              <w:keepNext/>
+              <w:keepLines/>
+            </w:pPr>
+            <w:r>
+              <w:t>{{ fiduciaries.executor.successor.full_name }}</w:t>
+            </w:r>
+          </w:p>
+        </w:tc>
+        <w:tc>
+          <w:tcPr>
+            <w:tcW w:w="4080" w:type="dxa"/>
+            <w:tcBorders>
+              <w:top w:val="single" w:sz="1" w:space="0" w:color="CCCCCC"/>
+              <w:left w:val="single" w:sz="1" w:space="0" w:color="CCCCCC"/>
+              <w:bottom w:val="single" w:sz="1" w:space="0" w:color="CCCCCC"/>
+              <w:right w:val="single" w:sz="1" w:space="0" w:color="CCCCCC"/>
+            </w:tcBorders>
+            <w:tcMar>
+              <w:top w:w="60" w:type="dxa"/>
+              <w:left w:w="100" w:type="dxa"/>
+              <w:bottom w:w="60" w:type="dxa"/>
+              <w:right w:w="100" w:type="dxa"/>
+            </w:tcMar>
+          </w:tcPr>
+          <w:p>
+            <w:pPr>
+              <w:keepNext/>
+              <w:keepLines/>
+            </w:pPr>
+            <w:r>
+              <w:t>{% if has_spouse and fiduciaries.spouse_executor.successor.full_name %}{{ fiduciaries.spouse_executor.successor.full_name }}{% endif %}</w:t>
+            </w:r>
+          </w:p>
+        </w:tc>
+      </w:tr>
+      <w:tr>
+        <w:trPr>
+          <w:cantSplit/>
+        </w:trPr>
+        <w:tc>
+          <w:tcPr>
+            <w:tcW w:w="1200" w:type="dxa"/>
+            <w:tcBorders>
+              <w:top w:val="single" w:sz="1" w:space="0" w:color="CCCCCC"/>
+              <w:left w:val="single" w:sz="1" w:space="0" w:color="CCCCCC"/>
+              <w:bottom w:val="single" w:sz="1" w:space="0" w:color="CCCCCC"/>
+              <w:right w:val="single" w:sz="1" w:space="0" w:color="CCCCCC"/>
+            </w:tcBorders>
+            <w:tcMar>
+              <w:top w:w="60" w:type="dxa"/>
+              <w:left w:w="100" w:type="dxa"/>
+              <w:bottom w:w="60" w:type="dxa"/>
+              <w:right w:w="100" w:type="dxa"/>
+            </w:tcMar>
+          </w:tcPr>
+          <w:p>
+            <w:pPr>
+              <w:keepNext/>
+              <w:keepLines/>
+            </w:pPr>
+            <w:r>
+              <w:rPr>
+                <w:color w:val="1B3A6B"/>
+              </w:rPr>
+              <w:t>{%tr endif %}</w:t>
+            </w:r>
+          </w:p>
+        </w:tc>
+        <w:tc>
+          <w:tcPr>
+            <w:tcW w:w="4080" w:type="dxa"/>
+            <w:tcBorders>
+              <w:top w:val="single" w:sz="1" w:space="0" w:color="CCCCCC"/>
+              <w:left w:val="single" w:sz="1" w:space="0" w:color="CCCCCC"/>
+              <w:bottom w:val="single" w:sz="1" w:space="0" w:color="CCCCCC"/>
+              <w:right w:val="single" w:sz="1" w:space="0" w:color="CCCCCC"/>
+            </w:tcBorders>
+            <w:tcMar>
+              <w:top w:w="60" w:type="dxa"/>
+              <w:left w:w="100" w:type="dxa"/>
+              <w:bottom w:w="60" w:type="dxa"/>
+              <w:right w:w="100" w:type="dxa"/>
+            </w:tcMar>
+          </w:tcPr>
+          <w:p>
+            <w:pPr>
+              <w:keepNext/>
+              <w:keepLines/>
+            </w:pPr>
+            <w:r>
+              <w:t/>
+            </w:r>
+          </w:p>
+        </w:tc>
+        <w:tc>
+          <w:tcPr>
+            <w:tcW w:w="4080" w:type="dxa"/>
+            <w:tcBorders>
+              <w:top w:val="single" w:sz="1" w:space="0" w:color="CCCCCC"/>
+              <w:left w:val="single" w:sz="1" w:space="0" w:color="CCCCCC"/>
+              <w:bottom w:val="single" w:sz="1" w:space="0" w:color="CCCCCC"/>
+              <w:right w:val="single" w:sz="1" w:space="0" w:color="CCCCCC"/>
+            </w:tcBorders>
+            <w:tcMar>
+              <w:top w:w="60" w:type="dxa"/>
+              <w:left w:w="100" w:type="dxa"/>
+              <w:bottom w:w="60" w:type="dxa"/>
+              <w:right w:w="100" w:type="dxa"/>
+            </w:tcMar>
+          </w:tcPr>
+          <w:p>
+            <w:pPr>
+              <w:keepNext/>
+              <w:keepLines/>
+            </w:pPr>
+            <w:r>
+              <w:t/>
+            </w:r>
+          </w:p>
+        </w:tc>
+      </w:tr>
+      <w:tr>
+        <w:trPr>
+          <w:cantSplit/>
+        </w:trPr>
+        <w:tc>
+          <w:tcPr>
+            <w:tcW w:w="1200" w:type="dxa"/>
+            <w:tcBorders>
+              <w:top w:val="single" w:sz="1" w:space="0" w:color="CCCCCC"/>
+              <w:left w:val="single" w:sz="1" w:space="0" w:color="CCCCCC"/>
+              <w:bottom w:val="single" w:sz="1" w:space="0" w:color="CCCCCC"/>
+              <w:right w:val="single" w:sz="1" w:space="0" w:color="CCCCCC"/>
+            </w:tcBorders>
+            <w:tcMar>
+              <w:top w:w="60" w:type="dxa"/>
+              <w:left w:w="100" w:type="dxa"/>
+              <w:bottom w:w="60" w:type="dxa"/>
+              <w:right w:w="100" w:type="dxa"/>
+            </w:tcMar>
+          </w:tcPr>
+          <w:p>
+            <w:pPr>
+              <w:keepNext/>
+              <w:keepLines/>
+            </w:pPr>
+            <w:r>
+              <w:rPr>
+                <w:color w:val="1B3A6B"/>
+              </w:rPr>
+              <w:t>{%tr if fiduciaries.executor.second_successor.full_name %}</w:t>
+            </w:r>
+          </w:p>
+        </w:tc>
+        <w:tc>
+          <w:tcPr>
+            <w:tcW w:w="4080" w:type="dxa"/>
+            <w:tcBorders>
+              <w:top w:val="single" w:sz="1" w:space="0" w:color="CCCCCC"/>
+              <w:left w:val="single" w:sz="1" w:space="0" w:color="CCCCCC"/>
+              <w:bottom w:val="single" w:sz="1" w:space="0" w:color="CCCCCC"/>
+              <w:right w:val="single" w:sz="1" w:space="0" w:color="CCCCCC"/>
+            </w:tcBorders>
+            <w:tcMar>
+              <w:top w:w="60" w:type="dxa"/>
+              <w:left w:w="100" w:type="dxa"/>
+              <w:bottom w:w="60" w:type="dxa"/>
+              <w:right w:w="100" w:type="dxa"/>
+            </w:tcMar>
+          </w:tcPr>
+          <w:p>
+            <w:pPr>
+              <w:keepNext/>
+              <w:keepLines/>
+            </w:pPr>
+            <w:r>
+              <w:t/>
+            </w:r>
+          </w:p>
+        </w:tc>
+        <w:tc>
+          <w:tcPr>
+            <w:tcW w:w="4080" w:type="dxa"/>
+            <w:tcBorders>
+              <w:top w:val="single" w:sz="1" w:space="0" w:color="CCCCCC"/>
+              <w:left w:val="single" w:sz="1" w:space="0" w:color="CCCCCC"/>
+              <w:bottom w:val="single" w:sz="1" w:space="0" w:color="CCCCCC"/>
+              <w:right w:val="single" w:sz="1" w:space="0" w:color="CCCCCC"/>
+            </w:tcBorders>
+            <w:tcMar>
+              <w:top w:w="60" w:type="dxa"/>
+              <w:left w:w="100" w:type="dxa"/>
+              <w:bottom w:w="60" w:type="dxa"/>
+              <w:right w:w="100" w:type="dxa"/>
+            </w:tcMar>
+          </w:tcPr>
+          <w:p>
+            <w:pPr>
+              <w:keepNext/>
+              <w:keepLines/>
+            </w:pPr>
+            <w:r/>
+          </w:p>
+        </w:tc>
+      </w:tr>
+      <w:tr>
+        <w:trPr>
+          <w:cantSplit/>
+        </w:trPr>
+        <w:tc>
+          <w:tcPr>
+            <w:tcW w:w="1200" w:type="dxa"/>
+            <w:tcBorders>
+              <w:top w:val="single" w:sz="1" w:space="0" w:color="CCCCCC"/>
+              <w:left w:val="single" w:sz="1" w:space="0" w:color="CCCCCC"/>
+              <w:bottom w:val="single" w:sz="1" w:space="0" w:color="CCCCCC"/>
+              <w:right w:val="single" w:sz="1" w:space="0" w:color="CCCCCC"/>
+            </w:tcBorders>
+            <w:tcMar>
+              <w:top w:w="60" w:type="dxa"/>
+              <w:left w:w="100" w:type="dxa"/>
+              <w:bottom w:w="60" w:type="dxa"/>
+              <w:right w:w="100" w:type="dxa"/>
+            </w:tcMar>
+          </w:tcPr>
+          <w:p>
+            <w:pPr>
+              <w:keepNext/>
+              <w:keepLines/>
+            </w:pPr>
+            <w:r>
+              <w:rPr>
+                <w:color w:val="1B3A6B"/>
+              </w:rPr>
               <w:t>2.</w:t>
             </w:r>
           </w:p>
@@ -5231,10 +5269,8 @@
               <w:keepLines/>
             </w:pPr>
             <w:r>
-              <w:t xml:space="preserve">{{ fiduciaries.executor.second_successor.full_name }}</w:t>
-            </w:r>
-            <w:proofErr w:type="spellStart"/>
-            <w:proofErr w:type="spellEnd"/>
+              <w:t>{{ fiduciaries.executor.second_successor.full_name }}</w:t>
+            </w:r>
           </w:p>
         </w:tc>
         <w:tc>
@@ -5258,13 +5294,91 @@
               <w:keepNext/>
               <w:keepLines/>
             </w:pPr>
-            <w:r>
-              <w:t xml:space="preserve">{% if has_spouse %}{{ fiduciaries.executor.second_successor.full_name }}{% endif %}</w:t>
-            </w:r>
-            <w:proofErr w:type="spellStart"/>
-            <w:proofErr w:type="spellEnd"/>
-            <w:proofErr w:type="spellStart"/>
-            <w:proofErr w:type="spellEnd"/>
+            <w:r/>
+          </w:p>
+        </w:tc>
+      </w:tr>
+      <w:tr>
+        <w:trPr>
+          <w:cantSplit/>
+        </w:trPr>
+        <w:tc>
+          <w:tcPr>
+            <w:tcW w:w="1200" w:type="dxa"/>
+            <w:tcBorders>
+              <w:top w:val="single" w:sz="1" w:space="0" w:color="CCCCCC"/>
+              <w:left w:val="single" w:sz="1" w:space="0" w:color="CCCCCC"/>
+              <w:bottom w:val="single" w:sz="1" w:space="0" w:color="CCCCCC"/>
+              <w:right w:val="single" w:sz="1" w:space="0" w:color="CCCCCC"/>
+            </w:tcBorders>
+            <w:tcMar>
+              <w:top w:w="60" w:type="dxa"/>
+              <w:left w:w="100" w:type="dxa"/>
+              <w:bottom w:w="60" w:type="dxa"/>
+              <w:right w:w="100" w:type="dxa"/>
+            </w:tcMar>
+          </w:tcPr>
+          <w:p>
+            <w:pPr>
+              <w:keepNext/>
+              <w:keepLines/>
+            </w:pPr>
+            <w:r>
+              <w:rPr>
+                <w:color w:val="1B3A6B"/>
+              </w:rPr>
+              <w:t>{%tr endif %}</w:t>
+            </w:r>
+          </w:p>
+        </w:tc>
+        <w:tc>
+          <w:tcPr>
+            <w:tcW w:w="4080" w:type="dxa"/>
+            <w:tcBorders>
+              <w:top w:val="single" w:sz="1" w:space="0" w:color="CCCCCC"/>
+              <w:left w:val="single" w:sz="1" w:space="0" w:color="CCCCCC"/>
+              <w:bottom w:val="single" w:sz="1" w:space="0" w:color="CCCCCC"/>
+              <w:right w:val="single" w:sz="1" w:space="0" w:color="CCCCCC"/>
+            </w:tcBorders>
+            <w:tcMar>
+              <w:top w:w="60" w:type="dxa"/>
+              <w:left w:w="100" w:type="dxa"/>
+              <w:bottom w:w="60" w:type="dxa"/>
+              <w:right w:w="100" w:type="dxa"/>
+            </w:tcMar>
+          </w:tcPr>
+          <w:p>
+            <w:pPr>
+              <w:keepNext/>
+              <w:keepLines/>
+            </w:pPr>
+            <w:r>
+              <w:t/>
+            </w:r>
+          </w:p>
+        </w:tc>
+        <w:tc>
+          <w:tcPr>
+            <w:tcW w:w="4080" w:type="dxa"/>
+            <w:tcBorders>
+              <w:top w:val="single" w:sz="1" w:space="0" w:color="CCCCCC"/>
+              <w:left w:val="single" w:sz="1" w:space="0" w:color="CCCCCC"/>
+              <w:bottom w:val="single" w:sz="1" w:space="0" w:color="CCCCCC"/>
+              <w:right w:val="single" w:sz="1" w:space="0" w:color="CCCCCC"/>
+            </w:tcBorders>
+            <w:tcMar>
+              <w:top w:w="60" w:type="dxa"/>
+              <w:left w:w="100" w:type="dxa"/>
+              <w:bottom w:w="60" w:type="dxa"/>
+              <w:right w:w="100" w:type="dxa"/>
+            </w:tcMar>
+          </w:tcPr>
+          <w:p>
+            <w:pPr>
+              <w:keepNext/>
+              <w:keepLines/>
+            </w:pPr>
+            <w:r/>
           </w:p>
         </w:tc>
       </w:tr>
@@ -5274,10 +5388,8 @@
         <w:rPr>
           <w:color w:val="999999"/>
         </w:rPr>
-        <w:t xml:space="preserve">{% if will.no_contest_clause == 'include' %}</w:t>
-      </w:r>
-      <w:proofErr w:type="spellStart"/>
-      <w:proofErr w:type="spellEnd"/>
+        <w:t>{% if will.no_contest_clause == 'include' %}</w:t>
+      </w:r>
     </w:p>
     <w:p>
       <w:pPr>
@@ -5308,10 +5420,8 @@
         <w:rPr>
           <w:color w:val="999999"/>
         </w:rPr>
-        <w:t xml:space="preserve">{% if will.include_disclaimer_article %}</w:t>
-      </w:r>
-      <w:proofErr w:type="spellStart"/>
-      <w:proofErr w:type="spellEnd"/>
+        <w:t>{% if will.include_disclaimer_article %}</w:t>
+      </w:r>
     </w:p>
     <w:p>
       <w:pPr>
@@ -5402,10 +5512,8 @@
         <w:rPr>
           <w:color w:val="999999"/>
         </w:rPr>
-        <w:t xml:space="preserve">{% if requires_guardian_clause %}</w:t>
-      </w:r>
-      <w:proofErr w:type="spellStart"/>
-      <w:proofErr w:type="spellEnd"/>
+        <w:t>{% if requires_guardian_clause %}</w:t>
+      </w:r>
     </w:p>
     <w:p>
       <w:pPr>
@@ -5484,12 +5592,6 @@
         <w:gridCol w:w="8160"/>
       </w:tblGrid>
       <w:tr>
-        <w:tblPrEx>
-          <w:tblCellMar>
-            <w:top w:w="0" w:type="dxa"/>
-            <w:bottom w:w="0" w:type="dxa"/>
-          </w:tblCellMar>
-        </w:tblPrEx>
         <w:trPr>
           <w:cantSplit/>
         </w:trPr>
@@ -5518,7 +5620,7 @@
               <w:rPr>
                 <w:color w:val="1B3A6B"/>
               </w:rPr>
-              <w:t>1.</w:t>
+              <w:t>{%tr if guardians.primary.full_name %}</w:t>
             </w:r>
           </w:p>
         </w:tc>
@@ -5544,20 +5646,12 @@
               <w:keepLines/>
             </w:pPr>
             <w:r>
-              <w:t xml:space="preserve">{{ guardians.primary.full_name }}</w:t>
-            </w:r>
-            <w:proofErr w:type="spellStart"/>
-            <w:proofErr w:type="spellEnd"/>
+              <w:t/>
+            </w:r>
           </w:p>
         </w:tc>
       </w:tr>
       <w:tr>
-        <w:tblPrEx>
-          <w:tblCellMar>
-            <w:top w:w="0" w:type="dxa"/>
-            <w:bottom w:w="0" w:type="dxa"/>
-          </w:tblCellMar>
-        </w:tblPrEx>
         <w:trPr>
           <w:cantSplit/>
         </w:trPr>
@@ -5586,7 +5680,7 @@
               <w:rPr>
                 <w:color w:val="1B3A6B"/>
               </w:rPr>
-              <w:t>2.</w:t>
+              <w:t>1.</w:t>
             </w:r>
           </w:p>
         </w:tc>
@@ -5612,20 +5706,12 @@
               <w:keepLines/>
             </w:pPr>
             <w:r>
-              <w:t xml:space="preserve">{{ guardians.successor.full_name }}</w:t>
-            </w:r>
-            <w:proofErr w:type="spellStart"/>
-            <w:proofErr w:type="spellEnd"/>
+              <w:t>{{ guardians.primary.full_name }}</w:t>
+            </w:r>
           </w:p>
         </w:tc>
       </w:tr>
       <w:tr>
-        <w:tblPrEx>
-          <w:tblCellMar>
-            <w:top w:w="0" w:type="dxa"/>
-            <w:bottom w:w="0" w:type="dxa"/>
-          </w:tblCellMar>
-        </w:tblPrEx>
         <w:trPr>
           <w:cantSplit/>
         </w:trPr>
@@ -5654,6 +5740,306 @@
               <w:rPr>
                 <w:color w:val="1B3A6B"/>
               </w:rPr>
+              <w:t>{%tr endif %}</w:t>
+            </w:r>
+          </w:p>
+        </w:tc>
+        <w:tc>
+          <w:tcPr>
+            <w:tcW w:w="8160" w:type="dxa"/>
+            <w:tcBorders>
+              <w:top w:val="single" w:sz="1" w:space="0" w:color="CCCCCC"/>
+              <w:left w:val="single" w:sz="1" w:space="0" w:color="CCCCCC"/>
+              <w:bottom w:val="single" w:sz="1" w:space="0" w:color="CCCCCC"/>
+              <w:right w:val="single" w:sz="1" w:space="0" w:color="CCCCCC"/>
+            </w:tcBorders>
+            <w:tcMar>
+              <w:top w:w="60" w:type="dxa"/>
+              <w:left w:w="100" w:type="dxa"/>
+              <w:bottom w:w="60" w:type="dxa"/>
+              <w:right w:w="100" w:type="dxa"/>
+            </w:tcMar>
+          </w:tcPr>
+          <w:p>
+            <w:pPr>
+              <w:keepNext/>
+              <w:keepLines/>
+            </w:pPr>
+            <w:r>
+              <w:t/>
+            </w:r>
+          </w:p>
+        </w:tc>
+      </w:tr>
+      <w:tr>
+        <w:trPr>
+          <w:cantSplit/>
+        </w:trPr>
+        <w:tc>
+          <w:tcPr>
+            <w:tcW w:w="1200" w:type="dxa"/>
+            <w:tcBorders>
+              <w:top w:val="single" w:sz="1" w:space="0" w:color="CCCCCC"/>
+              <w:left w:val="single" w:sz="1" w:space="0" w:color="CCCCCC"/>
+              <w:bottom w:val="single" w:sz="1" w:space="0" w:color="CCCCCC"/>
+              <w:right w:val="single" w:sz="1" w:space="0" w:color="CCCCCC"/>
+            </w:tcBorders>
+            <w:tcMar>
+              <w:top w:w="60" w:type="dxa"/>
+              <w:left w:w="100" w:type="dxa"/>
+              <w:bottom w:w="60" w:type="dxa"/>
+              <w:right w:w="100" w:type="dxa"/>
+            </w:tcMar>
+          </w:tcPr>
+          <w:p>
+            <w:pPr>
+              <w:keepNext/>
+              <w:keepLines/>
+            </w:pPr>
+            <w:r>
+              <w:rPr>
+                <w:color w:val="1B3A6B"/>
+              </w:rPr>
+              <w:t>{%tr if guardians.successor.full_name %}</w:t>
+            </w:r>
+          </w:p>
+        </w:tc>
+        <w:tc>
+          <w:tcPr>
+            <w:tcW w:w="8160" w:type="dxa"/>
+            <w:tcBorders>
+              <w:top w:val="single" w:sz="1" w:space="0" w:color="CCCCCC"/>
+              <w:left w:val="single" w:sz="1" w:space="0" w:color="CCCCCC"/>
+              <w:bottom w:val="single" w:sz="1" w:space="0" w:color="CCCCCC"/>
+              <w:right w:val="single" w:sz="1" w:space="0" w:color="CCCCCC"/>
+            </w:tcBorders>
+            <w:tcMar>
+              <w:top w:w="60" w:type="dxa"/>
+              <w:left w:w="100" w:type="dxa"/>
+              <w:bottom w:w="60" w:type="dxa"/>
+              <w:right w:w="100" w:type="dxa"/>
+            </w:tcMar>
+          </w:tcPr>
+          <w:p>
+            <w:pPr>
+              <w:keepNext/>
+              <w:keepLines/>
+            </w:pPr>
+            <w:r>
+              <w:t/>
+            </w:r>
+          </w:p>
+        </w:tc>
+      </w:tr>
+      <w:tr>
+        <w:trPr>
+          <w:cantSplit/>
+        </w:trPr>
+        <w:tc>
+          <w:tcPr>
+            <w:tcW w:w="1200" w:type="dxa"/>
+            <w:tcBorders>
+              <w:top w:val="single" w:sz="1" w:space="0" w:color="CCCCCC"/>
+              <w:left w:val="single" w:sz="1" w:space="0" w:color="CCCCCC"/>
+              <w:bottom w:val="single" w:sz="1" w:space="0" w:color="CCCCCC"/>
+              <w:right w:val="single" w:sz="1" w:space="0" w:color="CCCCCC"/>
+            </w:tcBorders>
+            <w:tcMar>
+              <w:top w:w="60" w:type="dxa"/>
+              <w:left w:w="100" w:type="dxa"/>
+              <w:bottom w:w="60" w:type="dxa"/>
+              <w:right w:w="100" w:type="dxa"/>
+            </w:tcMar>
+          </w:tcPr>
+          <w:p>
+            <w:pPr>
+              <w:keepNext/>
+              <w:keepLines/>
+            </w:pPr>
+            <w:r>
+              <w:rPr>
+                <w:color w:val="1B3A6B"/>
+              </w:rPr>
+              <w:t>2.</w:t>
+            </w:r>
+          </w:p>
+        </w:tc>
+        <w:tc>
+          <w:tcPr>
+            <w:tcW w:w="8160" w:type="dxa"/>
+            <w:tcBorders>
+              <w:top w:val="single" w:sz="1" w:space="0" w:color="CCCCCC"/>
+              <w:left w:val="single" w:sz="1" w:space="0" w:color="CCCCCC"/>
+              <w:bottom w:val="single" w:sz="1" w:space="0" w:color="CCCCCC"/>
+              <w:right w:val="single" w:sz="1" w:space="0" w:color="CCCCCC"/>
+            </w:tcBorders>
+            <w:tcMar>
+              <w:top w:w="60" w:type="dxa"/>
+              <w:left w:w="100" w:type="dxa"/>
+              <w:bottom w:w="60" w:type="dxa"/>
+              <w:right w:w="100" w:type="dxa"/>
+            </w:tcMar>
+          </w:tcPr>
+          <w:p>
+            <w:pPr>
+              <w:keepNext/>
+              <w:keepLines/>
+            </w:pPr>
+            <w:r>
+              <w:t>{{ guardians.successor.full_name }}</w:t>
+            </w:r>
+          </w:p>
+        </w:tc>
+      </w:tr>
+      <w:tr>
+        <w:trPr>
+          <w:cantSplit/>
+        </w:trPr>
+        <w:tc>
+          <w:tcPr>
+            <w:tcW w:w="1200" w:type="dxa"/>
+            <w:tcBorders>
+              <w:top w:val="single" w:sz="1" w:space="0" w:color="CCCCCC"/>
+              <w:left w:val="single" w:sz="1" w:space="0" w:color="CCCCCC"/>
+              <w:bottom w:val="single" w:sz="1" w:space="0" w:color="CCCCCC"/>
+              <w:right w:val="single" w:sz="1" w:space="0" w:color="CCCCCC"/>
+            </w:tcBorders>
+            <w:tcMar>
+              <w:top w:w="60" w:type="dxa"/>
+              <w:left w:w="100" w:type="dxa"/>
+              <w:bottom w:w="60" w:type="dxa"/>
+              <w:right w:w="100" w:type="dxa"/>
+            </w:tcMar>
+          </w:tcPr>
+          <w:p>
+            <w:pPr>
+              <w:keepNext/>
+              <w:keepLines/>
+            </w:pPr>
+            <w:r>
+              <w:rPr>
+                <w:color w:val="1B3A6B"/>
+              </w:rPr>
+              <w:t>{%tr endif %}</w:t>
+            </w:r>
+          </w:p>
+        </w:tc>
+        <w:tc>
+          <w:tcPr>
+            <w:tcW w:w="8160" w:type="dxa"/>
+            <w:tcBorders>
+              <w:top w:val="single" w:sz="1" w:space="0" w:color="CCCCCC"/>
+              <w:left w:val="single" w:sz="1" w:space="0" w:color="CCCCCC"/>
+              <w:bottom w:val="single" w:sz="1" w:space="0" w:color="CCCCCC"/>
+              <w:right w:val="single" w:sz="1" w:space="0" w:color="CCCCCC"/>
+            </w:tcBorders>
+            <w:tcMar>
+              <w:top w:w="60" w:type="dxa"/>
+              <w:left w:w="100" w:type="dxa"/>
+              <w:bottom w:w="60" w:type="dxa"/>
+              <w:right w:w="100" w:type="dxa"/>
+            </w:tcMar>
+          </w:tcPr>
+          <w:p>
+            <w:pPr>
+              <w:keepNext/>
+              <w:keepLines/>
+            </w:pPr>
+            <w:r>
+              <w:t/>
+            </w:r>
+          </w:p>
+        </w:tc>
+      </w:tr>
+      <w:tr>
+        <w:trPr>
+          <w:cantSplit/>
+        </w:trPr>
+        <w:tc>
+          <w:tcPr>
+            <w:tcW w:w="1200" w:type="dxa"/>
+            <w:tcBorders>
+              <w:top w:val="single" w:sz="1" w:space="0" w:color="CCCCCC"/>
+              <w:left w:val="single" w:sz="1" w:space="0" w:color="CCCCCC"/>
+              <w:bottom w:val="single" w:sz="1" w:space="0" w:color="CCCCCC"/>
+              <w:right w:val="single" w:sz="1" w:space="0" w:color="CCCCCC"/>
+            </w:tcBorders>
+            <w:tcMar>
+              <w:top w:w="60" w:type="dxa"/>
+              <w:left w:w="100" w:type="dxa"/>
+              <w:bottom w:w="60" w:type="dxa"/>
+              <w:right w:w="100" w:type="dxa"/>
+            </w:tcMar>
+          </w:tcPr>
+          <w:p>
+            <w:pPr>
+              <w:keepNext/>
+              <w:keepLines/>
+            </w:pPr>
+            <w:r>
+              <w:rPr>
+                <w:color w:val="1B3A6B"/>
+              </w:rPr>
+              <w:t>{%tr if guardians.second_successor.full_name %}</w:t>
+            </w:r>
+          </w:p>
+        </w:tc>
+        <w:tc>
+          <w:tcPr>
+            <w:tcW w:w="8160" w:type="dxa"/>
+            <w:tcBorders>
+              <w:top w:val="single" w:sz="1" w:space="0" w:color="CCCCCC"/>
+              <w:left w:val="single" w:sz="1" w:space="0" w:color="CCCCCC"/>
+              <w:bottom w:val="single" w:sz="1" w:space="0" w:color="CCCCCC"/>
+              <w:right w:val="single" w:sz="1" w:space="0" w:color="CCCCCC"/>
+            </w:tcBorders>
+            <w:tcMar>
+              <w:top w:w="60" w:type="dxa"/>
+              <w:left w:w="100" w:type="dxa"/>
+              <w:bottom w:w="60" w:type="dxa"/>
+              <w:right w:w="100" w:type="dxa"/>
+            </w:tcMar>
+          </w:tcPr>
+          <w:p>
+            <w:pPr>
+              <w:keepNext/>
+              <w:keepLines/>
+            </w:pPr>
+            <w:r>
+              <w:t/>
+            </w:r>
+          </w:p>
+        </w:tc>
+      </w:tr>
+      <w:tr>
+        <w:trPr>
+          <w:cantSplit/>
+        </w:trPr>
+        <w:tc>
+          <w:tcPr>
+            <w:tcW w:w="1200" w:type="dxa"/>
+            <w:tcBorders>
+              <w:top w:val="single" w:sz="1" w:space="0" w:color="CCCCCC"/>
+              <w:left w:val="single" w:sz="1" w:space="0" w:color="CCCCCC"/>
+              <w:bottom w:val="single" w:sz="1" w:space="0" w:color="CCCCCC"/>
+              <w:right w:val="single" w:sz="1" w:space="0" w:color="CCCCCC"/>
+            </w:tcBorders>
+            <w:tcMar>
+              <w:top w:w="60" w:type="dxa"/>
+              <w:left w:w="100" w:type="dxa"/>
+              <w:bottom w:w="60" w:type="dxa"/>
+              <w:right w:w="100" w:type="dxa"/>
+            </w:tcMar>
+          </w:tcPr>
+          <w:p>
+            <w:pPr>
+              <w:keepNext/>
+              <w:keepLines/>
+            </w:pPr>
+            <w:r>
+              <w:rPr>
+                <w:color w:val="1B3A6B"/>
+              </w:rPr>
               <w:t>3.</w:t>
             </w:r>
           </w:p>
@@ -5680,10 +6066,68 @@
               <w:keepLines/>
             </w:pPr>
             <w:r>
-              <w:t xml:space="preserve">{{ guardians.second_successor.full_name }}</w:t>
-            </w:r>
-            <w:proofErr w:type="spellStart"/>
-            <w:proofErr w:type="spellEnd"/>
+              <w:t>{{ guardians.second_successor.full_name }}</w:t>
+            </w:r>
+          </w:p>
+        </w:tc>
+      </w:tr>
+      <w:tr>
+        <w:trPr>
+          <w:cantSplit/>
+        </w:trPr>
+        <w:tc>
+          <w:tcPr>
+            <w:tcW w:w="1200" w:type="dxa"/>
+            <w:tcBorders>
+              <w:top w:val="single" w:sz="1" w:space="0" w:color="CCCCCC"/>
+              <w:left w:val="single" w:sz="1" w:space="0" w:color="CCCCCC"/>
+              <w:bottom w:val="single" w:sz="1" w:space="0" w:color="CCCCCC"/>
+              <w:right w:val="single" w:sz="1" w:space="0" w:color="CCCCCC"/>
+            </w:tcBorders>
+            <w:tcMar>
+              <w:top w:w="60" w:type="dxa"/>
+              <w:left w:w="100" w:type="dxa"/>
+              <w:bottom w:w="60" w:type="dxa"/>
+              <w:right w:w="100" w:type="dxa"/>
+            </w:tcMar>
+          </w:tcPr>
+          <w:p>
+            <w:pPr>
+              <w:keepNext/>
+              <w:keepLines/>
+            </w:pPr>
+            <w:r>
+              <w:rPr>
+                <w:color w:val="1B3A6B"/>
+              </w:rPr>
+              <w:t>{%tr endif %}</w:t>
+            </w:r>
+          </w:p>
+        </w:tc>
+        <w:tc>
+          <w:tcPr>
+            <w:tcW w:w="8160" w:type="dxa"/>
+            <w:tcBorders>
+              <w:top w:val="single" w:sz="1" w:space="0" w:color="CCCCCC"/>
+              <w:left w:val="single" w:sz="1" w:space="0" w:color="CCCCCC"/>
+              <w:bottom w:val="single" w:sz="1" w:space="0" w:color="CCCCCC"/>
+              <w:right w:val="single" w:sz="1" w:space="0" w:color="CCCCCC"/>
+            </w:tcBorders>
+            <w:tcMar>
+              <w:top w:w="60" w:type="dxa"/>
+              <w:left w:w="100" w:type="dxa"/>
+              <w:bottom w:w="60" w:type="dxa"/>
+              <w:right w:w="100" w:type="dxa"/>
+            </w:tcMar>
+          </w:tcPr>
+          <w:p>
+            <w:pPr>
+              <w:keepNext/>
+              <w:keepLines/>
+            </w:pPr>
+            <w:r>
+              <w:t/>
+            </w:r>
           </w:p>
         </w:tc>
       </w:tr>
@@ -5732,12 +6176,6 @@
         <w:gridCol w:w="8160"/>
       </w:tblGrid>
       <w:tr>
-        <w:tblPrEx>
-          <w:tblCellMar>
-            <w:top w:w="0" w:type="dxa"/>
-            <w:bottom w:w="0" w:type="dxa"/>
-          </w:tblCellMar>
-        </w:tblPrEx>
         <w:trPr>
           <w:cantSplit/>
         </w:trPr>
@@ -5766,7 +6204,7 @@
               <w:rPr>
                 <w:color w:val="1B3A6B"/>
               </w:rPr>
-              <w:t>1.</w:t>
+              <w:t>{%tr if guardians.temporary.full_name %}</w:t>
             </w:r>
           </w:p>
         </w:tc>
@@ -5792,20 +6230,12 @@
               <w:keepLines/>
             </w:pPr>
             <w:r>
-              <w:t xml:space="preserve">{{ guardians.short_term_primary.full_name }}</w:t>
-            </w:r>
-            <w:proofErr w:type="spellStart"/>
-            <w:proofErr w:type="spellEnd"/>
+              <w:t/>
+            </w:r>
           </w:p>
         </w:tc>
       </w:tr>
       <w:tr>
-        <w:tblPrEx>
-          <w:tblCellMar>
-            <w:top w:w="0" w:type="dxa"/>
-            <w:bottom w:w="0" w:type="dxa"/>
-          </w:tblCellMar>
-        </w:tblPrEx>
         <w:trPr>
           <w:cantSplit/>
         </w:trPr>
@@ -5834,6 +6264,186 @@
               <w:rPr>
                 <w:color w:val="1B3A6B"/>
               </w:rPr>
+              <w:t>1.</w:t>
+            </w:r>
+          </w:p>
+        </w:tc>
+        <w:tc>
+          <w:tcPr>
+            <w:tcW w:w="8160" w:type="dxa"/>
+            <w:tcBorders>
+              <w:top w:val="single" w:sz="1" w:space="0" w:color="CCCCCC"/>
+              <w:left w:val="single" w:sz="1" w:space="0" w:color="CCCCCC"/>
+              <w:bottom w:val="single" w:sz="1" w:space="0" w:color="CCCCCC"/>
+              <w:right w:val="single" w:sz="1" w:space="0" w:color="CCCCCC"/>
+            </w:tcBorders>
+            <w:tcMar>
+              <w:top w:w="60" w:type="dxa"/>
+              <w:left w:w="100" w:type="dxa"/>
+              <w:bottom w:w="60" w:type="dxa"/>
+              <w:right w:w="100" w:type="dxa"/>
+            </w:tcMar>
+          </w:tcPr>
+          <w:p>
+            <w:pPr>
+              <w:keepNext/>
+              <w:keepLines/>
+            </w:pPr>
+            <w:r>
+              <w:t>{{ guardians.temporary.full_name }}</w:t>
+            </w:r>
+          </w:p>
+        </w:tc>
+      </w:tr>
+      <w:tr>
+        <w:trPr>
+          <w:cantSplit/>
+        </w:trPr>
+        <w:tc>
+          <w:tcPr>
+            <w:tcW w:w="1200" w:type="dxa"/>
+            <w:tcBorders>
+              <w:top w:val="single" w:sz="1" w:space="0" w:color="CCCCCC"/>
+              <w:left w:val="single" w:sz="1" w:space="0" w:color="CCCCCC"/>
+              <w:bottom w:val="single" w:sz="1" w:space="0" w:color="CCCCCC"/>
+              <w:right w:val="single" w:sz="1" w:space="0" w:color="CCCCCC"/>
+            </w:tcBorders>
+            <w:tcMar>
+              <w:top w:w="60" w:type="dxa"/>
+              <w:left w:w="100" w:type="dxa"/>
+              <w:bottom w:w="60" w:type="dxa"/>
+              <w:right w:w="100" w:type="dxa"/>
+            </w:tcMar>
+          </w:tcPr>
+          <w:p>
+            <w:pPr>
+              <w:keepNext/>
+              <w:keepLines/>
+            </w:pPr>
+            <w:r>
+              <w:rPr>
+                <w:color w:val="1B3A6B"/>
+              </w:rPr>
+              <w:t>{%tr endif %}</w:t>
+            </w:r>
+          </w:p>
+        </w:tc>
+        <w:tc>
+          <w:tcPr>
+            <w:tcW w:w="8160" w:type="dxa"/>
+            <w:tcBorders>
+              <w:top w:val="single" w:sz="1" w:space="0" w:color="CCCCCC"/>
+              <w:left w:val="single" w:sz="1" w:space="0" w:color="CCCCCC"/>
+              <w:bottom w:val="single" w:sz="1" w:space="0" w:color="CCCCCC"/>
+              <w:right w:val="single" w:sz="1" w:space="0" w:color="CCCCCC"/>
+            </w:tcBorders>
+            <w:tcMar>
+              <w:top w:w="60" w:type="dxa"/>
+              <w:left w:w="100" w:type="dxa"/>
+              <w:bottom w:w="60" w:type="dxa"/>
+              <w:right w:w="100" w:type="dxa"/>
+            </w:tcMar>
+          </w:tcPr>
+          <w:p>
+            <w:pPr>
+              <w:keepNext/>
+              <w:keepLines/>
+            </w:pPr>
+            <w:r>
+              <w:t/>
+            </w:r>
+          </w:p>
+        </w:tc>
+      </w:tr>
+      <w:tr>
+        <w:trPr>
+          <w:cantSplit/>
+        </w:trPr>
+        <w:tc>
+          <w:tcPr>
+            <w:tcW w:w="1200" w:type="dxa"/>
+            <w:tcBorders>
+              <w:top w:val="single" w:sz="1" w:space="0" w:color="CCCCCC"/>
+              <w:left w:val="single" w:sz="1" w:space="0" w:color="CCCCCC"/>
+              <w:bottom w:val="single" w:sz="1" w:space="0" w:color="CCCCCC"/>
+              <w:right w:val="single" w:sz="1" w:space="0" w:color="CCCCCC"/>
+            </w:tcBorders>
+            <w:tcMar>
+              <w:top w:w="60" w:type="dxa"/>
+              <w:left w:w="100" w:type="dxa"/>
+              <w:bottom w:w="60" w:type="dxa"/>
+              <w:right w:w="100" w:type="dxa"/>
+            </w:tcMar>
+          </w:tcPr>
+          <w:p>
+            <w:pPr>
+              <w:keepNext/>
+              <w:keepLines/>
+            </w:pPr>
+            <w:r>
+              <w:rPr>
+                <w:color w:val="1B3A6B"/>
+              </w:rPr>
+              <w:t>{%tr if guardians.temporary_successor.full_name %}</w:t>
+            </w:r>
+          </w:p>
+        </w:tc>
+        <w:tc>
+          <w:tcPr>
+            <w:tcW w:w="8160" w:type="dxa"/>
+            <w:tcBorders>
+              <w:top w:val="single" w:sz="1" w:space="0" w:color="CCCCCC"/>
+              <w:left w:val="single" w:sz="1" w:space="0" w:color="CCCCCC"/>
+              <w:bottom w:val="single" w:sz="1" w:space="0" w:color="CCCCCC"/>
+              <w:right w:val="single" w:sz="1" w:space="0" w:color="CCCCCC"/>
+            </w:tcBorders>
+            <w:tcMar>
+              <w:top w:w="60" w:type="dxa"/>
+              <w:left w:w="100" w:type="dxa"/>
+              <w:bottom w:w="60" w:type="dxa"/>
+              <w:right w:w="100" w:type="dxa"/>
+            </w:tcMar>
+          </w:tcPr>
+          <w:p>
+            <w:pPr>
+              <w:keepNext/>
+              <w:keepLines/>
+            </w:pPr>
+            <w:r>
+              <w:t/>
+            </w:r>
+          </w:p>
+        </w:tc>
+      </w:tr>
+      <w:tr>
+        <w:trPr>
+          <w:cantSplit/>
+        </w:trPr>
+        <w:tc>
+          <w:tcPr>
+            <w:tcW w:w="1200" w:type="dxa"/>
+            <w:tcBorders>
+              <w:top w:val="single" w:sz="1" w:space="0" w:color="CCCCCC"/>
+              <w:left w:val="single" w:sz="1" w:space="0" w:color="CCCCCC"/>
+              <w:bottom w:val="single" w:sz="1" w:space="0" w:color="CCCCCC"/>
+              <w:right w:val="single" w:sz="1" w:space="0" w:color="CCCCCC"/>
+            </w:tcBorders>
+            <w:tcMar>
+              <w:top w:w="60" w:type="dxa"/>
+              <w:left w:w="100" w:type="dxa"/>
+              <w:bottom w:w="60" w:type="dxa"/>
+              <w:right w:w="100" w:type="dxa"/>
+            </w:tcMar>
+          </w:tcPr>
+          <w:p>
+            <w:pPr>
+              <w:keepNext/>
+              <w:keepLines/>
+            </w:pPr>
+            <w:r>
+              <w:rPr>
+                <w:color w:val="1B3A6B"/>
+              </w:rPr>
               <w:t>2.</w:t>
             </w:r>
           </w:p>
@@ -5860,10 +6470,68 @@
               <w:keepLines/>
             </w:pPr>
             <w:r>
-              <w:t xml:space="preserve">{{ guardians.short_term_successor.full_name }}</w:t>
-            </w:r>
-            <w:proofErr w:type="spellStart"/>
-            <w:proofErr w:type="spellEnd"/>
+              <w:t>{{ guardians.temporary_successor.full_name }}</w:t>
+            </w:r>
+          </w:p>
+        </w:tc>
+      </w:tr>
+      <w:tr>
+        <w:trPr>
+          <w:cantSplit/>
+        </w:trPr>
+        <w:tc>
+          <w:tcPr>
+            <w:tcW w:w="1200" w:type="dxa"/>
+            <w:tcBorders>
+              <w:top w:val="single" w:sz="1" w:space="0" w:color="CCCCCC"/>
+              <w:left w:val="single" w:sz="1" w:space="0" w:color="CCCCCC"/>
+              <w:bottom w:val="single" w:sz="1" w:space="0" w:color="CCCCCC"/>
+              <w:right w:val="single" w:sz="1" w:space="0" w:color="CCCCCC"/>
+            </w:tcBorders>
+            <w:tcMar>
+              <w:top w:w="60" w:type="dxa"/>
+              <w:left w:w="100" w:type="dxa"/>
+              <w:bottom w:w="60" w:type="dxa"/>
+              <w:right w:w="100" w:type="dxa"/>
+            </w:tcMar>
+          </w:tcPr>
+          <w:p>
+            <w:pPr>
+              <w:keepNext/>
+              <w:keepLines/>
+            </w:pPr>
+            <w:r>
+              <w:rPr>
+                <w:color w:val="1B3A6B"/>
+              </w:rPr>
+              <w:t>{%tr endif %}</w:t>
+            </w:r>
+          </w:p>
+        </w:tc>
+        <w:tc>
+          <w:tcPr>
+            <w:tcW w:w="8160" w:type="dxa"/>
+            <w:tcBorders>
+              <w:top w:val="single" w:sz="1" w:space="0" w:color="CCCCCC"/>
+              <w:left w:val="single" w:sz="1" w:space="0" w:color="CCCCCC"/>
+              <w:bottom w:val="single" w:sz="1" w:space="0" w:color="CCCCCC"/>
+              <w:right w:val="single" w:sz="1" w:space="0" w:color="CCCCCC"/>
+            </w:tcBorders>
+            <w:tcMar>
+              <w:top w:w="60" w:type="dxa"/>
+              <w:left w:w="100" w:type="dxa"/>
+              <w:bottom w:w="60" w:type="dxa"/>
+              <w:right w:w="100" w:type="dxa"/>
+            </w:tcMar>
+          </w:tcPr>
+          <w:p>
+            <w:pPr>
+              <w:keepNext/>
+              <w:keepLines/>
+            </w:pPr>
+            <w:r>
+              <w:t/>
+            </w:r>
           </w:p>
         </w:tc>
       </w:tr>
@@ -5873,10 +6541,8 @@
         <w:rPr>
           <w:color w:val="999999"/>
         </w:rPr>
-        <w:t xml:space="preserve">{% if has_excluded_guardians %}</w:t>
-      </w:r>
-      <w:proofErr w:type="spellStart"/>
-      <w:proofErr w:type="spellEnd"/>
+        <w:t>{% if has_excluded_guardians %}</w:t>
+      </w:r>
     </w:p>
     <w:p>
       <w:pPr>
@@ -5898,36 +6564,25 @@
         <w:rPr>
           <w:color w:val="999999"/>
         </w:rPr>
-        <w:t xml:space="preserve">{% for person in guardians.excluded %}</w:t>
-      </w:r>
-      <w:proofErr w:type="spellStart"/>
-      <w:proofErr w:type="spellEnd"/>
+        <w:t>{% for person in guardians.excluded %}</w:t>
+      </w:r>
     </w:p>
     <w:p>
       <w:pPr>
         <w:spacing w:before="120" w:after="120"/>
       </w:pPr>
       <w:r>
-        <w:t xml:space="preserve">{{ person.full_name }}</w:t>
-      </w:r>
-      <w:proofErr w:type="spellStart"/>
-      <w:proofErr w:type="spellEnd"/>
+        <w:t>{{ person.full_name }}</w:t>
+      </w:r>
       <w:r>
         <w:rPr>
           <w:color w:val="999999"/>
         </w:rPr>
-        <w:t xml:space="preserve">{% if person.reason %}</w:t>
-      </w:r>
-      <w:proofErr w:type="spellStart"/>
-      <w:proofErr w:type="spellEnd"/>
-      <w:r>
-        <w:t xml:space="preserve"> -- </w:t>
-      </w:r>
-      <w:r>
-        <w:t xml:space="preserve">{{ person.reason }}</w:t>
-      </w:r>
-      <w:proofErr w:type="spellStart"/>
-      <w:proofErr w:type="spellEnd"/>
+        <w:t>{% if person.reason %}</w:t>
+      </w:r>
+      <w:r>
+        <w:t xml:space="preserve"> -- {{ person.reason }}</w:t>
+      </w:r>
       <w:r>
         <w:rPr>
           <w:color w:val="999999"/>
@@ -5940,10 +6595,8 @@
         <w:rPr>
           <w:color w:val="999999"/>
         </w:rPr>
-        <w:t xml:space="preserve">{% endfor %}</w:t>
-      </w:r>
-      <w:proofErr w:type="spellStart"/>
-      <w:proofErr w:type="spellEnd"/>
+        <w:t>{% endfor %}</w:t>
+      </w:r>
     </w:p>
     <w:p>
       <w:r>
@@ -5966,10 +6619,8 @@
         <w:rPr>
           <w:color w:val="999999"/>
         </w:rPr>
-        <w:t xml:space="preserve">{% if planning.include_dpoa %}</w:t>
-      </w:r>
-      <w:proofErr w:type="spellStart"/>
-      <w:proofErr w:type="spellEnd"/>
+        <w:t>{% if planning.include_dpoa %}</w:t>
+      </w:r>
     </w:p>
     <w:p>
       <w:pPr>
@@ -6003,10 +6654,8 @@
         <w:rPr>
           <w:color w:val="999999"/>
         </w:rPr>
-        <w:t xml:space="preserve">{% if has_co_poa %}</w:t>
-      </w:r>
-      <w:proofErr w:type="spellStart"/>
-      <w:proofErr w:type="spellEnd"/>
+        <w:t>{% if has_co_poa %}</w:t>
+      </w:r>
     </w:p>
     <w:p>
       <w:pPr>
@@ -6020,14 +6669,8 @@
         <w:t xml:space="preserve">Co-Agent Action: </w:t>
       </w:r>
       <w:r>
-        <w:t xml:space="preserve">{% if co_poa_joint %}Your co-agents must act together (both must agree).{% elif co_poa_majority %}Your co-agents act by majority.{% else %}Your co-agents may act independently.{% endif %}</w:t>
-      </w:r>
-      <w:proofErr w:type="spellStart"/>
-      <w:proofErr w:type="spellEnd"/>
-      <w:proofErr w:type="spellStart"/>
-      <w:proofErr w:type="spellEnd"/>
-      <w:proofErr w:type="spellStart"/>
-      <w:proofErr w:type="spellEnd"/>
+        <w:t>{% if co_poa_joint %}Your co-agents must act together (both must agree).{% elif co_poa_majority %}Your co-agents act by majority.{% else %}Your co-agents may act independently.{% endif %}</w:t>
+      </w:r>
     </w:p>
     <w:p>
       <w:r>
@@ -6060,12 +6703,6 @@
         <w:gridCol w:w="4370"/>
       </w:tblGrid>
       <w:tr>
-        <w:tblPrEx>
-          <w:tblCellMar>
-            <w:top w:w="0" w:type="dxa"/>
-            <w:bottom w:w="0" w:type="dxa"/>
-          </w:tblCellMar>
-        </w:tblPrEx>
         <w:trPr>
           <w:cantSplit/>
         </w:trPr>
@@ -6122,10 +6759,8 @@
                 <w:bCs/>
                 <w:color w:val="FFFFFF"/>
               </w:rPr>
-              <w:t xml:space="preserve">{{ client.full_name }}</w:t>
-            </w:r>
-            <w:proofErr w:type="spellStart"/>
-            <w:proofErr w:type="spellEnd"/>
+              <w:t>{{ client.full_name }}</w:t>
+            </w:r>
           </w:p>
         </w:tc>
         <w:tc>
@@ -6157,22 +6792,12 @@
                 <w:bCs/>
                 <w:color w:val="FFFFFF"/>
               </w:rPr>
-              <w:t xml:space="preserve">{% if has_spouse %}{{ spouse.full_name }}{% endif %}</w:t>
-            </w:r>
-            <w:proofErr w:type="spellStart"/>
-            <w:proofErr w:type="spellEnd"/>
-            <w:proofErr w:type="spellStart"/>
-            <w:proofErr w:type="spellEnd"/>
+              <w:t>{% if has_spouse %}{{ spouse.full_name }}{% endif %}</w:t>
+            </w:r>
           </w:p>
         </w:tc>
       </w:tr>
       <w:tr>
-        <w:tblPrEx>
-          <w:tblCellMar>
-            <w:top w:w="0" w:type="dxa"/>
-            <w:bottom w:w="0" w:type="dxa"/>
-          </w:tblCellMar>
-        </w:tblPrEx>
         <w:trPr>
           <w:cantSplit/>
         </w:trPr>
@@ -6201,7 +6826,7 @@
               <w:rPr>
                 <w:color w:val="1B3A6B"/>
               </w:rPr>
-              <w:t>1.</w:t>
+              <w:t>{%tr if fiduciaries.agent.primary.full_name or fiduciaries.spouse_agent.primary.full_name %}</w:t>
             </w:r>
           </w:p>
         </w:tc>
@@ -6227,10 +6852,8 @@
               <w:keepLines/>
             </w:pPr>
             <w:r>
-              <w:t xml:space="preserve">{{ fiduciaries.agent.primary.full_name }}</w:t>
-            </w:r>
-            <w:proofErr w:type="spellStart"/>
-            <w:proofErr w:type="spellEnd"/>
+              <w:t/>
+            </w:r>
           </w:p>
         </w:tc>
         <w:tc>
@@ -6255,22 +6878,12 @@
               <w:keepLines/>
             </w:pPr>
             <w:r>
-              <w:t xml:space="preserve">{% if has_spouse %}{{ fiduciaries.spouse_agent.primary.full_name }}{% endif %}</w:t>
-            </w:r>
-            <w:proofErr w:type="spellStart"/>
-            <w:proofErr w:type="spellEnd"/>
-            <w:proofErr w:type="spellStart"/>
-            <w:proofErr w:type="spellEnd"/>
+              <w:t/>
+            </w:r>
           </w:p>
         </w:tc>
       </w:tr>
       <w:tr>
-        <w:tblPrEx>
-          <w:tblCellMar>
-            <w:top w:w="0" w:type="dxa"/>
-            <w:bottom w:w="0" w:type="dxa"/>
-          </w:tblCellMar>
-        </w:tblPrEx>
         <w:trPr>
           <w:cantSplit/>
         </w:trPr>
@@ -6299,6 +6912,264 @@
               <w:rPr>
                 <w:color w:val="1B3A6B"/>
               </w:rPr>
+              <w:t>1.</w:t>
+            </w:r>
+          </w:p>
+        </w:tc>
+        <w:tc>
+          <w:tcPr>
+            <w:tcW w:w="4080" w:type="dxa"/>
+            <w:tcBorders>
+              <w:top w:val="single" w:sz="1" w:space="0" w:color="CCCCCC"/>
+              <w:left w:val="single" w:sz="1" w:space="0" w:color="CCCCCC"/>
+              <w:bottom w:val="single" w:sz="1" w:space="0" w:color="CCCCCC"/>
+              <w:right w:val="single" w:sz="1" w:space="0" w:color="CCCCCC"/>
+            </w:tcBorders>
+            <w:tcMar>
+              <w:top w:w="60" w:type="dxa"/>
+              <w:left w:w="100" w:type="dxa"/>
+              <w:bottom w:w="60" w:type="dxa"/>
+              <w:right w:w="100" w:type="dxa"/>
+            </w:tcMar>
+          </w:tcPr>
+          <w:p>
+            <w:pPr>
+              <w:keepNext/>
+              <w:keepLines/>
+            </w:pPr>
+            <w:r>
+              <w:t>{{ fiduciaries.agent.primary.full_name }}</w:t>
+            </w:r>
+          </w:p>
+        </w:tc>
+        <w:tc>
+          <w:tcPr>
+            <w:tcW w:w="4080" w:type="dxa"/>
+            <w:tcBorders>
+              <w:top w:val="single" w:sz="1" w:space="0" w:color="CCCCCC"/>
+              <w:left w:val="single" w:sz="1" w:space="0" w:color="CCCCCC"/>
+              <w:bottom w:val="single" w:sz="1" w:space="0" w:color="CCCCCC"/>
+              <w:right w:val="single" w:sz="1" w:space="0" w:color="CCCCCC"/>
+            </w:tcBorders>
+            <w:tcMar>
+              <w:top w:w="60" w:type="dxa"/>
+              <w:left w:w="100" w:type="dxa"/>
+              <w:bottom w:w="60" w:type="dxa"/>
+              <w:right w:w="100" w:type="dxa"/>
+            </w:tcMar>
+          </w:tcPr>
+          <w:p>
+            <w:pPr>
+              <w:keepNext/>
+              <w:keepLines/>
+            </w:pPr>
+            <w:r>
+              <w:t>{% if has_spouse %}{{ fiduciaries.spouse_agent.primary.full_name }}{% endif %}</w:t>
+            </w:r>
+          </w:p>
+        </w:tc>
+      </w:tr>
+      <w:tr>
+        <w:trPr>
+          <w:cantSplit/>
+        </w:trPr>
+        <w:tc>
+          <w:tcPr>
+            <w:tcW w:w="1200" w:type="dxa"/>
+            <w:tcBorders>
+              <w:top w:val="single" w:sz="1" w:space="0" w:color="CCCCCC"/>
+              <w:left w:val="single" w:sz="1" w:space="0" w:color="CCCCCC"/>
+              <w:bottom w:val="single" w:sz="1" w:space="0" w:color="CCCCCC"/>
+              <w:right w:val="single" w:sz="1" w:space="0" w:color="CCCCCC"/>
+            </w:tcBorders>
+            <w:tcMar>
+              <w:top w:w="60" w:type="dxa"/>
+              <w:left w:w="100" w:type="dxa"/>
+              <w:bottom w:w="60" w:type="dxa"/>
+              <w:right w:w="100" w:type="dxa"/>
+            </w:tcMar>
+          </w:tcPr>
+          <w:p>
+            <w:pPr>
+              <w:keepNext/>
+              <w:keepLines/>
+            </w:pPr>
+            <w:r>
+              <w:rPr>
+                <w:color w:val="1B3A6B"/>
+              </w:rPr>
+              <w:t>{%tr endif %}</w:t>
+            </w:r>
+          </w:p>
+        </w:tc>
+        <w:tc>
+          <w:tcPr>
+            <w:tcW w:w="4080" w:type="dxa"/>
+            <w:tcBorders>
+              <w:top w:val="single" w:sz="1" w:space="0" w:color="CCCCCC"/>
+              <w:left w:val="single" w:sz="1" w:space="0" w:color="CCCCCC"/>
+              <w:bottom w:val="single" w:sz="1" w:space="0" w:color="CCCCCC"/>
+              <w:right w:val="single" w:sz="1" w:space="0" w:color="CCCCCC"/>
+            </w:tcBorders>
+            <w:tcMar>
+              <w:top w:w="60" w:type="dxa"/>
+              <w:left w:w="100" w:type="dxa"/>
+              <w:bottom w:w="60" w:type="dxa"/>
+              <w:right w:w="100" w:type="dxa"/>
+            </w:tcMar>
+          </w:tcPr>
+          <w:p>
+            <w:pPr>
+              <w:keepNext/>
+              <w:keepLines/>
+            </w:pPr>
+            <w:r>
+              <w:t/>
+            </w:r>
+          </w:p>
+        </w:tc>
+        <w:tc>
+          <w:tcPr>
+            <w:tcW w:w="4080" w:type="dxa"/>
+            <w:tcBorders>
+              <w:top w:val="single" w:sz="1" w:space="0" w:color="CCCCCC"/>
+              <w:left w:val="single" w:sz="1" w:space="0" w:color="CCCCCC"/>
+              <w:bottom w:val="single" w:sz="1" w:space="0" w:color="CCCCCC"/>
+              <w:right w:val="single" w:sz="1" w:space="0" w:color="CCCCCC"/>
+            </w:tcBorders>
+            <w:tcMar>
+              <w:top w:w="60" w:type="dxa"/>
+              <w:left w:w="100" w:type="dxa"/>
+              <w:bottom w:w="60" w:type="dxa"/>
+              <w:right w:w="100" w:type="dxa"/>
+            </w:tcMar>
+          </w:tcPr>
+          <w:p>
+            <w:pPr>
+              <w:keepNext/>
+              <w:keepLines/>
+            </w:pPr>
+            <w:r>
+              <w:t/>
+            </w:r>
+          </w:p>
+        </w:tc>
+      </w:tr>
+      <w:tr>
+        <w:trPr>
+          <w:cantSplit/>
+        </w:trPr>
+        <w:tc>
+          <w:tcPr>
+            <w:tcW w:w="1200" w:type="dxa"/>
+            <w:tcBorders>
+              <w:top w:val="single" w:sz="1" w:space="0" w:color="CCCCCC"/>
+              <w:left w:val="single" w:sz="1" w:space="0" w:color="CCCCCC"/>
+              <w:bottom w:val="single" w:sz="1" w:space="0" w:color="CCCCCC"/>
+              <w:right w:val="single" w:sz="1" w:space="0" w:color="CCCCCC"/>
+            </w:tcBorders>
+            <w:tcMar>
+              <w:top w:w="60" w:type="dxa"/>
+              <w:left w:w="100" w:type="dxa"/>
+              <w:bottom w:w="60" w:type="dxa"/>
+              <w:right w:w="100" w:type="dxa"/>
+            </w:tcMar>
+          </w:tcPr>
+          <w:p>
+            <w:pPr>
+              <w:keepNext/>
+              <w:keepLines/>
+            </w:pPr>
+            <w:r>
+              <w:rPr>
+                <w:color w:val="1B3A6B"/>
+              </w:rPr>
+              <w:t>{%tr if fiduciaries.agent.successor.full_name or fiduciaries.spouse_agent.successor.full_name %}</w:t>
+            </w:r>
+          </w:p>
+        </w:tc>
+        <w:tc>
+          <w:tcPr>
+            <w:tcW w:w="4080" w:type="dxa"/>
+            <w:tcBorders>
+              <w:top w:val="single" w:sz="1" w:space="0" w:color="CCCCCC"/>
+              <w:left w:val="single" w:sz="1" w:space="0" w:color="CCCCCC"/>
+              <w:bottom w:val="single" w:sz="1" w:space="0" w:color="CCCCCC"/>
+              <w:right w:val="single" w:sz="1" w:space="0" w:color="CCCCCC"/>
+            </w:tcBorders>
+            <w:tcMar>
+              <w:top w:w="60" w:type="dxa"/>
+              <w:left w:w="100" w:type="dxa"/>
+              <w:bottom w:w="60" w:type="dxa"/>
+              <w:right w:w="100" w:type="dxa"/>
+            </w:tcMar>
+          </w:tcPr>
+          <w:p>
+            <w:pPr>
+              <w:keepNext/>
+              <w:keepLines/>
+            </w:pPr>
+            <w:r>
+              <w:t/>
+            </w:r>
+          </w:p>
+        </w:tc>
+        <w:tc>
+          <w:tcPr>
+            <w:tcW w:w="4080" w:type="dxa"/>
+            <w:tcBorders>
+              <w:top w:val="single" w:sz="1" w:space="0" w:color="CCCCCC"/>
+              <w:left w:val="single" w:sz="1" w:space="0" w:color="CCCCCC"/>
+              <w:bottom w:val="single" w:sz="1" w:space="0" w:color="CCCCCC"/>
+              <w:right w:val="single" w:sz="1" w:space="0" w:color="CCCCCC"/>
+            </w:tcBorders>
+            <w:tcMar>
+              <w:top w:w="60" w:type="dxa"/>
+              <w:left w:w="100" w:type="dxa"/>
+              <w:bottom w:w="60" w:type="dxa"/>
+              <w:right w:w="100" w:type="dxa"/>
+            </w:tcMar>
+          </w:tcPr>
+          <w:p>
+            <w:pPr>
+              <w:keepNext/>
+              <w:keepLines/>
+            </w:pPr>
+            <w:r>
+              <w:t/>
+            </w:r>
+          </w:p>
+        </w:tc>
+      </w:tr>
+      <w:tr>
+        <w:trPr>
+          <w:cantSplit/>
+        </w:trPr>
+        <w:tc>
+          <w:tcPr>
+            <w:tcW w:w="1200" w:type="dxa"/>
+            <w:tcBorders>
+              <w:top w:val="single" w:sz="1" w:space="0" w:color="CCCCCC"/>
+              <w:left w:val="single" w:sz="1" w:space="0" w:color="CCCCCC"/>
+              <w:bottom w:val="single" w:sz="1" w:space="0" w:color="CCCCCC"/>
+              <w:right w:val="single" w:sz="1" w:space="0" w:color="CCCCCC"/>
+            </w:tcBorders>
+            <w:tcMar>
+              <w:top w:w="60" w:type="dxa"/>
+              <w:left w:w="100" w:type="dxa"/>
+              <w:bottom w:w="60" w:type="dxa"/>
+              <w:right w:w="100" w:type="dxa"/>
+            </w:tcMar>
+          </w:tcPr>
+          <w:p>
+            <w:pPr>
+              <w:keepNext/>
+              <w:keepLines/>
+            </w:pPr>
+            <w:r>
+              <w:rPr>
+                <w:color w:val="1B3A6B"/>
+              </w:rPr>
               <w:t>2.</w:t>
             </w:r>
           </w:p>
@@ -6325,10 +7196,8 @@
               <w:keepLines/>
             </w:pPr>
             <w:r>
-              <w:t xml:space="preserve">{{ fiduciaries.agent.successor.full_name }}</w:t>
-            </w:r>
-            <w:proofErr w:type="spellStart"/>
-            <w:proofErr w:type="spellEnd"/>
+              <w:t>{{ fiduciaries.agent.successor.full_name }}</w:t>
+            </w:r>
           </w:p>
         </w:tc>
         <w:tc>
@@ -6353,12 +7222,94 @@
               <w:keepLines/>
             </w:pPr>
             <w:r>
-              <w:t xml:space="preserve">{% if has_spouse %}{{ fiduciaries.spouse_agent.successor.full_name }}{% endif %}</w:t>
-            </w:r>
-            <w:proofErr w:type="spellStart"/>
-            <w:proofErr w:type="spellEnd"/>
-            <w:proofErr w:type="spellStart"/>
-            <w:proofErr w:type="spellEnd"/>
+              <w:t>{% if has_spouse %}{{ fiduciaries.spouse_agent.successor.full_name }}{% endif %}</w:t>
+            </w:r>
+          </w:p>
+        </w:tc>
+      </w:tr>
+      <w:tr>
+        <w:trPr>
+          <w:cantSplit/>
+        </w:trPr>
+        <w:tc>
+          <w:tcPr>
+            <w:tcW w:w="1200" w:type="dxa"/>
+            <w:tcBorders>
+              <w:top w:val="single" w:sz="1" w:space="0" w:color="CCCCCC"/>
+              <w:left w:val="single" w:sz="1" w:space="0" w:color="CCCCCC"/>
+              <w:bottom w:val="single" w:sz="1" w:space="0" w:color="CCCCCC"/>
+              <w:right w:val="single" w:sz="1" w:space="0" w:color="CCCCCC"/>
+            </w:tcBorders>
+            <w:tcMar>
+              <w:top w:w="60" w:type="dxa"/>
+              <w:left w:w="100" w:type="dxa"/>
+              <w:bottom w:w="60" w:type="dxa"/>
+              <w:right w:w="100" w:type="dxa"/>
+            </w:tcMar>
+          </w:tcPr>
+          <w:p>
+            <w:pPr>
+              <w:keepNext/>
+              <w:keepLines/>
+            </w:pPr>
+            <w:r>
+              <w:rPr>
+                <w:color w:val="1B3A6B"/>
+              </w:rPr>
+              <w:t>{%tr endif %}</w:t>
+            </w:r>
+          </w:p>
+        </w:tc>
+        <w:tc>
+          <w:tcPr>
+            <w:tcW w:w="4080" w:type="dxa"/>
+            <w:tcBorders>
+              <w:top w:val="single" w:sz="1" w:space="0" w:color="CCCCCC"/>
+              <w:left w:val="single" w:sz="1" w:space="0" w:color="CCCCCC"/>
+              <w:bottom w:val="single" w:sz="1" w:space="0" w:color="CCCCCC"/>
+              <w:right w:val="single" w:sz="1" w:space="0" w:color="CCCCCC"/>
+            </w:tcBorders>
+            <w:tcMar>
+              <w:top w:w="60" w:type="dxa"/>
+              <w:left w:w="100" w:type="dxa"/>
+              <w:bottom w:w="60" w:type="dxa"/>
+              <w:right w:w="100" w:type="dxa"/>
+            </w:tcMar>
+          </w:tcPr>
+          <w:p>
+            <w:pPr>
+              <w:keepNext/>
+              <w:keepLines/>
+            </w:pPr>
+            <w:r>
+              <w:t/>
+            </w:r>
+          </w:p>
+        </w:tc>
+        <w:tc>
+          <w:tcPr>
+            <w:tcW w:w="4080" w:type="dxa"/>
+            <w:tcBorders>
+              <w:top w:val="single" w:sz="1" w:space="0" w:color="CCCCCC"/>
+              <w:left w:val="single" w:sz="1" w:space="0" w:color="CCCCCC"/>
+              <w:bottom w:val="single" w:sz="1" w:space="0" w:color="CCCCCC"/>
+              <w:right w:val="single" w:sz="1" w:space="0" w:color="CCCCCC"/>
+            </w:tcBorders>
+            <w:tcMar>
+              <w:top w:w="60" w:type="dxa"/>
+              <w:left w:w="100" w:type="dxa"/>
+              <w:bottom w:w="60" w:type="dxa"/>
+              <w:right w:w="100" w:type="dxa"/>
+            </w:tcMar>
+          </w:tcPr>
+          <w:p>
+            <w:pPr>
+              <w:keepNext/>
+              <w:keepLines/>
+            </w:pPr>
+            <w:r>
+              <w:t/>
+            </w:r>
           </w:p>
         </w:tc>
       </w:tr>
@@ -6368,10 +7319,8 @@
         <w:rPr>
           <w:color w:val="999999"/>
         </w:rPr>
-        <w:t xml:space="preserve">{% if has_dpoa_self_dealing_reviewer %}</w:t>
-      </w:r>
-      <w:proofErr w:type="spellStart"/>
-      <w:proofErr w:type="spellEnd"/>
+        <w:t>{% if has_dpoa_self_dealing_reviewer %}</w:t>
+      </w:r>
     </w:p>
     <w:p>
       <w:pPr>
@@ -6385,28 +7334,16 @@
         <w:t xml:space="preserve">Self-Dealing Reviewer: </w:t>
       </w:r>
       <w:r>
-        <w:t xml:space="preserve">{{ dpoa.self_dealing_reviewer.full_name }}</w:t>
-      </w:r>
-      <w:proofErr w:type="spellStart"/>
-      <w:proofErr w:type="spellEnd"/>
+        <w:t>{{ dpoa.self_dealing_reviewer.full_name }}</w:t>
+      </w:r>
       <w:r>
         <w:rPr>
           <w:color w:val="999999"/>
         </w:rPr>
-        <w:t xml:space="preserve">{% if has_dpoa_self_dealing_reviewer_alt %}</w:t>
-      </w:r>
-      <w:proofErr w:type="spellStart"/>
-      <w:proofErr w:type="spellEnd"/>
-      <w:r>
-        <w:t xml:space="preserve"> (Alternate: </w:t>
-      </w:r>
-      <w:r>
-        <w:t xml:space="preserve">{{ dpoa.self_dealing_reviewer_alt.full_name }}</w:t>
-      </w:r>
-      <w:proofErr w:type="spellStart"/>
-      <w:proofErr w:type="spellEnd"/>
-      <w:r>
-        <w:t>)</w:t>
+        <w:t>{% if has_dpoa_self_dealing_reviewer_alt %}</w:t>
+      </w:r>
+      <w:r>
+        <w:t xml:space="preserve"> (Alternate: {{ dpoa.self_dealing_reviewer_alt.full_name }})</w:t>
       </w:r>
       <w:r>
         <w:rPr>
@@ -6457,10 +7394,8 @@
         <w:rPr>
           <w:color w:val="999999"/>
         </w:rPr>
-        <w:t xml:space="preserve">{% if planning.include_hcp %}</w:t>
-      </w:r>
-      <w:proofErr w:type="spellStart"/>
-      <w:proofErr w:type="spellEnd"/>
+        <w:t>{% if planning.include_hcp %}</w:t>
+      </w:r>
     </w:p>
     <w:p>
       <w:pPr>
@@ -6543,12 +7478,6 @@
         <w:gridCol w:w="4280"/>
       </w:tblGrid>
       <w:tr>
-        <w:tblPrEx>
-          <w:tblCellMar>
-            <w:top w:w="0" w:type="dxa"/>
-            <w:bottom w:w="0" w:type="dxa"/>
-          </w:tblCellMar>
-        </w:tblPrEx>
         <w:trPr>
           <w:cantSplit/>
         </w:trPr>
@@ -6605,10 +7534,8 @@
                 <w:bCs/>
                 <w:color w:val="FFFFFF"/>
               </w:rPr>
-              <w:t xml:space="preserve">{{ client.full_name }}</w:t>
-            </w:r>
-            <w:proofErr w:type="spellStart"/>
-            <w:proofErr w:type="spellEnd"/>
+              <w:t>{{ client.full_name }}</w:t>
+            </w:r>
           </w:p>
         </w:tc>
         <w:tc>
@@ -6640,22 +7567,12 @@
                 <w:bCs/>
                 <w:color w:val="FFFFFF"/>
               </w:rPr>
-              <w:t xml:space="preserve">{% if has_spouse %}{{ spouse.full_name }}{% endif %}</w:t>
-            </w:r>
-            <w:proofErr w:type="spellStart"/>
-            <w:proofErr w:type="spellEnd"/>
-            <w:proofErr w:type="spellStart"/>
-            <w:proofErr w:type="spellEnd"/>
+              <w:t>{% if has_spouse %}{{ spouse.full_name }}{% endif %}</w:t>
+            </w:r>
           </w:p>
         </w:tc>
       </w:tr>
       <w:tr>
-        <w:tblPrEx>
-          <w:tblCellMar>
-            <w:top w:w="0" w:type="dxa"/>
-            <w:bottom w:w="0" w:type="dxa"/>
-          </w:tblCellMar>
-        </w:tblPrEx>
         <w:trPr>
           <w:cantSplit/>
         </w:trPr>
@@ -6684,7 +7601,7 @@
               <w:rPr>
                 <w:color w:val="1B3A6B"/>
               </w:rPr>
-              <w:t>1.</w:t>
+              <w:t>{%tr if healthcare.agent.primary.full_name or healthcare.spouse_agent.primary.full_name %}</w:t>
             </w:r>
           </w:p>
         </w:tc>
@@ -6710,10 +7627,8 @@
               <w:keepLines/>
             </w:pPr>
             <w:r>
-              <w:t xml:space="preserve">{{ healthcare.agent.primary.full_name }}</w:t>
-            </w:r>
-            <w:proofErr w:type="spellStart"/>
-            <w:proofErr w:type="spellEnd"/>
+              <w:t/>
+            </w:r>
           </w:p>
         </w:tc>
         <w:tc>
@@ -6738,22 +7653,12 @@
               <w:keepLines/>
             </w:pPr>
             <w:r>
-              <w:t xml:space="preserve">{% if has_spouse %}{{ healthcare.spouse_agent.primary.full_name }}{% endif %}</w:t>
-            </w:r>
-            <w:proofErr w:type="spellStart"/>
-            <w:proofErr w:type="spellEnd"/>
-            <w:proofErr w:type="spellStart"/>
-            <w:proofErr w:type="spellEnd"/>
+              <w:t/>
+            </w:r>
           </w:p>
         </w:tc>
       </w:tr>
       <w:tr>
-        <w:tblPrEx>
-          <w:tblCellMar>
-            <w:top w:w="0" w:type="dxa"/>
-            <w:bottom w:w="0" w:type="dxa"/>
-          </w:tblCellMar>
-        </w:tblPrEx>
         <w:trPr>
           <w:cantSplit/>
         </w:trPr>
@@ -6782,6 +7687,264 @@
               <w:rPr>
                 <w:color w:val="1B3A6B"/>
               </w:rPr>
+              <w:t>1.</w:t>
+            </w:r>
+          </w:p>
+        </w:tc>
+        <w:tc>
+          <w:tcPr>
+            <w:tcW w:w="4080" w:type="dxa"/>
+            <w:tcBorders>
+              <w:top w:val="single" w:sz="1" w:space="0" w:color="CCCCCC"/>
+              <w:left w:val="single" w:sz="1" w:space="0" w:color="CCCCCC"/>
+              <w:bottom w:val="single" w:sz="1" w:space="0" w:color="CCCCCC"/>
+              <w:right w:val="single" w:sz="1" w:space="0" w:color="CCCCCC"/>
+            </w:tcBorders>
+            <w:tcMar>
+              <w:top w:w="60" w:type="dxa"/>
+              <w:left w:w="100" w:type="dxa"/>
+              <w:bottom w:w="60" w:type="dxa"/>
+              <w:right w:w="100" w:type="dxa"/>
+            </w:tcMar>
+          </w:tcPr>
+          <w:p>
+            <w:pPr>
+              <w:keepNext/>
+              <w:keepLines/>
+            </w:pPr>
+            <w:r>
+              <w:t>{{ healthcare.agent.primary.full_name }}</w:t>
+            </w:r>
+          </w:p>
+        </w:tc>
+        <w:tc>
+          <w:tcPr>
+            <w:tcW w:w="4080" w:type="dxa"/>
+            <w:tcBorders>
+              <w:top w:val="single" w:sz="1" w:space="0" w:color="CCCCCC"/>
+              <w:left w:val="single" w:sz="1" w:space="0" w:color="CCCCCC"/>
+              <w:bottom w:val="single" w:sz="1" w:space="0" w:color="CCCCCC"/>
+              <w:right w:val="single" w:sz="1" w:space="0" w:color="CCCCCC"/>
+            </w:tcBorders>
+            <w:tcMar>
+              <w:top w:w="60" w:type="dxa"/>
+              <w:left w:w="100" w:type="dxa"/>
+              <w:bottom w:w="60" w:type="dxa"/>
+              <w:right w:w="100" w:type="dxa"/>
+            </w:tcMar>
+          </w:tcPr>
+          <w:p>
+            <w:pPr>
+              <w:keepNext/>
+              <w:keepLines/>
+            </w:pPr>
+            <w:r>
+              <w:t>{% if has_spouse %}{{ healthcare.spouse_agent.primary.full_name }}{% endif %}</w:t>
+            </w:r>
+          </w:p>
+        </w:tc>
+      </w:tr>
+      <w:tr>
+        <w:trPr>
+          <w:cantSplit/>
+        </w:trPr>
+        <w:tc>
+          <w:tcPr>
+            <w:tcW w:w="1200" w:type="dxa"/>
+            <w:tcBorders>
+              <w:top w:val="single" w:sz="1" w:space="0" w:color="CCCCCC"/>
+              <w:left w:val="single" w:sz="1" w:space="0" w:color="CCCCCC"/>
+              <w:bottom w:val="single" w:sz="1" w:space="0" w:color="CCCCCC"/>
+              <w:right w:val="single" w:sz="1" w:space="0" w:color="CCCCCC"/>
+            </w:tcBorders>
+            <w:tcMar>
+              <w:top w:w="60" w:type="dxa"/>
+              <w:left w:w="100" w:type="dxa"/>
+              <w:bottom w:w="60" w:type="dxa"/>
+              <w:right w:w="100" w:type="dxa"/>
+            </w:tcMar>
+          </w:tcPr>
+          <w:p>
+            <w:pPr>
+              <w:keepNext/>
+              <w:keepLines/>
+            </w:pPr>
+            <w:r>
+              <w:rPr>
+                <w:color w:val="1B3A6B"/>
+              </w:rPr>
+              <w:t>{%tr endif %}</w:t>
+            </w:r>
+          </w:p>
+        </w:tc>
+        <w:tc>
+          <w:tcPr>
+            <w:tcW w:w="4080" w:type="dxa"/>
+            <w:tcBorders>
+              <w:top w:val="single" w:sz="1" w:space="0" w:color="CCCCCC"/>
+              <w:left w:val="single" w:sz="1" w:space="0" w:color="CCCCCC"/>
+              <w:bottom w:val="single" w:sz="1" w:space="0" w:color="CCCCCC"/>
+              <w:right w:val="single" w:sz="1" w:space="0" w:color="CCCCCC"/>
+            </w:tcBorders>
+            <w:tcMar>
+              <w:top w:w="60" w:type="dxa"/>
+              <w:left w:w="100" w:type="dxa"/>
+              <w:bottom w:w="60" w:type="dxa"/>
+              <w:right w:w="100" w:type="dxa"/>
+            </w:tcMar>
+          </w:tcPr>
+          <w:p>
+            <w:pPr>
+              <w:keepNext/>
+              <w:keepLines/>
+            </w:pPr>
+            <w:r>
+              <w:t/>
+            </w:r>
+          </w:p>
+        </w:tc>
+        <w:tc>
+          <w:tcPr>
+            <w:tcW w:w="4080" w:type="dxa"/>
+            <w:tcBorders>
+              <w:top w:val="single" w:sz="1" w:space="0" w:color="CCCCCC"/>
+              <w:left w:val="single" w:sz="1" w:space="0" w:color="CCCCCC"/>
+              <w:bottom w:val="single" w:sz="1" w:space="0" w:color="CCCCCC"/>
+              <w:right w:val="single" w:sz="1" w:space="0" w:color="CCCCCC"/>
+            </w:tcBorders>
+            <w:tcMar>
+              <w:top w:w="60" w:type="dxa"/>
+              <w:left w:w="100" w:type="dxa"/>
+              <w:bottom w:w="60" w:type="dxa"/>
+              <w:right w:w="100" w:type="dxa"/>
+            </w:tcMar>
+          </w:tcPr>
+          <w:p>
+            <w:pPr>
+              <w:keepNext/>
+              <w:keepLines/>
+            </w:pPr>
+            <w:r>
+              <w:t/>
+            </w:r>
+          </w:p>
+        </w:tc>
+      </w:tr>
+      <w:tr>
+        <w:trPr>
+          <w:cantSplit/>
+        </w:trPr>
+        <w:tc>
+          <w:tcPr>
+            <w:tcW w:w="1200" w:type="dxa"/>
+            <w:tcBorders>
+              <w:top w:val="single" w:sz="1" w:space="0" w:color="CCCCCC"/>
+              <w:left w:val="single" w:sz="1" w:space="0" w:color="CCCCCC"/>
+              <w:bottom w:val="single" w:sz="1" w:space="0" w:color="CCCCCC"/>
+              <w:right w:val="single" w:sz="1" w:space="0" w:color="CCCCCC"/>
+            </w:tcBorders>
+            <w:tcMar>
+              <w:top w:w="60" w:type="dxa"/>
+              <w:left w:w="100" w:type="dxa"/>
+              <w:bottom w:w="60" w:type="dxa"/>
+              <w:right w:w="100" w:type="dxa"/>
+            </w:tcMar>
+          </w:tcPr>
+          <w:p>
+            <w:pPr>
+              <w:keepNext/>
+              <w:keepLines/>
+            </w:pPr>
+            <w:r>
+              <w:rPr>
+                <w:color w:val="1B3A6B"/>
+              </w:rPr>
+              <w:t>{%tr if healthcare.agent.alternate.full_name or healthcare.spouse_agent.alternate.full_name %}</w:t>
+            </w:r>
+          </w:p>
+        </w:tc>
+        <w:tc>
+          <w:tcPr>
+            <w:tcW w:w="4080" w:type="dxa"/>
+            <w:tcBorders>
+              <w:top w:val="single" w:sz="1" w:space="0" w:color="CCCCCC"/>
+              <w:left w:val="single" w:sz="1" w:space="0" w:color="CCCCCC"/>
+              <w:bottom w:val="single" w:sz="1" w:space="0" w:color="CCCCCC"/>
+              <w:right w:val="single" w:sz="1" w:space="0" w:color="CCCCCC"/>
+            </w:tcBorders>
+            <w:tcMar>
+              <w:top w:w="60" w:type="dxa"/>
+              <w:left w:w="100" w:type="dxa"/>
+              <w:bottom w:w="60" w:type="dxa"/>
+              <w:right w:w="100" w:type="dxa"/>
+            </w:tcMar>
+          </w:tcPr>
+          <w:p>
+            <w:pPr>
+              <w:keepNext/>
+              <w:keepLines/>
+            </w:pPr>
+            <w:r>
+              <w:t/>
+            </w:r>
+          </w:p>
+        </w:tc>
+        <w:tc>
+          <w:tcPr>
+            <w:tcW w:w="4080" w:type="dxa"/>
+            <w:tcBorders>
+              <w:top w:val="single" w:sz="1" w:space="0" w:color="CCCCCC"/>
+              <w:left w:val="single" w:sz="1" w:space="0" w:color="CCCCCC"/>
+              <w:bottom w:val="single" w:sz="1" w:space="0" w:color="CCCCCC"/>
+              <w:right w:val="single" w:sz="1" w:space="0" w:color="CCCCCC"/>
+            </w:tcBorders>
+            <w:tcMar>
+              <w:top w:w="60" w:type="dxa"/>
+              <w:left w:w="100" w:type="dxa"/>
+              <w:bottom w:w="60" w:type="dxa"/>
+              <w:right w:w="100" w:type="dxa"/>
+            </w:tcMar>
+          </w:tcPr>
+          <w:p>
+            <w:pPr>
+              <w:keepNext/>
+              <w:keepLines/>
+            </w:pPr>
+            <w:r>
+              <w:t/>
+            </w:r>
+          </w:p>
+        </w:tc>
+      </w:tr>
+      <w:tr>
+        <w:trPr>
+          <w:cantSplit/>
+        </w:trPr>
+        <w:tc>
+          <w:tcPr>
+            <w:tcW w:w="1200" w:type="dxa"/>
+            <w:tcBorders>
+              <w:top w:val="single" w:sz="1" w:space="0" w:color="CCCCCC"/>
+              <w:left w:val="single" w:sz="1" w:space="0" w:color="CCCCCC"/>
+              <w:bottom w:val="single" w:sz="1" w:space="0" w:color="CCCCCC"/>
+              <w:right w:val="single" w:sz="1" w:space="0" w:color="CCCCCC"/>
+            </w:tcBorders>
+            <w:tcMar>
+              <w:top w:w="60" w:type="dxa"/>
+              <w:left w:w="100" w:type="dxa"/>
+              <w:bottom w:w="60" w:type="dxa"/>
+              <w:right w:w="100" w:type="dxa"/>
+            </w:tcMar>
+          </w:tcPr>
+          <w:p>
+            <w:pPr>
+              <w:keepNext/>
+              <w:keepLines/>
+            </w:pPr>
+            <w:r>
+              <w:rPr>
+                <w:color w:val="1B3A6B"/>
+              </w:rPr>
               <w:t>2.</w:t>
             </w:r>
           </w:p>
@@ -6808,10 +7971,8 @@
               <w:keepLines/>
             </w:pPr>
             <w:r>
-              <w:t xml:space="preserve">{{ healthcare.agent.alternate.full_name }}</w:t>
-            </w:r>
-            <w:proofErr w:type="spellStart"/>
-            <w:proofErr w:type="spellEnd"/>
+              <w:t>{{ healthcare.agent.alternate.full_name }}</w:t>
+            </w:r>
           </w:p>
         </w:tc>
         <w:tc>
@@ -6836,12 +7997,94 @@
               <w:keepLines/>
             </w:pPr>
             <w:r>
-              <w:t xml:space="preserve">{% if has_spouse %}{{ healthcare.spouse_agent.alternate.full_name }}{% endif %}</w:t>
-            </w:r>
-            <w:proofErr w:type="spellStart"/>
-            <w:proofErr w:type="spellEnd"/>
-            <w:proofErr w:type="spellStart"/>
-            <w:proofErr w:type="spellEnd"/>
+              <w:t>{% if has_spouse %}{{ healthcare.spouse_agent.alternate.full_name }}{% endif %}</w:t>
+            </w:r>
+          </w:p>
+        </w:tc>
+      </w:tr>
+      <w:tr>
+        <w:trPr>
+          <w:cantSplit/>
+        </w:trPr>
+        <w:tc>
+          <w:tcPr>
+            <w:tcW w:w="1200" w:type="dxa"/>
+            <w:tcBorders>
+              <w:top w:val="single" w:sz="1" w:space="0" w:color="CCCCCC"/>
+              <w:left w:val="single" w:sz="1" w:space="0" w:color="CCCCCC"/>
+              <w:bottom w:val="single" w:sz="1" w:space="0" w:color="CCCCCC"/>
+              <w:right w:val="single" w:sz="1" w:space="0" w:color="CCCCCC"/>
+            </w:tcBorders>
+            <w:tcMar>
+              <w:top w:w="60" w:type="dxa"/>
+              <w:left w:w="100" w:type="dxa"/>
+              <w:bottom w:w="60" w:type="dxa"/>
+              <w:right w:w="100" w:type="dxa"/>
+            </w:tcMar>
+          </w:tcPr>
+          <w:p>
+            <w:pPr>
+              <w:keepNext/>
+              <w:keepLines/>
+            </w:pPr>
+            <w:r>
+              <w:rPr>
+                <w:color w:val="1B3A6B"/>
+              </w:rPr>
+              <w:t>{%tr endif %}</w:t>
+            </w:r>
+          </w:p>
+        </w:tc>
+        <w:tc>
+          <w:tcPr>
+            <w:tcW w:w="4080" w:type="dxa"/>
+            <w:tcBorders>
+              <w:top w:val="single" w:sz="1" w:space="0" w:color="CCCCCC"/>
+              <w:left w:val="single" w:sz="1" w:space="0" w:color="CCCCCC"/>
+              <w:bottom w:val="single" w:sz="1" w:space="0" w:color="CCCCCC"/>
+              <w:right w:val="single" w:sz="1" w:space="0" w:color="CCCCCC"/>
+            </w:tcBorders>
+            <w:tcMar>
+              <w:top w:w="60" w:type="dxa"/>
+              <w:left w:w="100" w:type="dxa"/>
+              <w:bottom w:w="60" w:type="dxa"/>
+              <w:right w:w="100" w:type="dxa"/>
+            </w:tcMar>
+          </w:tcPr>
+          <w:p>
+            <w:pPr>
+              <w:keepNext/>
+              <w:keepLines/>
+            </w:pPr>
+            <w:r>
+              <w:t/>
+            </w:r>
+          </w:p>
+        </w:tc>
+        <w:tc>
+          <w:tcPr>
+            <w:tcW w:w="4080" w:type="dxa"/>
+            <w:tcBorders>
+              <w:top w:val="single" w:sz="1" w:space="0" w:color="CCCCCC"/>
+              <w:left w:val="single" w:sz="1" w:space="0" w:color="CCCCCC"/>
+              <w:bottom w:val="single" w:sz="1" w:space="0" w:color="CCCCCC"/>
+              <w:right w:val="single" w:sz="1" w:space="0" w:color="CCCCCC"/>
+            </w:tcBorders>
+            <w:tcMar>
+              <w:top w:w="60" w:type="dxa"/>
+              <w:left w:w="100" w:type="dxa"/>
+              <w:bottom w:w="60" w:type="dxa"/>
+              <w:right w:w="100" w:type="dxa"/>
+            </w:tcMar>
+          </w:tcPr>
+          <w:p>
+            <w:pPr>
+              <w:keepNext/>
+              <w:keepLines/>
+            </w:pPr>
+            <w:r>
+              <w:t/>
+            </w:r>
           </w:p>
         </w:tc>
       </w:tr>
@@ -6851,10 +8094,8 @@
         <w:rPr>
           <w:color w:val="999999"/>
         </w:rPr>
-        <w:t xml:space="preserve">{% if hcp_anatomical_all %}</w:t>
-      </w:r>
-      <w:proofErr w:type="spellStart"/>
-      <w:proofErr w:type="spellEnd"/>
+        <w:t>{% if hcp_anatomical_all %}</w:t>
+      </w:r>
     </w:p>
     <w:p>
       <w:pPr>
@@ -6884,10 +8125,8 @@
         <w:rPr>
           <w:color w:val="999999"/>
         </w:rPr>
-        <w:t xml:space="preserve">{% if hcp_anatomical_specified %}</w:t>
-      </w:r>
-      <w:proofErr w:type="spellStart"/>
-      <w:proofErr w:type="spellEnd"/>
+        <w:t>{% if hcp_anatomical_specified %}</w:t>
+      </w:r>
     </w:p>
     <w:p>
       <w:pPr>
@@ -6901,13 +8140,8 @@
         <w:t xml:space="preserve">Anatomical Gift: </w:t>
       </w:r>
       <w:r>
-        <w:t xml:space="preserve">Donate specific organs/tissues: </w:t>
-      </w:r>
-      <w:r>
-        <w:t xml:space="preserve">{{ healthcare.anatomical_specified }}</w:t>
-      </w:r>
-      <w:proofErr w:type="spellStart"/>
-      <w:proofErr w:type="spellEnd"/>
+        <w:t>Donate specific organs/tissues: {{ healthcare.anatomical_specified }}</w:t>
+      </w:r>
     </w:p>
     <w:p>
       <w:r>
@@ -6922,10 +8156,8 @@
         <w:rPr>
           <w:color w:val="999999"/>
         </w:rPr>
-        <w:t xml:space="preserve">{% if hcp_anatomical_none %}</w:t>
-      </w:r>
-      <w:proofErr w:type="spellStart"/>
-      <w:proofErr w:type="spellEnd"/>
+        <w:t>{% if hcp_anatomical_none %}</w:t>
+      </w:r>
     </w:p>
     <w:p>
       <w:pPr>
@@ -6963,10 +8195,8 @@
         <w:rPr>
           <w:color w:val="999999"/>
         </w:rPr>
-        <w:t xml:space="preserve">{% if planning.include_ahd %}</w:t>
-      </w:r>
-      <w:proofErr w:type="spellStart"/>
-      <w:proofErr w:type="spellEnd"/>
+        <w:t>{% if planning.include_ahd %}</w:t>
+      </w:r>
     </w:p>
     <w:p>
       <w:pPr>
@@ -7069,10 +8299,8 @@
         <w:rPr>
           <w:color w:val="999999"/>
         </w:rPr>
-        <w:t xml:space="preserve">{% if planning.include_hipaa %}</w:t>
-      </w:r>
-      <w:proofErr w:type="spellStart"/>
-      <w:proofErr w:type="spellEnd"/>
+        <w:t>{% if planning.include_hipaa %}</w:t>
+      </w:r>
     </w:p>
     <w:p>
       <w:pPr>
@@ -7121,10 +8349,8 @@
         <w:rPr>
           <w:color w:val="999999"/>
         </w:rPr>
-        <w:t xml:space="preserve">{% if hipaa_psychotherapy_authorized %}</w:t>
-      </w:r>
-      <w:proofErr w:type="spellStart"/>
-      <w:proofErr w:type="spellEnd"/>
+        <w:t>{% if hipaa_psychotherapy_authorized %}</w:t>
+      </w:r>
     </w:p>
     <w:p>
       <w:pPr>
@@ -7210,10 +8436,8 @@
         <w:rPr>
           <w:color w:val="999999"/>
         </w:rPr>
-        <w:t xml:space="preserve">{% for person in important_persons %}</w:t>
-      </w:r>
-      <w:proofErr w:type="spellStart"/>
-      <w:proofErr w:type="spellEnd"/>
+        <w:t>{% for person in important_persons %}</w:t>
+      </w:r>
     </w:p>
     <w:tbl>
       <w:tblPr>
@@ -7237,12 +8461,6 @@
         <w:gridCol w:w="6560"/>
       </w:tblGrid>
       <w:tr>
-        <w:tblPrEx>
-          <w:tblCellMar>
-            <w:top w:w="0" w:type="dxa"/>
-            <w:bottom w:w="0" w:type="dxa"/>
-          </w:tblCellMar>
-        </w:tblPrEx>
         <w:trPr>
           <w:cantSplit/>
         </w:trPr>
@@ -7300,20 +8518,12 @@
               <w:keepLines/>
             </w:pPr>
             <w:r>
-              <w:t xml:space="preserve">{{ person.full_name }}</w:t>
-            </w:r>
-            <w:proofErr w:type="spellStart"/>
-            <w:proofErr w:type="spellEnd"/>
+              <w:t>{{ person.full_name }}</w:t>
+            </w:r>
           </w:p>
         </w:tc>
       </w:tr>
       <w:tr>
-        <w:tblPrEx>
-          <w:tblCellMar>
-            <w:top w:w="0" w:type="dxa"/>
-            <w:bottom w:w="0" w:type="dxa"/>
-          </w:tblCellMar>
-        </w:tblPrEx>
         <w:trPr>
           <w:cantSplit/>
         </w:trPr>
@@ -7371,20 +8581,12 @@
               <w:keepLines/>
             </w:pPr>
             <w:r>
-              <w:t xml:space="preserve">{{ person.related_to }}</w:t>
-            </w:r>
-            <w:proofErr w:type="spellStart"/>
-            <w:proofErr w:type="spellEnd"/>
+              <w:t>{{ person.related_to }}</w:t>
+            </w:r>
           </w:p>
         </w:tc>
       </w:tr>
       <w:tr>
-        <w:tblPrEx>
-          <w:tblCellMar>
-            <w:top w:w="0" w:type="dxa"/>
-            <w:bottom w:w="0" w:type="dxa"/>
-          </w:tblCellMar>
-        </w:tblPrEx>
         <w:trPr>
           <w:cantSplit/>
         </w:trPr>
@@ -7442,20 +8644,12 @@
               <w:keepLines/>
             </w:pPr>
             <w:r>
-              <w:t xml:space="preserve">{{ person.relationship }}</w:t>
-            </w:r>
-            <w:proofErr w:type="spellStart"/>
-            <w:proofErr w:type="spellEnd"/>
+              <w:t>{{ person.relationship }}</w:t>
+            </w:r>
           </w:p>
         </w:tc>
       </w:tr>
       <w:tr>
-        <w:tblPrEx>
-          <w:tblCellMar>
-            <w:top w:w="0" w:type="dxa"/>
-            <w:bottom w:w="0" w:type="dxa"/>
-          </w:tblCellMar>
-        </w:tblPrEx>
         <w:trPr>
           <w:cantSplit/>
         </w:trPr>
@@ -7513,20 +8707,12 @@
               <w:keepLines/>
             </w:pPr>
             <w:r>
-              <w:t xml:space="preserve">{{ person.address }}</w:t>
-            </w:r>
-            <w:proofErr w:type="spellStart"/>
-            <w:proofErr w:type="spellEnd"/>
+              <w:t>{{ person.address }}</w:t>
+            </w:r>
           </w:p>
         </w:tc>
       </w:tr>
       <w:tr>
-        <w:tblPrEx>
-          <w:tblCellMar>
-            <w:top w:w="0" w:type="dxa"/>
-            <w:bottom w:w="0" w:type="dxa"/>
-          </w:tblCellMar>
-        </w:tblPrEx>
         <w:trPr>
           <w:cantSplit/>
         </w:trPr>
@@ -7584,10 +8770,8 @@
               <w:keepLines/>
             </w:pPr>
             <w:r>
-              <w:t xml:space="preserve">{{ person.phone }}</w:t>
-            </w:r>
-            <w:proofErr w:type="spellStart"/>
-            <w:proofErr w:type="spellEnd"/>
+              <w:t>{{ person.phone }}</w:t>
+            </w:r>
           </w:p>
         </w:tc>
       </w:tr>
@@ -7597,20 +8781,16 @@
         <w:rPr>
           <w:color w:val="999999"/>
         </w:rPr>
-        <w:t xml:space="preserve">{% endfor %}</w:t>
-      </w:r>
-      <w:proofErr w:type="spellStart"/>
-      <w:proofErr w:type="spellEnd"/>
+        <w:t>{% endfor %}</w:t>
+      </w:r>
     </w:p>
     <w:p>
       <w:r>
         <w:rPr>
           <w:color w:val="999999"/>
         </w:rPr>
-        <w:t xml:space="preserve">{% if planning.include_trust %}</w:t>
-      </w:r>
-      <w:proofErr w:type="spellStart"/>
-      <w:proofErr w:type="spellEnd"/>
+        <w:t>{% if planning.include_trust %}</w:t>
+      </w:r>
     </w:p>
     <w:p>
       <w:pPr>
@@ -7644,10 +8824,8 @@
         <w:rPr>
           <w:color w:val="999999"/>
         </w:rPr>
-        <w:t xml:space="preserve">{% if owns_real_property %}</w:t>
-      </w:r>
-      <w:proofErr w:type="spellStart"/>
-      <w:proofErr w:type="spellEnd"/>
+        <w:t>{% if owns_real_property %}</w:t>
+      </w:r>
     </w:p>
     <w:p>
       <w:pPr>
@@ -7779,12 +8957,6 @@
         <w:gridCol w:w="4680"/>
       </w:tblGrid>
       <w:tr>
-        <w:tblPrEx>
-          <w:tblCellMar>
-            <w:top w:w="0" w:type="dxa"/>
-            <w:bottom w:w="0" w:type="dxa"/>
-          </w:tblCellMar>
-        </w:tblPrEx>
         <w:trPr>
           <w:cantSplit/>
         </w:trPr>
@@ -7832,12 +9004,6 @@
         </w:tc>
       </w:tr>
       <w:tr>
-        <w:tblPrEx>
-          <w:tblCellMar>
-            <w:top w:w="0" w:type="dxa"/>
-            <w:bottom w:w="0" w:type="dxa"/>
-          </w:tblCellMar>
-        </w:tblPrEx>
         <w:trPr>
           <w:cantSplit/>
         </w:trPr>
@@ -7860,14 +9026,8 @@
               <w:rPr>
                 <w:color w:val="999999"/>
               </w:rPr>
-              <w:t xml:space="preserve">{% if has_spouse %}{{ client.full_name }}{% else %}{{ client.full_name }}{% endif %}</w:t>
-            </w:r>
-            <w:proofErr w:type="spellStart"/>
-            <w:proofErr w:type="spellEnd"/>
-            <w:proofErr w:type="spellStart"/>
-            <w:proofErr w:type="spellEnd"/>
-            <w:proofErr w:type="spellStart"/>
-            <w:proofErr w:type="spellEnd"/>
+              <w:t>{% if has_spouse %}{{ client.full_name }}{% else %}{{ client.full_name }}{% endif %}</w:t>
+            </w:r>
           </w:p>
         </w:tc>
         <w:tc>
@@ -7897,10 +9057,8 @@
         <w:rPr>
           <w:color w:val="999999"/>
         </w:rPr>
-        <w:t xml:space="preserve">{% if has_spouse %}</w:t>
-      </w:r>
-      <w:proofErr w:type="spellStart"/>
-      <w:proofErr w:type="spellEnd"/>
+        <w:t>{% if has_spouse %}</w:t>
+      </w:r>
     </w:p>
     <w:tbl>
       <w:tblPr>
@@ -7924,12 +9082,6 @@
         <w:gridCol w:w="4680"/>
       </w:tblGrid>
       <w:tr>
-        <w:tblPrEx>
-          <w:tblCellMar>
-            <w:top w:w="0" w:type="dxa"/>
-            <w:bottom w:w="0" w:type="dxa"/>
-          </w:tblCellMar>
-        </w:tblPrEx>
         <w:trPr>
           <w:cantSplit/>
         </w:trPr>
@@ -7977,12 +9129,6 @@
         </w:tc>
       </w:tr>
       <w:tr>
-        <w:tblPrEx>
-          <w:tblCellMar>
-            <w:top w:w="0" w:type="dxa"/>
-            <w:bottom w:w="0" w:type="dxa"/>
-          </w:tblCellMar>
-        </w:tblPrEx>
         <w:trPr>
           <w:cantSplit/>
         </w:trPr>
@@ -8002,10 +9148,8 @@
               <w:keepLines/>
             </w:pPr>
             <w:r>
-              <w:t xml:space="preserve">{{ spouse.full_name }}</w:t>
-            </w:r>
-            <w:proofErr w:type="spellStart"/>
-            <w:proofErr w:type="spellEnd"/>
+              <w:t>{{ spouse.full_name }}</w:t>
+            </w:r>
           </w:p>
         </w:tc>
         <w:tc>
@@ -8051,7 +9195,7 @@
 </file>
 
 <file path=word/endnotes.xml><?xml version="1.0" encoding="utf-8"?>
-<w:endnotes xmlns:wpc="http://schemas.microsoft.com/office/word/2010/wordprocessingCanvas" xmlns:cx="http://schemas.microsoft.com/office/drawing/2014/chartex" xmlns:cx1="http://schemas.microsoft.com/office/drawing/2015/9/8/chartex" xmlns:cx2="http://schemas.microsoft.com/office/drawing/2015/10/21/chartex" xmlns:cx3="http://schemas.microsoft.com/office/drawing/2016/5/9/chartex" xmlns:cx4="http://schemas.microsoft.com/office/drawing/2016/5/10/chartex" xmlns:cx5="http://schemas.microsoft.com/office/drawing/2016/5/11/chartex" xmlns:cx6="http://schemas.microsoft.com/office/drawing/2016/5/12/chartex" xmlns:cx7="http://schemas.microsoft.com/office/drawing/2016/5/13/chartex" xmlns:cx8="http://schemas.microsoft.com/office/drawing/2016/5/14/chartex" xmlns:mc="http://schemas.openxmlformats.org/markup-compatibility/2006" xmlns:aink="http://schemas.microsoft.com/office/drawing/2016/ink" xmlns:am3d="http://schemas.microsoft.com/office/drawing/2017/model3d" xmlns:o="urn:schemas-microsoft-com:office:office" xmlns:oel="http://schemas.microsoft.com/office/2019/extlst" xmlns:r="http://schemas.openxmlformats.org/officeDocument/2006/relationships" xmlns:m="http://schemas.openxmlformats.org/officeDocument/2006/math" xmlns:v="urn:schemas-microsoft-com:vml" xmlns:wp14="http://schemas.microsoft.com/office/word/2010/wordprocessingDrawing" xmlns:wp="http://schemas.openxmlformats.org/drawingml/2006/wordprocessingDrawing" xmlns:w10="urn:schemas-microsoft-com:office:word" xmlns:w="http://schemas.openxmlformats.org/wordprocessingml/2006/main" xmlns:w14="http://schemas.microsoft.com/office/word/2010/wordml" xmlns:w15="http://schemas.microsoft.com/office/word/2012/wordml" xmlns:w16cex="http://schemas.microsoft.com/office/word/2018/wordml/cex" xmlns:w16cid="http://schemas.microsoft.com/office/word/2016/wordml/cid" xmlns:w16="http://schemas.microsoft.com/office/word/2018/wordml" xmlns:w16du="http://schemas.microsoft.com/office/word/2023/wordml/word16du" xmlns:w16sdtdh="http://schemas.microsoft.com/office/word/2020/wordml/sdtdatahash" xmlns:w16sdtfl="http://schemas.microsoft.com/office/word/2024/wordml/sdtformatlock" xmlns:w16se="http://schemas.microsoft.com/office/word/2015/wordml/symex" xmlns:wpg="http://schemas.microsoft.com/office/word/2010/wordprocessingGroup" xmlns:wpi="http://schemas.microsoft.com/office/word/2010/wordprocessingInk" xmlns:wne="http://schemas.microsoft.com/office/word/2006/wordml" xmlns:wps="http://schemas.microsoft.com/office/word/2010/wordprocessingShape" mc:Ignorable="w14 w15 w16se w16cid w16 w16cex w16sdtdh w16sdtfl w16du wp14">
+<w:endnotes xmlns:wpc="http://schemas.microsoft.com/office/word/2010/wordprocessingCanvas" xmlns:cx="http://schemas.microsoft.com/office/drawing/2014/chartex" xmlns:cx1="http://schemas.microsoft.com/office/drawing/2015/9/8/chartex" xmlns:cx2="http://schemas.microsoft.com/office/drawing/2015/10/21/chartex" xmlns:cx3="http://schemas.microsoft.com/office/drawing/2016/5/9/chartex" xmlns:cx4="http://schemas.microsoft.com/office/drawing/2016/5/10/chartex" xmlns:cx5="http://schemas.microsoft.com/office/drawing/2016/5/11/chartex" xmlns:cx6="http://schemas.microsoft.com/office/drawing/2016/5/12/chartex" xmlns:cx7="http://schemas.microsoft.com/office/drawing/2016/5/13/chartex" xmlns:cx8="http://schemas.microsoft.com/office/drawing/2016/5/14/chartex" xmlns:mc="http://schemas.openxmlformats.org/markup-compatibility/2006" xmlns:m="http://schemas.openxmlformats.org/officeDocument/2006/math" xmlns:aink="http://schemas.microsoft.com/office/drawing/2016/ink" xmlns:am3d="http://schemas.microsoft.com/office/drawing/2017/model3d" xmlns:oel="http://schemas.microsoft.com/office/2019/extlst" xmlns:r="http://schemas.openxmlformats.org/officeDocument/2006/relationships" xmlns:wp14="http://schemas.microsoft.com/office/word/2010/wordprocessingDrawing" xmlns:wp="http://schemas.openxmlformats.org/drawingml/2006/wordprocessingDrawing" xmlns:wpg="http://schemas.microsoft.com/office/word/2010/wordprocessingGroup" xmlns:wpi="http://schemas.microsoft.com/office/word/2010/wordprocessingInk" xmlns:wps="http://schemas.microsoft.com/office/word/2010/wordprocessingShape" xmlns:o="urn:schemas-microsoft-com:office:office" xmlns:v="urn:schemas-microsoft-com:vml" xmlns:w10="urn:schemas-microsoft-com:office:word" xmlns:w="http://schemas.openxmlformats.org/wordprocessingml/2006/main" xmlns:w14="http://schemas.microsoft.com/office/word/2010/wordml" xmlns:w15="http://schemas.microsoft.com/office/word/2012/wordml" xmlns:w16cex="http://schemas.microsoft.com/office/word/2018/wordml/cex" xmlns:w16cid="http://schemas.microsoft.com/office/word/2016/wordml/cid" xmlns:w16="http://schemas.microsoft.com/office/word/2018/wordml" xmlns:w16sdtdh="http://schemas.microsoft.com/office/word/2020/wordml/sdtdatahash" xmlns:w16sdtfl="http://schemas.microsoft.com/office/word/2024/wordml/sdtformatlock" xmlns:w16se="http://schemas.microsoft.com/office/word/2015/wordml/symex" xmlns:w16du="http://schemas.microsoft.com/office/word/2023/wordml/word16du" xmlns:wne="http://schemas.microsoft.com/office/word/2006/wordml" mc:Ignorable="w14 w15 w16se w16cid w16 w16cex w16sdtdh w16sdtfl w16du wp14">
   <w:endnote w:type="separator" w:id="-1">
     <w:p>
       <w:r>
@@ -8070,7 +9214,7 @@
 </file>
 
 <file path=word/footer1.xml><?xml version="1.0" encoding="utf-8"?>
-<w:ftr xmlns:wpc="http://schemas.microsoft.com/office/word/2010/wordprocessingCanvas" xmlns:cx="http://schemas.microsoft.com/office/drawing/2014/chartex" xmlns:cx1="http://schemas.microsoft.com/office/drawing/2015/9/8/chartex" xmlns:cx2="http://schemas.microsoft.com/office/drawing/2015/10/21/chartex" xmlns:cx3="http://schemas.microsoft.com/office/drawing/2016/5/9/chartex" xmlns:cx4="http://schemas.microsoft.com/office/drawing/2016/5/10/chartex" xmlns:cx5="http://schemas.microsoft.com/office/drawing/2016/5/11/chartex" xmlns:cx6="http://schemas.microsoft.com/office/drawing/2016/5/12/chartex" xmlns:cx7="http://schemas.microsoft.com/office/drawing/2016/5/13/chartex" xmlns:cx8="http://schemas.microsoft.com/office/drawing/2016/5/14/chartex" xmlns:mc="http://schemas.openxmlformats.org/markup-compatibility/2006" xmlns:aink="http://schemas.microsoft.com/office/drawing/2016/ink" xmlns:am3d="http://schemas.microsoft.com/office/drawing/2017/model3d" xmlns:o="urn:schemas-microsoft-com:office:office" xmlns:oel="http://schemas.microsoft.com/office/2019/extlst" xmlns:r="http://schemas.openxmlformats.org/officeDocument/2006/relationships" xmlns:m="http://schemas.openxmlformats.org/officeDocument/2006/math" xmlns:v="urn:schemas-microsoft-com:vml" xmlns:wp14="http://schemas.microsoft.com/office/word/2010/wordprocessingDrawing" xmlns:wp="http://schemas.openxmlformats.org/drawingml/2006/wordprocessingDrawing" xmlns:w10="urn:schemas-microsoft-com:office:word" xmlns:w="http://schemas.openxmlformats.org/wordprocessingml/2006/main" xmlns:w14="http://schemas.microsoft.com/office/word/2010/wordml" xmlns:w15="http://schemas.microsoft.com/office/word/2012/wordml" xmlns:w16cex="http://schemas.microsoft.com/office/word/2018/wordml/cex" xmlns:w16cid="http://schemas.microsoft.com/office/word/2016/wordml/cid" xmlns:w16="http://schemas.microsoft.com/office/word/2018/wordml" xmlns:w16du="http://schemas.microsoft.com/office/word/2023/wordml/word16du" xmlns:w16sdtdh="http://schemas.microsoft.com/office/word/2020/wordml/sdtdatahash" xmlns:w16sdtfl="http://schemas.microsoft.com/office/word/2024/wordml/sdtformatlock" xmlns:w16se="http://schemas.microsoft.com/office/word/2015/wordml/symex" xmlns:wpg="http://schemas.microsoft.com/office/word/2010/wordprocessingGroup" xmlns:wpi="http://schemas.microsoft.com/office/word/2010/wordprocessingInk" xmlns:wne="http://schemas.microsoft.com/office/word/2006/wordml" xmlns:wps="http://schemas.microsoft.com/office/word/2010/wordprocessingShape" mc:Ignorable="w14 w15 w16se w16cid w16 w16cex w16sdtdh w16sdtfl w16du wp14">
+<w:ftr xmlns:wpc="http://schemas.microsoft.com/office/word/2010/wordprocessingCanvas" xmlns:cx="http://schemas.microsoft.com/office/drawing/2014/chartex" xmlns:cx1="http://schemas.microsoft.com/office/drawing/2015/9/8/chartex" xmlns:cx2="http://schemas.microsoft.com/office/drawing/2015/10/21/chartex" xmlns:cx3="http://schemas.microsoft.com/office/drawing/2016/5/9/chartex" xmlns:cx4="http://schemas.microsoft.com/office/drawing/2016/5/10/chartex" xmlns:cx5="http://schemas.microsoft.com/office/drawing/2016/5/11/chartex" xmlns:cx6="http://schemas.microsoft.com/office/drawing/2016/5/12/chartex" xmlns:cx7="http://schemas.microsoft.com/office/drawing/2016/5/13/chartex" xmlns:cx8="http://schemas.microsoft.com/office/drawing/2016/5/14/chartex" xmlns:mc="http://schemas.openxmlformats.org/markup-compatibility/2006" xmlns:m="http://schemas.openxmlformats.org/officeDocument/2006/math" xmlns:aink="http://schemas.microsoft.com/office/drawing/2016/ink" xmlns:am3d="http://schemas.microsoft.com/office/drawing/2017/model3d" xmlns:oel="http://schemas.microsoft.com/office/2019/extlst" xmlns:r="http://schemas.openxmlformats.org/officeDocument/2006/relationships" xmlns:wp14="http://schemas.microsoft.com/office/word/2010/wordprocessingDrawing" xmlns:wp="http://schemas.openxmlformats.org/drawingml/2006/wordprocessingDrawing" xmlns:wpg="http://schemas.microsoft.com/office/word/2010/wordprocessingGroup" xmlns:wpi="http://schemas.microsoft.com/office/word/2010/wordprocessingInk" xmlns:wps="http://schemas.microsoft.com/office/word/2010/wordprocessingShape" xmlns:o="urn:schemas-microsoft-com:office:office" xmlns:v="urn:schemas-microsoft-com:vml" xmlns:w10="urn:schemas-microsoft-com:office:word" xmlns:w="http://schemas.openxmlformats.org/wordprocessingml/2006/main" xmlns:w14="http://schemas.microsoft.com/office/word/2010/wordml" xmlns:w15="http://schemas.microsoft.com/office/word/2012/wordml" xmlns:w16cex="http://schemas.microsoft.com/office/word/2018/wordml/cex" xmlns:w16cid="http://schemas.microsoft.com/office/word/2016/wordml/cid" xmlns:w16="http://schemas.microsoft.com/office/word/2018/wordml" xmlns:w16sdtdh="http://schemas.microsoft.com/office/word/2020/wordml/sdtdatahash" xmlns:w16sdtfl="http://schemas.microsoft.com/office/word/2024/wordml/sdtformatlock" xmlns:w16se="http://schemas.microsoft.com/office/word/2015/wordml/symex" xmlns:w16du="http://schemas.microsoft.com/office/word/2023/wordml/word16du" xmlns:wne="http://schemas.microsoft.com/office/word/2006/wordml" mc:Ignorable="w14 w15 w16se w16cid w16 w16cex w16sdtdh w16sdtfl w16du wp14">
   <w:p>
     <w:pPr>
       <w:pBdr>
@@ -8085,14 +9229,50 @@
         <w:sz w:val="20"/>
         <w:szCs w:val="20"/>
       </w:rPr>
-      <w:t>1329 Highland Ave, Suite 1, Needham, MA 02492  ·  (781) 474-3450  ·  aubreylegal.com</w:t>
+      <w:t xml:space="preserve">1329 Highland Ave, Suite 1, Needham, MA </w:t>
+    </w:r>
+    <w:proofErr w:type="gramStart"/>
+    <w:r>
+      <w:rPr>
+        <w:color w:val="1B3A6B"/>
+        <w:sz w:val="20"/>
+        <w:szCs w:val="20"/>
+      </w:rPr>
+      <w:t>02492  ·</w:t>
+    </w:r>
+    <w:proofErr w:type="gramEnd"/>
+    <w:r>
+      <w:rPr>
+        <w:color w:val="1B3A6B"/>
+        <w:sz w:val="20"/>
+        <w:szCs w:val="20"/>
+      </w:rPr>
+      <w:t xml:space="preserve">  (781) 474-</w:t>
+    </w:r>
+    <w:proofErr w:type="gramStart"/>
+    <w:r>
+      <w:rPr>
+        <w:color w:val="1B3A6B"/>
+        <w:sz w:val="20"/>
+        <w:szCs w:val="20"/>
+      </w:rPr>
+      <w:t>3450  ·</w:t>
+    </w:r>
+    <w:proofErr w:type="gramEnd"/>
+    <w:r>
+      <w:rPr>
+        <w:color w:val="1B3A6B"/>
+        <w:sz w:val="20"/>
+        <w:szCs w:val="20"/>
+      </w:rPr>
+      <w:t xml:space="preserve">  aubreylegal.com</w:t>
     </w:r>
   </w:p>
 </w:ftr>
 </file>
 
 <file path=word/footnotes.xml><?xml version="1.0" encoding="utf-8"?>
-<w:footnotes xmlns:wpc="http://schemas.microsoft.com/office/word/2010/wordprocessingCanvas" xmlns:cx="http://schemas.microsoft.com/office/drawing/2014/chartex" xmlns:cx1="http://schemas.microsoft.com/office/drawing/2015/9/8/chartex" xmlns:cx2="http://schemas.microsoft.com/office/drawing/2015/10/21/chartex" xmlns:cx3="http://schemas.microsoft.com/office/drawing/2016/5/9/chartex" xmlns:cx4="http://schemas.microsoft.com/office/drawing/2016/5/10/chartex" xmlns:cx5="http://schemas.microsoft.com/office/drawing/2016/5/11/chartex" xmlns:cx6="http://schemas.microsoft.com/office/drawing/2016/5/12/chartex" xmlns:cx7="http://schemas.microsoft.com/office/drawing/2016/5/13/chartex" xmlns:cx8="http://schemas.microsoft.com/office/drawing/2016/5/14/chartex" xmlns:mc="http://schemas.openxmlformats.org/markup-compatibility/2006" xmlns:aink="http://schemas.microsoft.com/office/drawing/2016/ink" xmlns:am3d="http://schemas.microsoft.com/office/drawing/2017/model3d" xmlns:o="urn:schemas-microsoft-com:office:office" xmlns:oel="http://schemas.microsoft.com/office/2019/extlst" xmlns:r="http://schemas.openxmlformats.org/officeDocument/2006/relationships" xmlns:m="http://schemas.openxmlformats.org/officeDocument/2006/math" xmlns:v="urn:schemas-microsoft-com:vml" xmlns:wp14="http://schemas.microsoft.com/office/word/2010/wordprocessingDrawing" xmlns:wp="http://schemas.openxmlformats.org/drawingml/2006/wordprocessingDrawing" xmlns:w10="urn:schemas-microsoft-com:office:word" xmlns:w="http://schemas.openxmlformats.org/wordprocessingml/2006/main" xmlns:w14="http://schemas.microsoft.com/office/word/2010/wordml" xmlns:w15="http://schemas.microsoft.com/office/word/2012/wordml" xmlns:w16cex="http://schemas.microsoft.com/office/word/2018/wordml/cex" xmlns:w16cid="http://schemas.microsoft.com/office/word/2016/wordml/cid" xmlns:w16="http://schemas.microsoft.com/office/word/2018/wordml" xmlns:w16du="http://schemas.microsoft.com/office/word/2023/wordml/word16du" xmlns:w16sdtdh="http://schemas.microsoft.com/office/word/2020/wordml/sdtdatahash" xmlns:w16sdtfl="http://schemas.microsoft.com/office/word/2024/wordml/sdtformatlock" xmlns:w16se="http://schemas.microsoft.com/office/word/2015/wordml/symex" xmlns:wpg="http://schemas.microsoft.com/office/word/2010/wordprocessingGroup" xmlns:wpi="http://schemas.microsoft.com/office/word/2010/wordprocessingInk" xmlns:wne="http://schemas.microsoft.com/office/word/2006/wordml" xmlns:wps="http://schemas.microsoft.com/office/word/2010/wordprocessingShape" mc:Ignorable="w14 w15 w16se w16cid w16 w16cex w16sdtdh w16sdtfl w16du wp14">
+<w:footnotes xmlns:wpc="http://schemas.microsoft.com/office/word/2010/wordprocessingCanvas" xmlns:cx="http://schemas.microsoft.com/office/drawing/2014/chartex" xmlns:cx1="http://schemas.microsoft.com/office/drawing/2015/9/8/chartex" xmlns:cx2="http://schemas.microsoft.com/office/drawing/2015/10/21/chartex" xmlns:cx3="http://schemas.microsoft.com/office/drawing/2016/5/9/chartex" xmlns:cx4="http://schemas.microsoft.com/office/drawing/2016/5/10/chartex" xmlns:cx5="http://schemas.microsoft.com/office/drawing/2016/5/11/chartex" xmlns:cx6="http://schemas.microsoft.com/office/drawing/2016/5/12/chartex" xmlns:cx7="http://schemas.microsoft.com/office/drawing/2016/5/13/chartex" xmlns:cx8="http://schemas.microsoft.com/office/drawing/2016/5/14/chartex" xmlns:mc="http://schemas.openxmlformats.org/markup-compatibility/2006" xmlns:m="http://schemas.openxmlformats.org/officeDocument/2006/math" xmlns:aink="http://schemas.microsoft.com/office/drawing/2016/ink" xmlns:am3d="http://schemas.microsoft.com/office/drawing/2017/model3d" xmlns:oel="http://schemas.microsoft.com/office/2019/extlst" xmlns:r="http://schemas.openxmlformats.org/officeDocument/2006/relationships" xmlns:wp14="http://schemas.microsoft.com/office/word/2010/wordprocessingDrawing" xmlns:wp="http://schemas.openxmlformats.org/drawingml/2006/wordprocessingDrawing" xmlns:wpg="http://schemas.microsoft.com/office/word/2010/wordprocessingGroup" xmlns:wpi="http://schemas.microsoft.com/office/word/2010/wordprocessingInk" xmlns:wps="http://schemas.microsoft.com/office/word/2010/wordprocessingShape" xmlns:o="urn:schemas-microsoft-com:office:office" xmlns:v="urn:schemas-microsoft-com:vml" xmlns:w10="urn:schemas-microsoft-com:office:word" xmlns:w="http://schemas.openxmlformats.org/wordprocessingml/2006/main" xmlns:w14="http://schemas.microsoft.com/office/word/2010/wordml" xmlns:w15="http://schemas.microsoft.com/office/word/2012/wordml" xmlns:w16cex="http://schemas.microsoft.com/office/word/2018/wordml/cex" xmlns:w16cid="http://schemas.microsoft.com/office/word/2016/wordml/cid" xmlns:w16="http://schemas.microsoft.com/office/word/2018/wordml" xmlns:w16sdtdh="http://schemas.microsoft.com/office/word/2020/wordml/sdtdatahash" xmlns:w16sdtfl="http://schemas.microsoft.com/office/word/2024/wordml/sdtformatlock" xmlns:w16se="http://schemas.microsoft.com/office/word/2015/wordml/symex" xmlns:w16du="http://schemas.microsoft.com/office/word/2023/wordml/word16du" xmlns:wne="http://schemas.microsoft.com/office/word/2006/wordml" mc:Ignorable="w14 w15 w16se w16cid w16 w16cex w16sdtdh w16sdtfl w16du wp14">
   <w:footnote w:type="separator" w:id="-1">
     <w:p>
       <w:r>
@@ -8111,7 +9291,7 @@
 </file>
 
 <file path=word/header1.xml><?xml version="1.0" encoding="utf-8"?>
-<w:hdr xmlns:wpc="http://schemas.microsoft.com/office/word/2010/wordprocessingCanvas" xmlns:cx="http://schemas.microsoft.com/office/drawing/2014/chartex" xmlns:cx1="http://schemas.microsoft.com/office/drawing/2015/9/8/chartex" xmlns:cx2="http://schemas.microsoft.com/office/drawing/2015/10/21/chartex" xmlns:cx3="http://schemas.microsoft.com/office/drawing/2016/5/9/chartex" xmlns:cx4="http://schemas.microsoft.com/office/drawing/2016/5/10/chartex" xmlns:cx5="http://schemas.microsoft.com/office/drawing/2016/5/11/chartex" xmlns:cx6="http://schemas.microsoft.com/office/drawing/2016/5/12/chartex" xmlns:cx7="http://schemas.microsoft.com/office/drawing/2016/5/13/chartex" xmlns:cx8="http://schemas.microsoft.com/office/drawing/2016/5/14/chartex" xmlns:mc="http://schemas.openxmlformats.org/markup-compatibility/2006" xmlns:aink="http://schemas.microsoft.com/office/drawing/2016/ink" xmlns:am3d="http://schemas.microsoft.com/office/drawing/2017/model3d" xmlns:o="urn:schemas-microsoft-com:office:office" xmlns:oel="http://schemas.microsoft.com/office/2019/extlst" xmlns:r="http://schemas.openxmlformats.org/officeDocument/2006/relationships" xmlns:m="http://schemas.openxmlformats.org/officeDocument/2006/math" xmlns:v="urn:schemas-microsoft-com:vml" xmlns:wp14="http://schemas.microsoft.com/office/word/2010/wordprocessingDrawing" xmlns:wp="http://schemas.openxmlformats.org/drawingml/2006/wordprocessingDrawing" xmlns:w10="urn:schemas-microsoft-com:office:word" xmlns:w="http://schemas.openxmlformats.org/wordprocessingml/2006/main" xmlns:w14="http://schemas.microsoft.com/office/word/2010/wordml" xmlns:w15="http://schemas.microsoft.com/office/word/2012/wordml" xmlns:w16cex="http://schemas.microsoft.com/office/word/2018/wordml/cex" xmlns:w16cid="http://schemas.microsoft.com/office/word/2016/wordml/cid" xmlns:w16="http://schemas.microsoft.com/office/word/2018/wordml" xmlns:w16du="http://schemas.microsoft.com/office/word/2023/wordml/word16du" xmlns:w16sdtdh="http://schemas.microsoft.com/office/word/2020/wordml/sdtdatahash" xmlns:w16sdtfl="http://schemas.microsoft.com/office/word/2024/wordml/sdtformatlock" xmlns:w16se="http://schemas.microsoft.com/office/word/2015/wordml/symex" xmlns:wpg="http://schemas.microsoft.com/office/word/2010/wordprocessingGroup" xmlns:wpi="http://schemas.microsoft.com/office/word/2010/wordprocessingInk" xmlns:wne="http://schemas.microsoft.com/office/word/2006/wordml" xmlns:wps="http://schemas.microsoft.com/office/word/2010/wordprocessingShape" mc:Ignorable="w14 w15 w16se w16cid w16 w16cex w16sdtdh w16sdtfl w16du wp14">
+<w:hdr xmlns:wpc="http://schemas.microsoft.com/office/word/2010/wordprocessingCanvas" xmlns:cx="http://schemas.microsoft.com/office/drawing/2014/chartex" xmlns:cx1="http://schemas.microsoft.com/office/drawing/2015/9/8/chartex" xmlns:cx2="http://schemas.microsoft.com/office/drawing/2015/10/21/chartex" xmlns:cx3="http://schemas.microsoft.com/office/drawing/2016/5/9/chartex" xmlns:cx4="http://schemas.microsoft.com/office/drawing/2016/5/10/chartex" xmlns:cx5="http://schemas.microsoft.com/office/drawing/2016/5/11/chartex" xmlns:cx6="http://schemas.microsoft.com/office/drawing/2016/5/12/chartex" xmlns:cx7="http://schemas.microsoft.com/office/drawing/2016/5/13/chartex" xmlns:cx8="http://schemas.microsoft.com/office/drawing/2016/5/14/chartex" xmlns:mc="http://schemas.openxmlformats.org/markup-compatibility/2006" xmlns:m="http://schemas.openxmlformats.org/officeDocument/2006/math" xmlns:aink="http://schemas.microsoft.com/office/drawing/2016/ink" xmlns:am3d="http://schemas.microsoft.com/office/drawing/2017/model3d" xmlns:oel="http://schemas.microsoft.com/office/2019/extlst" xmlns:r="http://schemas.openxmlformats.org/officeDocument/2006/relationships" xmlns:wp14="http://schemas.microsoft.com/office/word/2010/wordprocessingDrawing" xmlns:wp="http://schemas.openxmlformats.org/drawingml/2006/wordprocessingDrawing" xmlns:wpg="http://schemas.microsoft.com/office/word/2010/wordprocessingGroup" xmlns:wpi="http://schemas.microsoft.com/office/word/2010/wordprocessingInk" xmlns:wps="http://schemas.microsoft.com/office/word/2010/wordprocessingShape" xmlns:o="urn:schemas-microsoft-com:office:office" xmlns:v="urn:schemas-microsoft-com:vml" xmlns:w10="urn:schemas-microsoft-com:office:word" xmlns:w="http://schemas.openxmlformats.org/wordprocessingml/2006/main" xmlns:w14="http://schemas.microsoft.com/office/word/2010/wordml" xmlns:w15="http://schemas.microsoft.com/office/word/2012/wordml" xmlns:w16cex="http://schemas.microsoft.com/office/word/2018/wordml/cex" xmlns:w16cid="http://schemas.microsoft.com/office/word/2016/wordml/cid" xmlns:w16="http://schemas.microsoft.com/office/word/2018/wordml" xmlns:w16sdtdh="http://schemas.microsoft.com/office/word/2020/wordml/sdtdatahash" xmlns:w16sdtfl="http://schemas.microsoft.com/office/word/2024/wordml/sdtformatlock" xmlns:w16se="http://schemas.microsoft.com/office/word/2015/wordml/symex" xmlns:w16du="http://schemas.microsoft.com/office/word/2023/wordml/word16du" xmlns:wne="http://schemas.microsoft.com/office/word/2006/wordml" mc:Ignorable="w14 w15 w16se w16cid w16 w16cex w16sdtdh w16sdtfl w16du wp14">
   <w:p>
     <w:pPr>
       <w:spacing w:after="120"/>
@@ -8165,7 +9345,7 @@
 </file>
 
 <file path=word/numbering.xml><?xml version="1.0" encoding="utf-8"?>
-<w:numbering xmlns:wpc="http://schemas.microsoft.com/office/word/2010/wordprocessingCanvas" xmlns:cx="http://schemas.microsoft.com/office/drawing/2014/chartex" xmlns:cx1="http://schemas.microsoft.com/office/drawing/2015/9/8/chartex" xmlns:cx2="http://schemas.microsoft.com/office/drawing/2015/10/21/chartex" xmlns:cx3="http://schemas.microsoft.com/office/drawing/2016/5/9/chartex" xmlns:cx4="http://schemas.microsoft.com/office/drawing/2016/5/10/chartex" xmlns:cx5="http://schemas.microsoft.com/office/drawing/2016/5/11/chartex" xmlns:cx6="http://schemas.microsoft.com/office/drawing/2016/5/12/chartex" xmlns:cx7="http://schemas.microsoft.com/office/drawing/2016/5/13/chartex" xmlns:cx8="http://schemas.microsoft.com/office/drawing/2016/5/14/chartex" xmlns:mc="http://schemas.openxmlformats.org/markup-compatibility/2006" xmlns:aink="http://schemas.microsoft.com/office/drawing/2016/ink" xmlns:am3d="http://schemas.microsoft.com/office/drawing/2017/model3d" xmlns:o="urn:schemas-microsoft-com:office:office" xmlns:oel="http://schemas.microsoft.com/office/2019/extlst" xmlns:r="http://schemas.openxmlformats.org/officeDocument/2006/relationships" xmlns:m="http://schemas.openxmlformats.org/officeDocument/2006/math" xmlns:v="urn:schemas-microsoft-com:vml" xmlns:wp14="http://schemas.microsoft.com/office/word/2010/wordprocessingDrawing" xmlns:wp="http://schemas.openxmlformats.org/drawingml/2006/wordprocessingDrawing" xmlns:w10="urn:schemas-microsoft-com:office:word" xmlns:w="http://schemas.openxmlformats.org/wordprocessingml/2006/main" xmlns:w14="http://schemas.microsoft.com/office/word/2010/wordml" xmlns:w15="http://schemas.microsoft.com/office/word/2012/wordml" xmlns:w16cex="http://schemas.microsoft.com/office/word/2018/wordml/cex" xmlns:w16cid="http://schemas.microsoft.com/office/word/2016/wordml/cid" xmlns:w16="http://schemas.microsoft.com/office/word/2018/wordml" xmlns:w16du="http://schemas.microsoft.com/office/word/2023/wordml/word16du" xmlns:w16sdtdh="http://schemas.microsoft.com/office/word/2020/wordml/sdtdatahash" xmlns:w16sdtfl="http://schemas.microsoft.com/office/word/2024/wordml/sdtformatlock" xmlns:w16se="http://schemas.microsoft.com/office/word/2015/wordml/symex" xmlns:wpg="http://schemas.microsoft.com/office/word/2010/wordprocessingGroup" xmlns:wpi="http://schemas.microsoft.com/office/word/2010/wordprocessingInk" xmlns:wne="http://schemas.microsoft.com/office/word/2006/wordml" xmlns:wps="http://schemas.microsoft.com/office/word/2010/wordprocessingShape" mc:Ignorable="w14 w15 w16se w16cid w16 w16cex w16sdtdh w16sdtfl w16du wp14">
+<w:numbering xmlns:wpc="http://schemas.microsoft.com/office/word/2010/wordprocessingCanvas" xmlns:cx="http://schemas.microsoft.com/office/drawing/2014/chartex" xmlns:cx1="http://schemas.microsoft.com/office/drawing/2015/9/8/chartex" xmlns:cx2="http://schemas.microsoft.com/office/drawing/2015/10/21/chartex" xmlns:cx3="http://schemas.microsoft.com/office/drawing/2016/5/9/chartex" xmlns:cx4="http://schemas.microsoft.com/office/drawing/2016/5/10/chartex" xmlns:cx5="http://schemas.microsoft.com/office/drawing/2016/5/11/chartex" xmlns:cx6="http://schemas.microsoft.com/office/drawing/2016/5/12/chartex" xmlns:cx7="http://schemas.microsoft.com/office/drawing/2016/5/13/chartex" xmlns:cx8="http://schemas.microsoft.com/office/drawing/2016/5/14/chartex" xmlns:mc="http://schemas.openxmlformats.org/markup-compatibility/2006" xmlns:m="http://schemas.openxmlformats.org/officeDocument/2006/math" xmlns:aink="http://schemas.microsoft.com/office/drawing/2016/ink" xmlns:am3d="http://schemas.microsoft.com/office/drawing/2017/model3d" xmlns:oel="http://schemas.microsoft.com/office/2019/extlst" xmlns:r="http://schemas.openxmlformats.org/officeDocument/2006/relationships" xmlns:wp14="http://schemas.microsoft.com/office/word/2010/wordprocessingDrawing" xmlns:wp="http://schemas.openxmlformats.org/drawingml/2006/wordprocessingDrawing" xmlns:wpg="http://schemas.microsoft.com/office/word/2010/wordprocessingGroup" xmlns:wpi="http://schemas.microsoft.com/office/word/2010/wordprocessingInk" xmlns:wps="http://schemas.microsoft.com/office/word/2010/wordprocessingShape" xmlns:o="urn:schemas-microsoft-com:office:office" xmlns:v="urn:schemas-microsoft-com:vml" xmlns:w10="urn:schemas-microsoft-com:office:word" xmlns:w="http://schemas.openxmlformats.org/wordprocessingml/2006/main" xmlns:w14="http://schemas.microsoft.com/office/word/2010/wordml" xmlns:w15="http://schemas.microsoft.com/office/word/2012/wordml" xmlns:w16cex="http://schemas.microsoft.com/office/word/2018/wordml/cex" xmlns:w16cid="http://schemas.microsoft.com/office/word/2016/wordml/cid" xmlns:w16="http://schemas.microsoft.com/office/word/2018/wordml" xmlns:w16sdtdh="http://schemas.microsoft.com/office/word/2020/wordml/sdtdatahash" xmlns:w16sdtfl="http://schemas.microsoft.com/office/word/2024/wordml/sdtformatlock" xmlns:w16se="http://schemas.microsoft.com/office/word/2015/wordml/symex" xmlns:w16du="http://schemas.microsoft.com/office/word/2023/wordml/word16du" xmlns:wne="http://schemas.microsoft.com/office/word/2006/wordml" mc:Ignorable="w14 w15 w16se w16cid w16 w16cex w16sdtdh w16sdtfl w16du wp14">
   <w:abstractNum w:abstractNumId="0" w15:restartNumberingAfterBreak="0">
     <w:nsid w:val="5E996177"/>
     <w:multiLevelType w:val="hybridMultilevel"/>
@@ -8262,7 +9442,7 @@
 </file>
 
 <file path=word/styles.xml><?xml version="1.0" encoding="utf-8"?>
-<w:styles xmlns:mc="http://schemas.openxmlformats.org/markup-compatibility/2006" xmlns:r="http://schemas.openxmlformats.org/officeDocument/2006/relationships" xmlns:w="http://schemas.openxmlformats.org/wordprocessingml/2006/main" xmlns:w14="http://schemas.microsoft.com/office/word/2010/wordml" xmlns:w15="http://schemas.microsoft.com/office/word/2012/wordml" xmlns:w16cex="http://schemas.microsoft.com/office/word/2018/wordml/cex" xmlns:w16cid="http://schemas.microsoft.com/office/word/2016/wordml/cid" xmlns:w16="http://schemas.microsoft.com/office/word/2018/wordml" xmlns:w16du="http://schemas.microsoft.com/office/word/2023/wordml/word16du" xmlns:w16sdtdh="http://schemas.microsoft.com/office/word/2020/wordml/sdtdatahash" xmlns:w16sdtfl="http://schemas.microsoft.com/office/word/2024/wordml/sdtformatlock" xmlns:w16se="http://schemas.microsoft.com/office/word/2015/wordml/symex" mc:Ignorable="w14 w15 w16se w16cid w16 w16cex w16sdtdh w16sdtfl w16du">
+<w:styles xmlns:mc="http://schemas.openxmlformats.org/markup-compatibility/2006" xmlns:r="http://schemas.openxmlformats.org/officeDocument/2006/relationships" xmlns:w="http://schemas.openxmlformats.org/wordprocessingml/2006/main" xmlns:w14="http://schemas.microsoft.com/office/word/2010/wordml" xmlns:w15="http://schemas.microsoft.com/office/word/2012/wordml" xmlns:w16cex="http://schemas.microsoft.com/office/word/2018/wordml/cex" xmlns:w16cid="http://schemas.microsoft.com/office/word/2016/wordml/cid" xmlns:w16="http://schemas.microsoft.com/office/word/2018/wordml" xmlns:w16sdtdh="http://schemas.microsoft.com/office/word/2020/wordml/sdtdatahash" xmlns:w16sdtfl="http://schemas.microsoft.com/office/word/2024/wordml/sdtformatlock" xmlns:w16se="http://schemas.microsoft.com/office/word/2015/wordml/symex" xmlns:w16du="http://schemas.microsoft.com/office/word/2023/wordml/word16du" mc:Ignorable="w14 w15 w16se w16cid w16 w16cex w16sdtdh w16sdtfl w16du">
   <w:docDefaults>
     <w:rPrDefault>
       <w:rPr>

</xml_diff>